<commit_message>
Add German electric locomotives
</commit_message>
<xml_diff>
--- a/raildriver-Germany-Remapped.docx
+++ b/raildriver-Germany-Remapped.docx
@@ -19627,8 +19627,8 @@
             </w:pPr>
             <w:r>
               <w:rPr>
-                <w:sz w:val="16"/>
-                <w:szCs w:val="16"/>
+                <w:rFonts w:eastAsia="arial" w:ascii="arial" w:hAnsi="arial"/>
+                <w:color w:val="000000"/>
               </w:rPr>
             </w:r>
           </w:p>
@@ -21594,6 +21594,1146 @@
                 <w:szCs w:val="16"/>
               </w:rPr>
               <w:t>Cab</w:t>
+            </w:r>
+          </w:p>
+        </w:tc>
+        <w:tc>
+          <w:tcPr>
+            <w:tcW w:w="1016" w:type="dxa"/>
+            <w:tcBorders>
+              <w:top w:val="single" w:sz="4" w:space="0" w:color="000000"/>
+              <w:left w:val="single" w:sz="4" w:space="0" w:color="000000"/>
+              <w:bottom w:val="single" w:sz="4" w:space="0" w:color="000000"/>
+            </w:tcBorders>
+            <w:vAlign w:val="bottom"/>
+          </w:tcPr>
+          <w:p>
+            <w:pPr>
+              <w:pStyle w:val="Normal"/>
+              <w:widowControl w:val="false"/>
+              <w:jc w:val="center"/>
+              <w:rPr>
+                <w:color w:val="000000"/>
+                <w:sz w:val="16"/>
+                <w:szCs w:val="16"/>
+              </w:rPr>
+            </w:pPr>
+            <w:r>
+              <w:rPr>
+                <w:rFonts w:eastAsia="arial" w:ascii="arial" w:hAnsi="arial"/>
+                <w:color w:val="000000"/>
+                <w:sz w:val="16"/>
+                <w:szCs w:val="16"/>
+              </w:rPr>
+              <w:t>Parking Brake Off</w:t>
+            </w:r>
+          </w:p>
+        </w:tc>
+        <w:tc>
+          <w:tcPr>
+            <w:tcW w:w="1016" w:type="dxa"/>
+            <w:tcBorders>
+              <w:top w:val="single" w:sz="4" w:space="0" w:color="000000"/>
+              <w:left w:val="single" w:sz="4" w:space="0" w:color="000000"/>
+              <w:bottom w:val="single" w:sz="4" w:space="0" w:color="000000"/>
+            </w:tcBorders>
+            <w:vAlign w:val="bottom"/>
+          </w:tcPr>
+          <w:p>
+            <w:pPr>
+              <w:pStyle w:val="Normal"/>
+              <w:widowControl w:val="false"/>
+              <w:spacing w:lineRule="auto" w:line="180"/>
+              <w:jc w:val="center"/>
+              <w:rPr>
+                <w:color w:val="000000"/>
+                <w:sz w:val="16"/>
+                <w:szCs w:val="16"/>
+              </w:rPr>
+            </w:pPr>
+            <w:r>
+              <w:rPr>
+                <w:rFonts w:eastAsia="arial" w:ascii="arial" w:hAnsi="arial"/>
+                <w:color w:val="000000"/>
+                <w:sz w:val="16"/>
+                <w:szCs w:val="16"/>
+              </w:rPr>
+              <w:t>Exterior</w:t>
+            </w:r>
+          </w:p>
+          <w:p>
+            <w:pPr>
+              <w:pStyle w:val="Normal"/>
+              <w:widowControl w:val="false"/>
+              <w:spacing w:lineRule="auto" w:line="180"/>
+              <w:jc w:val="center"/>
+              <w:rPr>
+                <w:color w:val="000000"/>
+                <w:sz w:val="16"/>
+                <w:szCs w:val="16"/>
+              </w:rPr>
+            </w:pPr>
+            <w:r>
+              <w:rPr>
+                <w:rFonts w:eastAsia="arial" w:ascii="arial" w:hAnsi="arial"/>
+                <w:color w:val="000000"/>
+                <w:sz w:val="16"/>
+                <w:szCs w:val="16"/>
+              </w:rPr>
+              <w:t>Camera</w:t>
+            </w:r>
+          </w:p>
+        </w:tc>
+        <w:tc>
+          <w:tcPr>
+            <w:tcW w:w="1029" w:type="dxa"/>
+            <w:tcBorders>
+              <w:top w:val="single" w:sz="4" w:space="0" w:color="000000"/>
+              <w:left w:val="single" w:sz="4" w:space="0" w:color="000000"/>
+              <w:bottom w:val="single" w:sz="4" w:space="0" w:color="000000"/>
+              <w:right w:val="single" w:sz="4" w:space="0" w:color="000000"/>
+            </w:tcBorders>
+            <w:vAlign w:val="bottom"/>
+          </w:tcPr>
+          <w:p>
+            <w:pPr>
+              <w:pStyle w:val="Normal"/>
+              <w:widowControl w:val="false"/>
+              <w:spacing w:lineRule="auto" w:line="180"/>
+              <w:jc w:val="center"/>
+              <w:rPr>
+                <w:color w:val="000000"/>
+                <w:sz w:val="16"/>
+                <w:szCs w:val="16"/>
+              </w:rPr>
+            </w:pPr>
+            <w:r>
+              <w:rPr>
+                <w:rFonts w:eastAsia="arial" w:ascii="arial" w:hAnsi="arial"/>
+                <w:color w:val="000000"/>
+                <w:sz w:val="16"/>
+                <w:szCs w:val="16"/>
+              </w:rPr>
+              <w:t>Prev</w:t>
+            </w:r>
+          </w:p>
+          <w:p>
+            <w:pPr>
+              <w:pStyle w:val="Normal"/>
+              <w:widowControl w:val="false"/>
+              <w:spacing w:lineRule="auto" w:line="180"/>
+              <w:jc w:val="center"/>
+              <w:rPr>
+                <w:color w:val="000000"/>
+                <w:sz w:val="16"/>
+                <w:szCs w:val="16"/>
+              </w:rPr>
+            </w:pPr>
+            <w:r>
+              <w:rPr>
+                <w:rFonts w:eastAsia="arial" w:ascii="arial" w:hAnsi="arial"/>
+                <w:color w:val="000000"/>
+                <w:sz w:val="16"/>
+                <w:szCs w:val="16"/>
+              </w:rPr>
+              <w:t>Cab Cam</w:t>
+            </w:r>
+          </w:p>
+        </w:tc>
+      </w:tr>
+    </w:tbl>
+    <w:p>
+      <w:pPr>
+        <w:pStyle w:val="Normal"/>
+        <w:bidi w:val="0"/>
+        <w:rPr>
+          <w:color w:val="000000"/>
+          <w:sz w:val="16"/>
+          <w:szCs w:val="16"/>
+        </w:rPr>
+      </w:pPr>
+      <w:r>
+        <w:rPr>
+          <w:color w:val="000000"/>
+          <w:sz w:val="16"/>
+          <w:szCs w:val="16"/>
+        </w:rPr>
+      </w:r>
+    </w:p>
+    <w:p>
+      <w:pPr>
+        <w:pStyle w:val="Normal"/>
+        <w:rPr>
+          <w:color w:val="000000"/>
+          <w:sz w:val="16"/>
+          <w:szCs w:val="16"/>
+        </w:rPr>
+      </w:pPr>
+      <w:r>
+        <w:rPr>
+          <w:color w:val="000000"/>
+          <w:sz w:val="16"/>
+          <w:szCs w:val="16"/>
+        </w:rPr>
+        <w:tab/>
+        <w:t xml:space="preserve">       </w:t>
+      </w:r>
+      <w:r>
+        <w:rPr>
+          <w:rFonts w:eastAsia="arial" w:ascii="arial" w:hAnsi="arial"/>
+          <w:color w:val="000000"/>
+          <w:sz w:val="16"/>
+          <w:szCs w:val="16"/>
+        </w:rPr>
+        <w:t xml:space="preserve">    DB BR 19</w:t>
+      </w:r>
+      <w:r>
+        <w:rPr>
+          <w:rFonts w:eastAsia="arial" w:ascii="arial" w:hAnsi="arial"/>
+          <w:color w:val="000000"/>
+          <w:sz w:val="16"/>
+          <w:szCs w:val="16"/>
+        </w:rPr>
+        <w:t>4 (E94)</w:t>
+      </w:r>
+      <w:r>
+        <w:rPr>
+          <w:rFonts w:eastAsia="arial" w:ascii="arial" w:hAnsi="arial"/>
+          <w:color w:val="000000"/>
+          <w:sz w:val="16"/>
+          <w:szCs w:val="16"/>
+        </w:rPr>
+        <w:t>-1</w:t>
+      </w:r>
+    </w:p>
+    <w:tbl>
+      <w:tblPr>
+        <w:tblW w:w="14248" w:type="dxa"/>
+        <w:jc w:val="left"/>
+        <w:tblInd w:w="-5" w:type="dxa"/>
+        <w:tblLayout w:type="fixed"/>
+        <w:tblCellMar>
+          <w:top w:w="0" w:type="dxa"/>
+          <w:left w:w="108" w:type="dxa"/>
+          <w:bottom w:w="0" w:type="dxa"/>
+          <w:right w:w="108" w:type="dxa"/>
+        </w:tblCellMar>
+        <w:tblLook w:firstRow="1" w:noVBand="1" w:lastRow="0" w:firstColumn="1" w:lastColumn="0" w:noHBand="0" w:val="04a0"/>
+      </w:tblPr>
+      <w:tblGrid>
+        <w:gridCol w:w="1017"/>
+        <w:gridCol w:w="1019"/>
+        <w:gridCol w:w="1014"/>
+        <w:gridCol w:w="1016"/>
+        <w:gridCol w:w="1020"/>
+        <w:gridCol w:w="1016"/>
+        <w:gridCol w:w="1016"/>
+        <w:gridCol w:w="1017"/>
+        <w:gridCol w:w="1016"/>
+        <w:gridCol w:w="1020"/>
+        <w:gridCol w:w="1016"/>
+        <w:gridCol w:w="1016"/>
+        <w:gridCol w:w="1016"/>
+        <w:gridCol w:w="1029"/>
+      </w:tblGrid>
+      <w:tr>
+        <w:trPr>
+          <w:trHeight w:val="440" w:hRule="exact"/>
+          <w:cantSplit w:val="true"/>
+        </w:trPr>
+        <w:tc>
+          <w:tcPr>
+            <w:tcW w:w="1017" w:type="dxa"/>
+            <w:tcBorders>
+              <w:top w:val="single" w:sz="4" w:space="0" w:color="000000"/>
+              <w:left w:val="single" w:sz="4" w:space="0" w:color="000000"/>
+              <w:bottom w:val="single" w:sz="4" w:space="0" w:color="000000"/>
+            </w:tcBorders>
+            <w:vAlign w:val="bottom"/>
+          </w:tcPr>
+          <w:p>
+            <w:pPr>
+              <w:pStyle w:val="Normal"/>
+              <w:widowControl w:val="false"/>
+              <w:spacing w:lineRule="auto" w:line="180" w:before="0" w:after="60"/>
+              <w:jc w:val="center"/>
+              <w:rPr>
+                <w:color w:val="000000"/>
+                <w:sz w:val="16"/>
+                <w:szCs w:val="16"/>
+              </w:rPr>
+            </w:pPr>
+            <w:r>
+              <w:rPr>
+                <w:rFonts w:eastAsia="arial" w:ascii="arial" w:hAnsi="arial"/>
+                <w:b/>
+                <w:color w:val="000000"/>
+                <w:sz w:val="16"/>
+                <w:szCs w:val="16"/>
+              </w:rPr>
+              <w:t>Pause</w:t>
+            </w:r>
+          </w:p>
+        </w:tc>
+        <w:tc>
+          <w:tcPr>
+            <w:tcW w:w="1019" w:type="dxa"/>
+            <w:tcBorders>
+              <w:top w:val="single" w:sz="4" w:space="0" w:color="000000"/>
+              <w:left w:val="single" w:sz="4" w:space="0" w:color="000000"/>
+              <w:bottom w:val="single" w:sz="4" w:space="0" w:color="000000"/>
+            </w:tcBorders>
+            <w:vAlign w:val="bottom"/>
+          </w:tcPr>
+          <w:p>
+            <w:pPr>
+              <w:pStyle w:val="Normal"/>
+              <w:widowControl w:val="false"/>
+              <w:spacing w:lineRule="auto" w:line="180"/>
+              <w:jc w:val="center"/>
+              <w:rPr>
+                <w:color w:val="000000"/>
+                <w:sz w:val="16"/>
+                <w:szCs w:val="16"/>
+              </w:rPr>
+            </w:pPr>
+            <w:r>
+              <w:rPr/>
+            </w:r>
+          </w:p>
+        </w:tc>
+        <w:tc>
+          <w:tcPr>
+            <w:tcW w:w="1014" w:type="dxa"/>
+            <w:tcBorders>
+              <w:top w:val="single" w:sz="4" w:space="0" w:color="000000"/>
+              <w:left w:val="single" w:sz="4" w:space="0" w:color="000000"/>
+              <w:bottom w:val="single" w:sz="4" w:space="0" w:color="000000"/>
+            </w:tcBorders>
+            <w:vAlign w:val="bottom"/>
+          </w:tcPr>
+          <w:p>
+            <w:pPr>
+              <w:pStyle w:val="Normal"/>
+              <w:widowControl w:val="false"/>
+              <w:spacing w:lineRule="auto" w:line="180"/>
+              <w:jc w:val="center"/>
+              <w:rPr>
+                <w:color w:val="000000"/>
+                <w:sz w:val="16"/>
+                <w:szCs w:val="16"/>
+              </w:rPr>
+            </w:pPr>
+            <w:r>
+              <w:rPr>
+                <w:color w:val="000000"/>
+                <w:sz w:val="16"/>
+                <w:szCs w:val="16"/>
+              </w:rPr>
+              <w:t>MCB Close</w:t>
+            </w:r>
+          </w:p>
+        </w:tc>
+        <w:tc>
+          <w:tcPr>
+            <w:tcW w:w="1016" w:type="dxa"/>
+            <w:tcBorders>
+              <w:top w:val="single" w:sz="4" w:space="0" w:color="000000"/>
+              <w:left w:val="single" w:sz="4" w:space="0" w:color="000000"/>
+              <w:bottom w:val="single" w:sz="4" w:space="0" w:color="000000"/>
+            </w:tcBorders>
+            <w:vAlign w:val="bottom"/>
+          </w:tcPr>
+          <w:p>
+            <w:pPr>
+              <w:pStyle w:val="Normal"/>
+              <w:widowControl w:val="false"/>
+              <w:spacing w:lineRule="auto" w:line="180"/>
+              <w:jc w:val="center"/>
+              <w:rPr>
+                <w:sz w:val="16"/>
+                <w:szCs w:val="16"/>
+              </w:rPr>
+            </w:pPr>
+            <w:r>
+              <w:rPr>
+                <w:rFonts w:eastAsia="arial" w:ascii="arial" w:hAnsi="arial"/>
+                <w:color w:val="000000"/>
+                <w:sz w:val="16"/>
+                <w:szCs w:val="16"/>
+              </w:rPr>
+              <w:t>PZB</w:t>
+            </w:r>
+          </w:p>
+        </w:tc>
+        <w:tc>
+          <w:tcPr>
+            <w:tcW w:w="1020" w:type="dxa"/>
+            <w:tcBorders>
+              <w:top w:val="single" w:sz="4" w:space="0" w:color="000000"/>
+              <w:left w:val="single" w:sz="4" w:space="0" w:color="000000"/>
+              <w:bottom w:val="single" w:sz="4" w:space="0" w:color="000000"/>
+            </w:tcBorders>
+            <w:vAlign w:val="bottom"/>
+          </w:tcPr>
+          <w:p>
+            <w:pPr>
+              <w:pStyle w:val="Normal"/>
+              <w:widowControl w:val="false"/>
+              <w:spacing w:lineRule="auto" w:line="180"/>
+              <w:jc w:val="center"/>
+              <w:rPr>
+                <w:color w:val="000000"/>
+                <w:sz w:val="16"/>
+                <w:szCs w:val="16"/>
+              </w:rPr>
+            </w:pPr>
+            <w:r>
+              <w:rPr/>
+            </w:r>
+          </w:p>
+        </w:tc>
+        <w:tc>
+          <w:tcPr>
+            <w:tcW w:w="1016" w:type="dxa"/>
+            <w:tcBorders>
+              <w:top w:val="single" w:sz="4" w:space="0" w:color="000000"/>
+              <w:left w:val="single" w:sz="4" w:space="0" w:color="000000"/>
+              <w:bottom w:val="single" w:sz="4" w:space="0" w:color="000000"/>
+            </w:tcBorders>
+            <w:vAlign w:val="bottom"/>
+          </w:tcPr>
+          <w:p>
+            <w:pPr>
+              <w:pStyle w:val="Normal"/>
+              <w:widowControl w:val="false"/>
+              <w:jc w:val="center"/>
+              <w:rPr>
+                <w:color w:val="000000"/>
+                <w:sz w:val="16"/>
+                <w:szCs w:val="16"/>
+              </w:rPr>
+            </w:pPr>
+            <w:r>
+              <w:rPr>
+                <w:color w:val="000000"/>
+                <w:sz w:val="16"/>
+                <w:szCs w:val="16"/>
+              </w:rPr>
+              <w:t>Compressor</w:t>
+            </w:r>
+          </w:p>
+        </w:tc>
+        <w:tc>
+          <w:tcPr>
+            <w:tcW w:w="1016" w:type="dxa"/>
+            <w:tcBorders>
+              <w:top w:val="single" w:sz="4" w:space="0" w:color="000000"/>
+              <w:left w:val="single" w:sz="4" w:space="0" w:color="000000"/>
+              <w:bottom w:val="single" w:sz="4" w:space="0" w:color="000000"/>
+            </w:tcBorders>
+            <w:vAlign w:val="bottom"/>
+          </w:tcPr>
+          <w:p>
+            <w:pPr>
+              <w:pStyle w:val="Normal"/>
+              <w:widowControl w:val="false"/>
+              <w:jc w:val="center"/>
+              <w:rPr>
+                <w:sz w:val="16"/>
+                <w:szCs w:val="16"/>
+              </w:rPr>
+            </w:pPr>
+            <w:r>
+              <w:rPr>
+                <w:rFonts w:eastAsia="arial" w:ascii="arial" w:hAnsi="arial"/>
+                <w:color w:val="000000"/>
+                <w:sz w:val="16"/>
+                <w:szCs w:val="16"/>
+              </w:rPr>
+              <w:t xml:space="preserve">Brake </w:t>
+            </w:r>
+            <w:r>
+              <w:rPr>
+                <w:rFonts w:eastAsia="arial" w:ascii="arial" w:hAnsi="arial"/>
+                <w:color w:val="000000"/>
+                <w:sz w:val="16"/>
+                <w:szCs w:val="16"/>
+              </w:rPr>
+              <w:t>Key</w:t>
+            </w:r>
+          </w:p>
+        </w:tc>
+        <w:tc>
+          <w:tcPr>
+            <w:tcW w:w="1017" w:type="dxa"/>
+            <w:tcBorders>
+              <w:top w:val="single" w:sz="4" w:space="0" w:color="000000"/>
+              <w:left w:val="single" w:sz="4" w:space="0" w:color="000000"/>
+              <w:bottom w:val="single" w:sz="4" w:space="0" w:color="000000"/>
+            </w:tcBorders>
+            <w:vAlign w:val="bottom"/>
+          </w:tcPr>
+          <w:p>
+            <w:pPr>
+              <w:pStyle w:val="Normal"/>
+              <w:widowControl w:val="false"/>
+              <w:jc w:val="center"/>
+              <w:rPr>
+                <w:rFonts w:ascii="arial" w:hAnsi="arial" w:eastAsia="arial"/>
+                <w:color w:val="000000"/>
+                <w:sz w:val="16"/>
+                <w:szCs w:val="16"/>
+              </w:rPr>
+            </w:pPr>
+            <w:r>
+              <w:rPr/>
+            </w:r>
+          </w:p>
+        </w:tc>
+        <w:tc>
+          <w:tcPr>
+            <w:tcW w:w="1016" w:type="dxa"/>
+            <w:tcBorders>
+              <w:top w:val="single" w:sz="4" w:space="0" w:color="000000"/>
+              <w:left w:val="single" w:sz="4" w:space="0" w:color="000000"/>
+              <w:bottom w:val="single" w:sz="4" w:space="0" w:color="000000"/>
+            </w:tcBorders>
+            <w:vAlign w:val="bottom"/>
+          </w:tcPr>
+          <w:p>
+            <w:pPr>
+              <w:pStyle w:val="Normal"/>
+              <w:widowControl w:val="false"/>
+              <w:jc w:val="center"/>
+              <w:rPr>
+                <w:rFonts w:ascii="arial" w:hAnsi="arial" w:eastAsia="arial"/>
+                <w:color w:val="000000"/>
+                <w:sz w:val="16"/>
+                <w:szCs w:val="16"/>
+              </w:rPr>
+            </w:pPr>
+            <w:r>
+              <w:rPr>
+                <w:rFonts w:eastAsia="arial" w:ascii="arial" w:hAnsi="arial"/>
+                <w:color w:val="000000"/>
+                <w:sz w:val="16"/>
+                <w:szCs w:val="16"/>
+              </w:rPr>
+            </w:r>
+          </w:p>
+        </w:tc>
+        <w:tc>
+          <w:tcPr>
+            <w:tcW w:w="1020" w:type="dxa"/>
+            <w:tcBorders>
+              <w:top w:val="single" w:sz="4" w:space="0" w:color="000000"/>
+              <w:left w:val="single" w:sz="4" w:space="0" w:color="000000"/>
+              <w:bottom w:val="single" w:sz="4" w:space="0" w:color="000000"/>
+            </w:tcBorders>
+            <w:vAlign w:val="bottom"/>
+          </w:tcPr>
+          <w:p>
+            <w:pPr>
+              <w:pStyle w:val="Normal"/>
+              <w:widowControl w:val="false"/>
+              <w:jc w:val="center"/>
+              <w:rPr>
+                <w:rFonts w:ascii="arial" w:hAnsi="arial" w:eastAsia="arial"/>
+                <w:color w:val="000000"/>
+                <w:sz w:val="16"/>
+                <w:szCs w:val="16"/>
+              </w:rPr>
+            </w:pPr>
+            <w:r>
+              <w:rPr>
+                <w:rFonts w:eastAsia="arial" w:ascii="arial" w:hAnsi="arial"/>
+                <w:color w:val="000000"/>
+                <w:sz w:val="16"/>
+                <w:szCs w:val="16"/>
+              </w:rPr>
+              <w:t>Emer. Brake</w:t>
+            </w:r>
+          </w:p>
+        </w:tc>
+        <w:tc>
+          <w:tcPr>
+            <w:tcW w:w="1016" w:type="dxa"/>
+            <w:tcBorders>
+              <w:top w:val="single" w:sz="4" w:space="0" w:color="000000"/>
+              <w:left w:val="single" w:sz="4" w:space="0" w:color="000000"/>
+              <w:bottom w:val="single" w:sz="4" w:space="0" w:color="000000"/>
+            </w:tcBorders>
+            <w:vAlign w:val="bottom"/>
+          </w:tcPr>
+          <w:p>
+            <w:pPr>
+              <w:pStyle w:val="Normal"/>
+              <w:widowControl w:val="false"/>
+              <w:spacing w:lineRule="auto" w:line="180"/>
+              <w:jc w:val="center"/>
+              <w:rPr>
+                <w:color w:val="000000"/>
+                <w:sz w:val="16"/>
+                <w:szCs w:val="16"/>
+              </w:rPr>
+            </w:pPr>
+            <w:r>
+              <w:rPr>
+                <w:rFonts w:eastAsia="arial" w:ascii="arial" w:hAnsi="arial"/>
+                <w:color w:val="000000"/>
+                <w:sz w:val="16"/>
+                <w:szCs w:val="16"/>
+              </w:rPr>
+              <w:t>Desk Light</w:t>
+            </w:r>
+          </w:p>
+        </w:tc>
+        <w:tc>
+          <w:tcPr>
+            <w:tcW w:w="1016" w:type="dxa"/>
+            <w:tcBorders>
+              <w:top w:val="single" w:sz="4" w:space="0" w:color="000000"/>
+              <w:left w:val="single" w:sz="4" w:space="0" w:color="000000"/>
+              <w:bottom w:val="single" w:sz="4" w:space="0" w:color="000000"/>
+            </w:tcBorders>
+            <w:vAlign w:val="bottom"/>
+          </w:tcPr>
+          <w:p>
+            <w:pPr>
+              <w:pStyle w:val="Normal"/>
+              <w:widowControl w:val="false"/>
+              <w:spacing w:lineRule="auto" w:line="180"/>
+              <w:jc w:val="center"/>
+              <w:rPr>
+                <w:color w:val="000000"/>
+                <w:sz w:val="16"/>
+                <w:szCs w:val="16"/>
+              </w:rPr>
+            </w:pPr>
+            <w:r>
+              <w:rPr>
+                <w:rFonts w:eastAsia="arial" w:ascii="arial" w:hAnsi="arial"/>
+                <w:color w:val="000000"/>
+                <w:sz w:val="16"/>
+                <w:szCs w:val="16"/>
+              </w:rPr>
+              <w:t>Parking Brake On</w:t>
+            </w:r>
+          </w:p>
+        </w:tc>
+        <w:tc>
+          <w:tcPr>
+            <w:tcW w:w="1016" w:type="dxa"/>
+            <w:tcBorders>
+              <w:top w:val="single" w:sz="4" w:space="0" w:color="000000"/>
+              <w:left w:val="single" w:sz="4" w:space="0" w:color="000000"/>
+              <w:bottom w:val="single" w:sz="4" w:space="0" w:color="000000"/>
+            </w:tcBorders>
+            <w:vAlign w:val="bottom"/>
+          </w:tcPr>
+          <w:p>
+            <w:pPr>
+              <w:pStyle w:val="Normal"/>
+              <w:widowControl w:val="false"/>
+              <w:spacing w:lineRule="auto" w:line="180"/>
+              <w:jc w:val="center"/>
+              <w:rPr>
+                <w:color w:val="000000"/>
+                <w:sz w:val="16"/>
+                <w:szCs w:val="16"/>
+              </w:rPr>
+            </w:pPr>
+            <w:r>
+              <w:rPr>
+                <w:rFonts w:eastAsia="arial" w:ascii="arial" w:hAnsi="arial"/>
+                <w:color w:val="000000"/>
+                <w:sz w:val="16"/>
+                <w:szCs w:val="16"/>
+              </w:rPr>
+              <w:t>1P Cam</w:t>
+            </w:r>
+          </w:p>
+        </w:tc>
+        <w:tc>
+          <w:tcPr>
+            <w:tcW w:w="1029" w:type="dxa"/>
+            <w:tcBorders>
+              <w:top w:val="single" w:sz="4" w:space="0" w:color="000000"/>
+              <w:left w:val="single" w:sz="4" w:space="0" w:color="000000"/>
+              <w:bottom w:val="single" w:sz="4" w:space="0" w:color="000000"/>
+              <w:right w:val="single" w:sz="4" w:space="0" w:color="000000"/>
+            </w:tcBorders>
+            <w:vAlign w:val="bottom"/>
+          </w:tcPr>
+          <w:p>
+            <w:pPr>
+              <w:pStyle w:val="Normal"/>
+              <w:widowControl w:val="false"/>
+              <w:spacing w:lineRule="auto" w:line="180"/>
+              <w:jc w:val="center"/>
+              <w:rPr>
+                <w:color w:val="000000"/>
+                <w:sz w:val="16"/>
+                <w:szCs w:val="16"/>
+              </w:rPr>
+            </w:pPr>
+            <w:r>
+              <w:rPr>
+                <w:rFonts w:eastAsia="arial" w:ascii="arial" w:hAnsi="arial"/>
+                <w:color w:val="000000"/>
+                <w:sz w:val="16"/>
+                <w:szCs w:val="16"/>
+              </w:rPr>
+              <w:t>Next</w:t>
+            </w:r>
+          </w:p>
+          <w:p>
+            <w:pPr>
+              <w:pStyle w:val="Normal"/>
+              <w:widowControl w:val="false"/>
+              <w:spacing w:lineRule="auto" w:line="180"/>
+              <w:jc w:val="center"/>
+              <w:rPr>
+                <w:color w:val="000000"/>
+                <w:sz w:val="16"/>
+                <w:szCs w:val="16"/>
+              </w:rPr>
+            </w:pPr>
+            <w:r>
+              <w:rPr>
+                <w:rFonts w:eastAsia="arial" w:ascii="arial" w:hAnsi="arial"/>
+                <w:color w:val="000000"/>
+                <w:sz w:val="16"/>
+                <w:szCs w:val="16"/>
+              </w:rPr>
+              <w:t>Cab Cam</w:t>
+            </w:r>
+          </w:p>
+        </w:tc>
+      </w:tr>
+    </w:tbl>
+    <w:p>
+      <w:pPr>
+        <w:pStyle w:val="Normal"/>
+        <w:rPr>
+          <w:rFonts w:ascii="arial" w:hAnsi="arial" w:eastAsia="arial"/>
+          <w:color w:val="000000"/>
+          <w:sz w:val="16"/>
+          <w:szCs w:val="16"/>
+        </w:rPr>
+      </w:pPr>
+      <w:r>
+        <w:rPr>
+          <w:rFonts w:eastAsia="arial" w:ascii="arial" w:hAnsi="arial"/>
+          <w:color w:val="000000"/>
+          <w:sz w:val="16"/>
+          <w:szCs w:val="16"/>
+        </w:rPr>
+      </w:r>
+    </w:p>
+    <w:p>
+      <w:pPr>
+        <w:pStyle w:val="Normal"/>
+        <w:rPr>
+          <w:color w:val="000000"/>
+          <w:sz w:val="16"/>
+          <w:szCs w:val="16"/>
+        </w:rPr>
+      </w:pPr>
+      <w:r>
+        <w:rPr>
+          <w:rFonts w:eastAsia="arial" w:ascii="arial" w:hAnsi="arial"/>
+          <w:color w:val="000000"/>
+          <w:sz w:val="16"/>
+          <w:szCs w:val="16"/>
+        </w:rPr>
+        <w:tab/>
+        <w:t xml:space="preserve">           DB BR 19</w:t>
+      </w:r>
+      <w:r>
+        <w:rPr>
+          <w:rFonts w:eastAsia="arial" w:ascii="arial" w:hAnsi="arial"/>
+          <w:color w:val="000000"/>
+          <w:sz w:val="16"/>
+          <w:szCs w:val="16"/>
+        </w:rPr>
+        <w:t>4 (E94)</w:t>
+      </w:r>
+      <w:r>
+        <w:rPr>
+          <w:rFonts w:eastAsia="arial" w:ascii="arial" w:hAnsi="arial"/>
+          <w:color w:val="000000"/>
+          <w:sz w:val="16"/>
+          <w:szCs w:val="16"/>
+        </w:rPr>
+        <w:t>-2</w:t>
+      </w:r>
+    </w:p>
+    <w:tbl>
+      <w:tblPr>
+        <w:tblW w:w="14248" w:type="dxa"/>
+        <w:jc w:val="left"/>
+        <w:tblInd w:w="-5" w:type="dxa"/>
+        <w:tblLayout w:type="fixed"/>
+        <w:tblCellMar>
+          <w:top w:w="0" w:type="dxa"/>
+          <w:left w:w="108" w:type="dxa"/>
+          <w:bottom w:w="0" w:type="dxa"/>
+          <w:right w:w="108" w:type="dxa"/>
+        </w:tblCellMar>
+        <w:tblLook w:firstRow="1" w:noVBand="1" w:lastRow="0" w:firstColumn="1" w:lastColumn="0" w:noHBand="0" w:val="04a0"/>
+      </w:tblPr>
+      <w:tblGrid>
+        <w:gridCol w:w="1017"/>
+        <w:gridCol w:w="1019"/>
+        <w:gridCol w:w="1014"/>
+        <w:gridCol w:w="1016"/>
+        <w:gridCol w:w="1020"/>
+        <w:gridCol w:w="1016"/>
+        <w:gridCol w:w="1016"/>
+        <w:gridCol w:w="1017"/>
+        <w:gridCol w:w="1016"/>
+        <w:gridCol w:w="1020"/>
+        <w:gridCol w:w="1016"/>
+        <w:gridCol w:w="1016"/>
+        <w:gridCol w:w="1016"/>
+        <w:gridCol w:w="1029"/>
+      </w:tblGrid>
+      <w:tr>
+        <w:trPr>
+          <w:trHeight w:val="440" w:hRule="exact"/>
+          <w:cantSplit w:val="true"/>
+        </w:trPr>
+        <w:tc>
+          <w:tcPr>
+            <w:tcW w:w="1017" w:type="dxa"/>
+            <w:tcBorders>
+              <w:top w:val="single" w:sz="4" w:space="0" w:color="000000"/>
+              <w:left w:val="single" w:sz="4" w:space="0" w:color="000000"/>
+              <w:bottom w:val="single" w:sz="4" w:space="0" w:color="000000"/>
+            </w:tcBorders>
+            <w:vAlign w:val="bottom"/>
+          </w:tcPr>
+          <w:p>
+            <w:pPr>
+              <w:pStyle w:val="Normal"/>
+              <w:widowControl w:val="false"/>
+              <w:spacing w:lineRule="auto" w:line="180" w:before="0" w:after="60"/>
+              <w:jc w:val="center"/>
+              <w:rPr>
+                <w:color w:val="000000"/>
+                <w:sz w:val="16"/>
+                <w:szCs w:val="16"/>
+              </w:rPr>
+            </w:pPr>
+            <w:r>
+              <w:rPr>
+                <w:rFonts w:eastAsia="arial" w:ascii="arial" w:hAnsi="arial"/>
+                <w:b/>
+                <w:color w:val="000000"/>
+                <w:sz w:val="16"/>
+                <w:szCs w:val="16"/>
+              </w:rPr>
+              <w:t>HUD</w:t>
+            </w:r>
+          </w:p>
+        </w:tc>
+        <w:tc>
+          <w:tcPr>
+            <w:tcW w:w="1019" w:type="dxa"/>
+            <w:tcBorders>
+              <w:top w:val="single" w:sz="4" w:space="0" w:color="000000"/>
+              <w:left w:val="single" w:sz="4" w:space="0" w:color="000000"/>
+              <w:bottom w:val="single" w:sz="4" w:space="0" w:color="000000"/>
+            </w:tcBorders>
+            <w:vAlign w:val="bottom"/>
+          </w:tcPr>
+          <w:p>
+            <w:pPr>
+              <w:pStyle w:val="Normal"/>
+              <w:widowControl w:val="false"/>
+              <w:spacing w:lineRule="auto" w:line="180"/>
+              <w:jc w:val="center"/>
+              <w:rPr>
+                <w:rFonts w:ascii="arial" w:hAnsi="arial" w:eastAsia="arial"/>
+                <w:color w:val="000000"/>
+                <w:sz w:val="16"/>
+                <w:szCs w:val="16"/>
+              </w:rPr>
+            </w:pPr>
+            <w:r>
+              <w:rPr>
+                <w:rFonts w:eastAsia="arial" w:ascii="arial" w:hAnsi="arial"/>
+                <w:color w:val="000000"/>
+                <w:sz w:val="16"/>
+                <w:szCs w:val="16"/>
+              </w:rPr>
+              <w:t>Schedule</w:t>
+            </w:r>
+          </w:p>
+        </w:tc>
+        <w:tc>
+          <w:tcPr>
+            <w:tcW w:w="1014" w:type="dxa"/>
+            <w:tcBorders>
+              <w:top w:val="single" w:sz="4" w:space="0" w:color="000000"/>
+              <w:left w:val="single" w:sz="4" w:space="0" w:color="000000"/>
+              <w:bottom w:val="single" w:sz="4" w:space="0" w:color="000000"/>
+            </w:tcBorders>
+            <w:vAlign w:val="bottom"/>
+          </w:tcPr>
+          <w:p>
+            <w:pPr>
+              <w:pStyle w:val="Normal"/>
+              <w:widowControl w:val="false"/>
+              <w:spacing w:lineRule="auto" w:line="180"/>
+              <w:jc w:val="center"/>
+              <w:rPr>
+                <w:color w:val="000000"/>
+                <w:sz w:val="16"/>
+                <w:szCs w:val="16"/>
+              </w:rPr>
+            </w:pPr>
+            <w:r>
+              <w:rPr>
+                <w:rFonts w:eastAsia="arial" w:ascii="arial" w:hAnsi="arial"/>
+                <w:color w:val="000000"/>
+                <w:sz w:val="16"/>
+                <w:szCs w:val="16"/>
+              </w:rPr>
+              <w:t>MCB Open</w:t>
+            </w:r>
+          </w:p>
+        </w:tc>
+        <w:tc>
+          <w:tcPr>
+            <w:tcW w:w="1016" w:type="dxa"/>
+            <w:tcBorders>
+              <w:top w:val="single" w:sz="4" w:space="0" w:color="000000"/>
+              <w:left w:val="single" w:sz="4" w:space="0" w:color="000000"/>
+              <w:bottom w:val="single" w:sz="4" w:space="0" w:color="000000"/>
+            </w:tcBorders>
+            <w:vAlign w:val="bottom"/>
+          </w:tcPr>
+          <w:p>
+            <w:pPr>
+              <w:pStyle w:val="Normal"/>
+              <w:widowControl w:val="false"/>
+              <w:spacing w:lineRule="auto" w:line="180"/>
+              <w:jc w:val="center"/>
+              <w:rPr>
+                <w:sz w:val="16"/>
+                <w:szCs w:val="16"/>
+              </w:rPr>
+            </w:pPr>
+            <w:r>
+              <w:rPr>
+                <w:sz w:val="16"/>
+                <w:szCs w:val="16"/>
+              </w:rPr>
+              <w:t>Sifa</w:t>
+            </w:r>
+          </w:p>
+        </w:tc>
+        <w:tc>
+          <w:tcPr>
+            <w:tcW w:w="1020" w:type="dxa"/>
+            <w:tcBorders>
+              <w:top w:val="single" w:sz="4" w:space="0" w:color="000000"/>
+              <w:left w:val="single" w:sz="4" w:space="0" w:color="000000"/>
+              <w:bottom w:val="single" w:sz="4" w:space="0" w:color="000000"/>
+            </w:tcBorders>
+            <w:vAlign w:val="bottom"/>
+          </w:tcPr>
+          <w:p>
+            <w:pPr>
+              <w:pStyle w:val="Normal"/>
+              <w:widowControl w:val="false"/>
+              <w:jc w:val="center"/>
+              <w:rPr>
+                <w:rFonts w:ascii="arial" w:hAnsi="arial" w:eastAsia="arial"/>
+                <w:color w:val="000000"/>
+                <w:sz w:val="16"/>
+                <w:szCs w:val="16"/>
+              </w:rPr>
+            </w:pPr>
+            <w:r>
+              <w:rPr/>
+            </w:r>
+          </w:p>
+        </w:tc>
+        <w:tc>
+          <w:tcPr>
+            <w:tcW w:w="1016" w:type="dxa"/>
+            <w:tcBorders>
+              <w:top w:val="single" w:sz="4" w:space="0" w:color="000000"/>
+              <w:left w:val="single" w:sz="4" w:space="0" w:color="000000"/>
+              <w:bottom w:val="single" w:sz="4" w:space="0" w:color="000000"/>
+            </w:tcBorders>
+            <w:vAlign w:val="bottom"/>
+          </w:tcPr>
+          <w:p>
+            <w:pPr>
+              <w:pStyle w:val="Normal"/>
+              <w:widowControl w:val="false"/>
+              <w:spacing w:lineRule="auto" w:line="180"/>
+              <w:jc w:val="center"/>
+              <w:rPr>
+                <w:sz w:val="16"/>
+                <w:szCs w:val="16"/>
+              </w:rPr>
+            </w:pPr>
+            <w:r>
+              <w:rPr/>
+            </w:r>
+          </w:p>
+        </w:tc>
+        <w:tc>
+          <w:tcPr>
+            <w:tcW w:w="1016" w:type="dxa"/>
+            <w:tcBorders>
+              <w:top w:val="single" w:sz="4" w:space="0" w:color="000000"/>
+              <w:left w:val="single" w:sz="4" w:space="0" w:color="000000"/>
+              <w:bottom w:val="single" w:sz="4" w:space="0" w:color="000000"/>
+            </w:tcBorders>
+            <w:vAlign w:val="bottom"/>
+          </w:tcPr>
+          <w:p>
+            <w:pPr>
+              <w:pStyle w:val="Normal"/>
+              <w:widowControl w:val="false"/>
+              <w:jc w:val="center"/>
+              <w:rPr>
+                <w:sz w:val="16"/>
+                <w:szCs w:val="16"/>
+              </w:rPr>
+            </w:pPr>
+            <w:r>
+              <w:rPr/>
+            </w:r>
+          </w:p>
+        </w:tc>
+        <w:tc>
+          <w:tcPr>
+            <w:tcW w:w="1017" w:type="dxa"/>
+            <w:tcBorders>
+              <w:top w:val="single" w:sz="4" w:space="0" w:color="000000"/>
+              <w:left w:val="single" w:sz="4" w:space="0" w:color="000000"/>
+              <w:bottom w:val="single" w:sz="4" w:space="0" w:color="000000"/>
+            </w:tcBorders>
+            <w:vAlign w:val="bottom"/>
+          </w:tcPr>
+          <w:p>
+            <w:pPr>
+              <w:pStyle w:val="Normal"/>
+              <w:widowControl w:val="false"/>
+              <w:jc w:val="center"/>
+              <w:rPr>
+                <w:rFonts w:ascii="arial" w:hAnsi="arial" w:eastAsia="arial"/>
+                <w:color w:val="000000"/>
+                <w:sz w:val="16"/>
+                <w:szCs w:val="16"/>
+              </w:rPr>
+            </w:pPr>
+            <w:r>
+              <w:rPr/>
+            </w:r>
+          </w:p>
+        </w:tc>
+        <w:tc>
+          <w:tcPr>
+            <w:tcW w:w="1016" w:type="dxa"/>
+            <w:tcBorders>
+              <w:top w:val="single" w:sz="4" w:space="0" w:color="000000"/>
+              <w:left w:val="single" w:sz="4" w:space="0" w:color="000000"/>
+              <w:bottom w:val="single" w:sz="4" w:space="0" w:color="000000"/>
+            </w:tcBorders>
+            <w:vAlign w:val="bottom"/>
+          </w:tcPr>
+          <w:p>
+            <w:pPr>
+              <w:pStyle w:val="Normal"/>
+              <w:widowControl w:val="false"/>
+              <w:jc w:val="center"/>
+              <w:rPr>
+                <w:rFonts w:ascii="arial" w:hAnsi="arial" w:eastAsia="arial"/>
+                <w:color w:val="000000"/>
+                <w:sz w:val="16"/>
+                <w:szCs w:val="16"/>
+              </w:rPr>
+            </w:pPr>
+            <w:r>
+              <w:rPr>
+                <w:rFonts w:eastAsia="arial" w:ascii="arial" w:hAnsi="arial"/>
+                <w:color w:val="000000"/>
+                <w:sz w:val="16"/>
+                <w:szCs w:val="16"/>
+              </w:rPr>
+            </w:r>
+          </w:p>
+        </w:tc>
+        <w:tc>
+          <w:tcPr>
+            <w:tcW w:w="1020" w:type="dxa"/>
+            <w:tcBorders>
+              <w:top w:val="single" w:sz="4" w:space="0" w:color="000000"/>
+              <w:left w:val="single" w:sz="4" w:space="0" w:color="000000"/>
+              <w:bottom w:val="single" w:sz="4" w:space="0" w:color="000000"/>
+            </w:tcBorders>
+            <w:vAlign w:val="bottom"/>
+          </w:tcPr>
+          <w:p>
+            <w:pPr>
+              <w:pStyle w:val="Normal"/>
+              <w:widowControl w:val="false"/>
+              <w:jc w:val="center"/>
+              <w:rPr>
+                <w:rFonts w:ascii="arial" w:hAnsi="arial" w:eastAsia="arial"/>
+                <w:color w:val="000000"/>
+                <w:sz w:val="16"/>
+                <w:szCs w:val="16"/>
+              </w:rPr>
+            </w:pPr>
+            <w:r>
+              <w:rPr>
+                <w:rFonts w:eastAsia="arial" w:ascii="arial" w:hAnsi="arial"/>
+                <w:color w:val="000000"/>
+                <w:sz w:val="16"/>
+                <w:szCs w:val="16"/>
+              </w:rPr>
+            </w:r>
+          </w:p>
+        </w:tc>
+        <w:tc>
+          <w:tcPr>
+            <w:tcW w:w="1016" w:type="dxa"/>
+            <w:tcBorders>
+              <w:top w:val="single" w:sz="4" w:space="0" w:color="000000"/>
+              <w:left w:val="single" w:sz="4" w:space="0" w:color="000000"/>
+              <w:bottom w:val="single" w:sz="4" w:space="0" w:color="000000"/>
+            </w:tcBorders>
+            <w:vAlign w:val="bottom"/>
+          </w:tcPr>
+          <w:p>
+            <w:pPr>
+              <w:pStyle w:val="Normal"/>
+              <w:widowControl w:val="false"/>
+              <w:jc w:val="center"/>
+              <w:rPr>
+                <w:color w:val="000000"/>
+                <w:sz w:val="16"/>
+                <w:szCs w:val="16"/>
+              </w:rPr>
+            </w:pPr>
+            <w:r>
+              <w:rPr>
+                <w:rFonts w:eastAsia="arial" w:ascii="arial" w:hAnsi="arial"/>
+                <w:color w:val="000000"/>
+                <w:sz w:val="16"/>
+                <w:szCs w:val="16"/>
+              </w:rPr>
+              <w:t>Cab Light</w:t>
             </w:r>
           </w:p>
         </w:tc>
@@ -22781,13 +23921,13 @@
       <w:rFonts w:ascii="Symbol" w:hAnsi="Symbol" w:cs="Symbol"/>
     </w:rPr>
   </w:style>
-  <w:style w:type="character" w:styleId="Style5" w:customStyle="1">
-    <w:name w:val="번호 매기기 기호"/>
+  <w:style w:type="character" w:styleId="user" w:customStyle="1">
+    <w:name w:val="번호 매기기 기호 (user)"/>
     <w:qFormat/>
     <w:rPr/>
   </w:style>
-  <w:style w:type="character" w:styleId="user">
-    <w:name w:val="번호 매기기 기호 (user)"/>
+  <w:style w:type="character" w:styleId="Style5">
+    <w:name w:val="번호 매기기 기호"/>
     <w:qFormat/>
     <w:rPr/>
   </w:style>
@@ -22801,7 +23941,7 @@
       <w:spacing w:before="240" w:after="120"/>
     </w:pPr>
     <w:rPr>
-      <w:rFonts w:ascii="Liberation Sans" w:hAnsi="Liberation Sans" w:eastAsia="Noto Sans KR" w:cs="Arial"/>
+      <w:rFonts w:ascii="Liberation Sans" w:hAnsi="Liberation Sans" w:eastAsia="Noto Sans CJK KR" w:cs="Lohit Devanagari"/>
       <w:sz w:val="28"/>
       <w:szCs w:val="28"/>
     </w:rPr>
@@ -22838,7 +23978,7 @@
       <w:szCs w:val="24"/>
     </w:rPr>
   </w:style>
-  <w:style w:type="paragraph" w:styleId="Style7">
+  <w:style w:type="paragraph" w:styleId="Style7" w:customStyle="1">
     <w:name w:val="색인"/>
     <w:basedOn w:val="Normal"/>
     <w:qFormat/>
@@ -22846,8 +23986,7 @@
       <w:suppressLineNumbers/>
     </w:pPr>
     <w:rPr>
-      <w:rFonts w:cs="Arial"/>
-      <w:sz w:val="24"/>
+      <w:rFonts w:cs="Lohit Devanagari"/>
     </w:rPr>
   </w:style>
   <w:style w:type="paragraph" w:styleId="user1">
@@ -22860,12 +23999,12 @@
       <w:spacing w:before="240" w:after="120"/>
     </w:pPr>
     <w:rPr>
-      <w:rFonts w:ascii="Liberation Sans" w:hAnsi="Liberation Sans" w:eastAsia="Noto Sans CJK KR" w:cs="Lohit Devanagari"/>
+      <w:rFonts w:ascii="Liberation Sans" w:hAnsi="Liberation Sans" w:eastAsia="Noto Sans KR" w:cs="Arial"/>
       <w:sz w:val="28"/>
       <w:szCs w:val="28"/>
     </w:rPr>
   </w:style>
-  <w:style w:type="paragraph" w:styleId="user2" w:customStyle="1">
+  <w:style w:type="paragraph" w:styleId="user2">
     <w:name w:val="색인 (user)"/>
     <w:basedOn w:val="Normal"/>
     <w:qFormat/>
@@ -22873,7 +24012,8 @@
       <w:suppressLineNumbers/>
     </w:pPr>
     <w:rPr>
-      <w:rFonts w:cs="Lohit Devanagari"/>
+      <w:rFonts w:cs="Arial"/>
+      <w:sz w:val="24"/>
     </w:rPr>
   </w:style>
   <w:style w:type="paragraph" w:styleId="Title">
@@ -23555,8 +24695,8 @@
       <w:szCs w:val="24"/>
     </w:rPr>
   </w:style>
-  <w:style w:type="paragraph" w:styleId="user3" w:customStyle="1">
-    <w:name w:val="표 내용 (user)"/>
+  <w:style w:type="paragraph" w:styleId="Style8" w:customStyle="1">
+    <w:name w:val="표 내용"/>
     <w:basedOn w:val="Normal"/>
     <w:qFormat/>
     <w:pPr>
@@ -23564,9 +24704,9 @@
     </w:pPr>
     <w:rPr/>
   </w:style>
-  <w:style w:type="paragraph" w:styleId="user4" w:customStyle="1">
-    <w:name w:val="표제목 (user)"/>
-    <w:basedOn w:val="user3"/>
+  <w:style w:type="paragraph" w:styleId="Style9" w:customStyle="1">
+    <w:name w:val="표제목"/>
+    <w:basedOn w:val="Style8"/>
     <w:qFormat/>
     <w:pPr>
       <w:jc w:val="center"/>
@@ -23576,8 +24716,8 @@
       <w:bCs/>
     </w:rPr>
   </w:style>
-  <w:style w:type="paragraph" w:styleId="Style8">
-    <w:name w:val="표 내용"/>
+  <w:style w:type="paragraph" w:styleId="user3">
+    <w:name w:val="표 내용 (user)"/>
     <w:basedOn w:val="Normal"/>
     <w:qFormat/>
     <w:pPr>
@@ -23586,9 +24726,9 @@
     </w:pPr>
     <w:rPr/>
   </w:style>
-  <w:style w:type="paragraph" w:styleId="Style9">
-    <w:name w:val="표제목"/>
-    <w:basedOn w:val="Style8"/>
+  <w:style w:type="paragraph" w:styleId="user4">
+    <w:name w:val="표제목 (user)"/>
+    <w:basedOn w:val="user3"/>
     <w:qFormat/>
     <w:pPr>
       <w:suppressLineNumbers/>

</xml_diff>

<commit_message>
Add German Cab Cars
Added DB DoppelStockwagen, DB BR 463 Electric and Diesel and DB BR 483.
</commit_message>
<xml_diff>
--- a/raildriver-Germany-Remapped.docx
+++ b/raildriver-Germany-Remapped.docx
@@ -21785,25 +21785,7 @@
           <w:sz w:val="16"/>
           <w:szCs w:val="16"/>
         </w:rPr>
-        <w:t xml:space="preserve">    DB BR 19</w:t>
-      </w:r>
-      <w:r>
-        <w:rPr>
-          <w:rFonts w:eastAsia="arial" w:ascii="arial" w:hAnsi="arial"/>
-          <w:color w:val="000000"/>
-          <w:sz w:val="16"/>
-          <w:szCs w:val="16"/>
-        </w:rPr>
-        <w:t>4 (E94)</w:t>
-      </w:r>
-      <w:r>
-        <w:rPr>
-          <w:rFonts w:eastAsia="arial" w:ascii="arial" w:hAnsi="arial"/>
-          <w:color w:val="000000"/>
-          <w:sz w:val="16"/>
-          <w:szCs w:val="16"/>
-        </w:rPr>
-        <w:t>-1</w:t>
+        <w:t xml:space="preserve">    DB BR 194 (E94)-1</w:t>
       </w:r>
     </w:p>
     <w:tbl>
@@ -21898,7 +21880,11 @@
               </w:rPr>
             </w:pPr>
             <w:r>
-              <w:rPr/>
+              <w:rPr>
+                <w:color w:val="000000"/>
+                <w:sz w:val="16"/>
+                <w:szCs w:val="16"/>
+              </w:rPr>
             </w:r>
           </w:p>
         </w:tc>
@@ -21989,7 +21975,11 @@
               </w:rPr>
             </w:pPr>
             <w:r>
-              <w:rPr/>
+              <w:rPr>
+                <w:color w:val="000000"/>
+                <w:sz w:val="16"/>
+                <w:szCs w:val="16"/>
+              </w:rPr>
             </w:r>
           </w:p>
         </w:tc>
@@ -22051,16 +22041,7 @@
                 <w:sz w:val="16"/>
                 <w:szCs w:val="16"/>
               </w:rPr>
-              <w:t xml:space="preserve">Brake </w:t>
-            </w:r>
-            <w:r>
-              <w:rPr>
-                <w:rFonts w:eastAsia="arial" w:ascii="arial" w:hAnsi="arial"/>
-                <w:color w:val="000000"/>
-                <w:sz w:val="16"/>
-                <w:szCs w:val="16"/>
-              </w:rPr>
-              <w:t>Key</w:t>
+              <w:t>Brake Key</w:t>
             </w:r>
           </w:p>
         </w:tc>
@@ -22087,7 +22068,12 @@
               </w:rPr>
             </w:pPr>
             <w:r>
-              <w:rPr/>
+              <w:rPr>
+                <w:rFonts w:eastAsia="arial" w:ascii="arial" w:hAnsi="arial"/>
+                <w:color w:val="000000"/>
+                <w:sz w:val="16"/>
+                <w:szCs w:val="16"/>
+              </w:rPr>
             </w:r>
           </w:p>
         </w:tc>
@@ -22349,25 +22335,7 @@
           <w:szCs w:val="16"/>
         </w:rPr>
         <w:tab/>
-        <w:t xml:space="preserve">           DB BR 19</w:t>
-      </w:r>
-      <w:r>
-        <w:rPr>
-          <w:rFonts w:eastAsia="arial" w:ascii="arial" w:hAnsi="arial"/>
-          <w:color w:val="000000"/>
-          <w:sz w:val="16"/>
-          <w:szCs w:val="16"/>
-        </w:rPr>
-        <w:t>4 (E94)</w:t>
-      </w:r>
-      <w:r>
-        <w:rPr>
-          <w:rFonts w:eastAsia="arial" w:ascii="arial" w:hAnsi="arial"/>
-          <w:color w:val="000000"/>
-          <w:sz w:val="16"/>
-          <w:szCs w:val="16"/>
-        </w:rPr>
-        <w:t>-2</w:t>
+        <w:t xml:space="preserve">           DB BR 194 (E94)-2</w:t>
       </w:r>
     </w:p>
     <w:tbl>
@@ -22559,58 +22527,69 @@
               </w:rPr>
             </w:pPr>
             <w:r>
-              <w:rPr/>
-            </w:r>
-          </w:p>
-        </w:tc>
-        <w:tc>
-          <w:tcPr>
-            <w:tcW w:w="1016" w:type="dxa"/>
-            <w:tcBorders>
-              <w:top w:val="single" w:sz="4" w:space="0" w:color="000000"/>
-              <w:left w:val="single" w:sz="4" w:space="0" w:color="000000"/>
-              <w:bottom w:val="single" w:sz="4" w:space="0" w:color="000000"/>
-            </w:tcBorders>
-            <w:vAlign w:val="bottom"/>
-          </w:tcPr>
-          <w:p>
-            <w:pPr>
-              <w:pStyle w:val="Normal"/>
-              <w:widowControl w:val="false"/>
-              <w:spacing w:lineRule="auto" w:line="180"/>
-              <w:jc w:val="center"/>
-              <w:rPr>
-                <w:sz w:val="16"/>
-                <w:szCs w:val="16"/>
-              </w:rPr>
-            </w:pPr>
-            <w:r>
-              <w:rPr/>
-            </w:r>
-          </w:p>
-        </w:tc>
-        <w:tc>
-          <w:tcPr>
-            <w:tcW w:w="1016" w:type="dxa"/>
-            <w:tcBorders>
-              <w:top w:val="single" w:sz="4" w:space="0" w:color="000000"/>
-              <w:left w:val="single" w:sz="4" w:space="0" w:color="000000"/>
-              <w:bottom w:val="single" w:sz="4" w:space="0" w:color="000000"/>
-            </w:tcBorders>
-            <w:vAlign w:val="bottom"/>
-          </w:tcPr>
-          <w:p>
-            <w:pPr>
-              <w:pStyle w:val="Normal"/>
-              <w:widowControl w:val="false"/>
-              <w:jc w:val="center"/>
-              <w:rPr>
-                <w:sz w:val="16"/>
-                <w:szCs w:val="16"/>
-              </w:rPr>
-            </w:pPr>
-            <w:r>
-              <w:rPr/>
+              <w:rPr>
+                <w:rFonts w:eastAsia="arial" w:ascii="arial" w:hAnsi="arial"/>
+                <w:color w:val="000000"/>
+                <w:sz w:val="16"/>
+                <w:szCs w:val="16"/>
+              </w:rPr>
+            </w:r>
+          </w:p>
+        </w:tc>
+        <w:tc>
+          <w:tcPr>
+            <w:tcW w:w="1016" w:type="dxa"/>
+            <w:tcBorders>
+              <w:top w:val="single" w:sz="4" w:space="0" w:color="000000"/>
+              <w:left w:val="single" w:sz="4" w:space="0" w:color="000000"/>
+              <w:bottom w:val="single" w:sz="4" w:space="0" w:color="000000"/>
+            </w:tcBorders>
+            <w:vAlign w:val="bottom"/>
+          </w:tcPr>
+          <w:p>
+            <w:pPr>
+              <w:pStyle w:val="Normal"/>
+              <w:widowControl w:val="false"/>
+              <w:spacing w:lineRule="auto" w:line="180"/>
+              <w:jc w:val="center"/>
+              <w:rPr>
+                <w:sz w:val="16"/>
+                <w:szCs w:val="16"/>
+              </w:rPr>
+            </w:pPr>
+            <w:r>
+              <w:rPr>
+                <w:sz w:val="16"/>
+                <w:szCs w:val="16"/>
+              </w:rPr>
+            </w:r>
+          </w:p>
+        </w:tc>
+        <w:tc>
+          <w:tcPr>
+            <w:tcW w:w="1016" w:type="dxa"/>
+            <w:tcBorders>
+              <w:top w:val="single" w:sz="4" w:space="0" w:color="000000"/>
+              <w:left w:val="single" w:sz="4" w:space="0" w:color="000000"/>
+              <w:bottom w:val="single" w:sz="4" w:space="0" w:color="000000"/>
+            </w:tcBorders>
+            <w:vAlign w:val="bottom"/>
+          </w:tcPr>
+          <w:p>
+            <w:pPr>
+              <w:pStyle w:val="Normal"/>
+              <w:widowControl w:val="false"/>
+              <w:jc w:val="center"/>
+              <w:rPr>
+                <w:sz w:val="16"/>
+                <w:szCs w:val="16"/>
+              </w:rPr>
+            </w:pPr>
+            <w:r>
+              <w:rPr>
+                <w:sz w:val="16"/>
+                <w:szCs w:val="16"/>
+              </w:rPr>
             </w:r>
           </w:p>
         </w:tc>
@@ -22637,7 +22616,12 @@
               </w:rPr>
             </w:pPr>
             <w:r>
-              <w:rPr/>
+              <w:rPr>
+                <w:rFonts w:eastAsia="arial" w:ascii="arial" w:hAnsi="arial"/>
+                <w:color w:val="000000"/>
+                <w:sz w:val="16"/>
+                <w:szCs w:val="16"/>
+              </w:rPr>
             </w:r>
           </w:p>
         </w:tc>
@@ -22925,25 +22909,7 @@
           <w:sz w:val="16"/>
           <w:szCs w:val="16"/>
         </w:rPr>
-        <w:t xml:space="preserve">    DB </w:t>
-      </w:r>
-      <w:r>
-        <w:rPr>
-          <w:rFonts w:eastAsia="arial" w:ascii="arial" w:hAnsi="arial"/>
-          <w:color w:val="000000"/>
-          <w:sz w:val="16"/>
-          <w:szCs w:val="16"/>
-        </w:rPr>
-        <w:t>DoppelStock</w:t>
-      </w:r>
-      <w:r>
-        <w:rPr>
-          <w:rFonts w:eastAsia="arial" w:ascii="arial" w:hAnsi="arial"/>
-          <w:color w:val="000000"/>
-          <w:sz w:val="16"/>
-          <w:szCs w:val="16"/>
-        </w:rPr>
-        <w:t>-1</w:t>
+        <w:t xml:space="preserve">    DB DoppelStock-1</w:t>
       </w:r>
     </w:p>
     <w:tbl>
@@ -23543,7 +23509,627 @@
           <w:szCs w:val="16"/>
         </w:rPr>
         <w:tab/>
-        <w:t xml:space="preserve">           DB </w:t>
+        <w:t xml:space="preserve">           DB DoppelStock-2</w:t>
+      </w:r>
+    </w:p>
+    <w:tbl>
+      <w:tblPr>
+        <w:tblW w:w="14248" w:type="dxa"/>
+        <w:jc w:val="left"/>
+        <w:tblInd w:w="-5" w:type="dxa"/>
+        <w:tblLayout w:type="fixed"/>
+        <w:tblCellMar>
+          <w:top w:w="0" w:type="dxa"/>
+          <w:left w:w="108" w:type="dxa"/>
+          <w:bottom w:w="0" w:type="dxa"/>
+          <w:right w:w="108" w:type="dxa"/>
+        </w:tblCellMar>
+        <w:tblLook w:firstRow="1" w:noVBand="1" w:lastRow="0" w:firstColumn="1" w:lastColumn="0" w:noHBand="0" w:val="04a0"/>
+      </w:tblPr>
+      <w:tblGrid>
+        <w:gridCol w:w="1017"/>
+        <w:gridCol w:w="1019"/>
+        <w:gridCol w:w="1014"/>
+        <w:gridCol w:w="1016"/>
+        <w:gridCol w:w="1020"/>
+        <w:gridCol w:w="1016"/>
+        <w:gridCol w:w="1016"/>
+        <w:gridCol w:w="1017"/>
+        <w:gridCol w:w="1016"/>
+        <w:gridCol w:w="1020"/>
+        <w:gridCol w:w="1016"/>
+        <w:gridCol w:w="1016"/>
+        <w:gridCol w:w="1016"/>
+        <w:gridCol w:w="1029"/>
+      </w:tblGrid>
+      <w:tr>
+        <w:trPr>
+          <w:trHeight w:val="440" w:hRule="exact"/>
+          <w:cantSplit w:val="true"/>
+        </w:trPr>
+        <w:tc>
+          <w:tcPr>
+            <w:tcW w:w="1017" w:type="dxa"/>
+            <w:tcBorders>
+              <w:top w:val="single" w:sz="4" w:space="0" w:color="000000"/>
+              <w:left w:val="single" w:sz="4" w:space="0" w:color="000000"/>
+              <w:bottom w:val="single" w:sz="4" w:space="0" w:color="000000"/>
+            </w:tcBorders>
+            <w:vAlign w:val="bottom"/>
+          </w:tcPr>
+          <w:p>
+            <w:pPr>
+              <w:pStyle w:val="Normal"/>
+              <w:widowControl w:val="false"/>
+              <w:spacing w:lineRule="auto" w:line="180" w:before="0" w:after="60"/>
+              <w:jc w:val="center"/>
+              <w:rPr>
+                <w:color w:val="000000"/>
+                <w:sz w:val="16"/>
+                <w:szCs w:val="16"/>
+              </w:rPr>
+            </w:pPr>
+            <w:r>
+              <w:rPr>
+                <w:rFonts w:eastAsia="arial" w:ascii="arial" w:hAnsi="arial"/>
+                <w:b/>
+                <w:color w:val="000000"/>
+                <w:sz w:val="16"/>
+                <w:szCs w:val="16"/>
+              </w:rPr>
+              <w:t>HUD</w:t>
+            </w:r>
+          </w:p>
+        </w:tc>
+        <w:tc>
+          <w:tcPr>
+            <w:tcW w:w="1019" w:type="dxa"/>
+            <w:tcBorders>
+              <w:top w:val="single" w:sz="4" w:space="0" w:color="000000"/>
+              <w:left w:val="single" w:sz="4" w:space="0" w:color="000000"/>
+              <w:bottom w:val="single" w:sz="4" w:space="0" w:color="000000"/>
+            </w:tcBorders>
+            <w:vAlign w:val="bottom"/>
+          </w:tcPr>
+          <w:p>
+            <w:pPr>
+              <w:pStyle w:val="Normal"/>
+              <w:widowControl w:val="false"/>
+              <w:spacing w:lineRule="auto" w:line="180"/>
+              <w:jc w:val="center"/>
+              <w:rPr>
+                <w:rFonts w:ascii="arial" w:hAnsi="arial" w:eastAsia="arial"/>
+                <w:color w:val="000000"/>
+                <w:sz w:val="16"/>
+                <w:szCs w:val="16"/>
+              </w:rPr>
+            </w:pPr>
+            <w:r>
+              <w:rPr>
+                <w:rFonts w:eastAsia="arial" w:ascii="arial" w:hAnsi="arial"/>
+                <w:color w:val="000000"/>
+                <w:sz w:val="16"/>
+                <w:szCs w:val="16"/>
+              </w:rPr>
+              <w:t>Schedule</w:t>
+            </w:r>
+          </w:p>
+        </w:tc>
+        <w:tc>
+          <w:tcPr>
+            <w:tcW w:w="1014" w:type="dxa"/>
+            <w:tcBorders>
+              <w:top w:val="single" w:sz="4" w:space="0" w:color="000000"/>
+              <w:left w:val="single" w:sz="4" w:space="0" w:color="000000"/>
+              <w:bottom w:val="single" w:sz="4" w:space="0" w:color="000000"/>
+            </w:tcBorders>
+            <w:vAlign w:val="bottom"/>
+          </w:tcPr>
+          <w:p>
+            <w:pPr>
+              <w:pStyle w:val="Normal"/>
+              <w:widowControl w:val="false"/>
+              <w:spacing w:lineRule="auto" w:line="180"/>
+              <w:jc w:val="center"/>
+              <w:rPr>
+                <w:color w:val="000000"/>
+                <w:sz w:val="16"/>
+                <w:szCs w:val="16"/>
+              </w:rPr>
+            </w:pPr>
+            <w:r>
+              <w:rPr>
+                <w:rFonts w:eastAsia="arial" w:ascii="arial" w:hAnsi="arial"/>
+                <w:color w:val="000000"/>
+                <w:sz w:val="16"/>
+                <w:szCs w:val="16"/>
+              </w:rPr>
+              <w:t>MCB Open</w:t>
+            </w:r>
+          </w:p>
+        </w:tc>
+        <w:tc>
+          <w:tcPr>
+            <w:tcW w:w="1016" w:type="dxa"/>
+            <w:tcBorders>
+              <w:top w:val="single" w:sz="4" w:space="0" w:color="000000"/>
+              <w:left w:val="single" w:sz="4" w:space="0" w:color="000000"/>
+              <w:bottom w:val="single" w:sz="4" w:space="0" w:color="000000"/>
+            </w:tcBorders>
+            <w:vAlign w:val="bottom"/>
+          </w:tcPr>
+          <w:p>
+            <w:pPr>
+              <w:pStyle w:val="Normal"/>
+              <w:widowControl w:val="false"/>
+              <w:spacing w:lineRule="auto" w:line="180"/>
+              <w:jc w:val="center"/>
+              <w:rPr>
+                <w:sz w:val="16"/>
+                <w:szCs w:val="16"/>
+              </w:rPr>
+            </w:pPr>
+            <w:r>
+              <w:rPr>
+                <w:sz w:val="16"/>
+                <w:szCs w:val="16"/>
+              </w:rPr>
+              <w:t>Sifa</w:t>
+            </w:r>
+          </w:p>
+        </w:tc>
+        <w:tc>
+          <w:tcPr>
+            <w:tcW w:w="1020" w:type="dxa"/>
+            <w:tcBorders>
+              <w:top w:val="single" w:sz="4" w:space="0" w:color="000000"/>
+              <w:left w:val="single" w:sz="4" w:space="0" w:color="000000"/>
+              <w:bottom w:val="single" w:sz="4" w:space="0" w:color="000000"/>
+            </w:tcBorders>
+            <w:vAlign w:val="bottom"/>
+          </w:tcPr>
+          <w:p>
+            <w:pPr>
+              <w:pStyle w:val="Normal"/>
+              <w:widowControl w:val="false"/>
+              <w:jc w:val="center"/>
+              <w:rPr>
+                <w:rFonts w:ascii="arial" w:hAnsi="arial" w:eastAsia="arial"/>
+                <w:color w:val="000000"/>
+                <w:sz w:val="16"/>
+                <w:szCs w:val="16"/>
+              </w:rPr>
+            </w:pPr>
+            <w:r>
+              <w:rPr>
+                <w:rFonts w:eastAsia="arial" w:ascii="arial" w:hAnsi="arial"/>
+                <w:color w:val="000000"/>
+                <w:sz w:val="16"/>
+                <w:szCs w:val="16"/>
+              </w:rPr>
+              <w:t>Panto.</w:t>
+            </w:r>
+          </w:p>
+          <w:p>
+            <w:pPr>
+              <w:pStyle w:val="Normal"/>
+              <w:widowControl w:val="false"/>
+              <w:jc w:val="center"/>
+              <w:rPr>
+                <w:rFonts w:ascii="arial" w:hAnsi="arial" w:eastAsia="arial"/>
+                <w:color w:val="000000"/>
+                <w:sz w:val="16"/>
+                <w:szCs w:val="16"/>
+              </w:rPr>
+            </w:pPr>
+            <w:r>
+              <w:rPr>
+                <w:rFonts w:eastAsia="arial" w:ascii="arial" w:hAnsi="arial"/>
+                <w:color w:val="000000"/>
+                <w:sz w:val="16"/>
+                <w:szCs w:val="16"/>
+              </w:rPr>
+              <w:t>Low</w:t>
+            </w:r>
+          </w:p>
+        </w:tc>
+        <w:tc>
+          <w:tcPr>
+            <w:tcW w:w="1016" w:type="dxa"/>
+            <w:tcBorders>
+              <w:top w:val="single" w:sz="4" w:space="0" w:color="000000"/>
+              <w:left w:val="single" w:sz="4" w:space="0" w:color="000000"/>
+              <w:bottom w:val="single" w:sz="4" w:space="0" w:color="000000"/>
+            </w:tcBorders>
+            <w:vAlign w:val="bottom"/>
+          </w:tcPr>
+          <w:p>
+            <w:pPr>
+              <w:pStyle w:val="Normal"/>
+              <w:widowControl w:val="false"/>
+              <w:spacing w:lineRule="auto" w:line="180"/>
+              <w:jc w:val="center"/>
+              <w:rPr>
+                <w:sz w:val="16"/>
+                <w:szCs w:val="16"/>
+              </w:rPr>
+            </w:pPr>
+            <w:r>
+              <w:rPr>
+                <w:rFonts w:eastAsia="arial" w:ascii="arial" w:hAnsi="arial"/>
+                <w:color w:val="000000"/>
+                <w:sz w:val="16"/>
+                <w:szCs w:val="16"/>
+              </w:rPr>
+              <w:t>Train Supply Off</w:t>
+            </w:r>
+          </w:p>
+        </w:tc>
+        <w:tc>
+          <w:tcPr>
+            <w:tcW w:w="1016" w:type="dxa"/>
+            <w:tcBorders>
+              <w:top w:val="single" w:sz="4" w:space="0" w:color="000000"/>
+              <w:left w:val="single" w:sz="4" w:space="0" w:color="000000"/>
+              <w:bottom w:val="single" w:sz="4" w:space="0" w:color="000000"/>
+            </w:tcBorders>
+            <w:vAlign w:val="bottom"/>
+          </w:tcPr>
+          <w:p>
+            <w:pPr>
+              <w:pStyle w:val="Normal"/>
+              <w:widowControl w:val="false"/>
+              <w:jc w:val="center"/>
+              <w:rPr>
+                <w:sz w:val="16"/>
+                <w:szCs w:val="16"/>
+              </w:rPr>
+            </w:pPr>
+            <w:r>
+              <w:rPr>
+                <w:rFonts w:eastAsia="arial" w:ascii="arial" w:hAnsi="arial"/>
+                <w:color w:val="000000"/>
+                <w:sz w:val="16"/>
+                <w:szCs w:val="16"/>
+              </w:rPr>
+              <w:t>Train Light Off</w:t>
+            </w:r>
+          </w:p>
+        </w:tc>
+        <w:tc>
+          <w:tcPr>
+            <w:tcW w:w="1017" w:type="dxa"/>
+            <w:tcBorders>
+              <w:top w:val="single" w:sz="4" w:space="0" w:color="000000"/>
+              <w:left w:val="single" w:sz="4" w:space="0" w:color="000000"/>
+              <w:bottom w:val="single" w:sz="4" w:space="0" w:color="000000"/>
+            </w:tcBorders>
+            <w:vAlign w:val="bottom"/>
+          </w:tcPr>
+          <w:p>
+            <w:pPr>
+              <w:pStyle w:val="Normal"/>
+              <w:widowControl w:val="false"/>
+              <w:jc w:val="center"/>
+              <w:rPr>
+                <w:rFonts w:ascii="arial" w:hAnsi="arial" w:eastAsia="arial"/>
+                <w:color w:val="000000"/>
+                <w:sz w:val="16"/>
+                <w:szCs w:val="16"/>
+              </w:rPr>
+            </w:pPr>
+            <w:r>
+              <w:rPr>
+                <w:rFonts w:eastAsia="arial" w:ascii="arial" w:hAnsi="arial"/>
+                <w:color w:val="000000"/>
+                <w:sz w:val="16"/>
+                <w:szCs w:val="16"/>
+              </w:rPr>
+              <w:t>Brake Key Off</w:t>
+            </w:r>
+          </w:p>
+        </w:tc>
+        <w:tc>
+          <w:tcPr>
+            <w:tcW w:w="1016" w:type="dxa"/>
+            <w:tcBorders>
+              <w:top w:val="single" w:sz="4" w:space="0" w:color="000000"/>
+              <w:left w:val="single" w:sz="4" w:space="0" w:color="000000"/>
+              <w:bottom w:val="single" w:sz="4" w:space="0" w:color="000000"/>
+            </w:tcBorders>
+            <w:vAlign w:val="bottom"/>
+          </w:tcPr>
+          <w:p>
+            <w:pPr>
+              <w:pStyle w:val="Normal"/>
+              <w:widowControl w:val="false"/>
+              <w:jc w:val="center"/>
+              <w:rPr>
+                <w:rFonts w:ascii="arial" w:hAnsi="arial" w:eastAsia="arial"/>
+                <w:color w:val="000000"/>
+                <w:sz w:val="16"/>
+                <w:szCs w:val="16"/>
+              </w:rPr>
+            </w:pPr>
+            <w:r>
+              <w:rPr>
+                <w:rFonts w:eastAsia="arial" w:ascii="arial" w:hAnsi="arial"/>
+                <w:color w:val="000000"/>
+                <w:sz w:val="16"/>
+                <w:szCs w:val="16"/>
+              </w:rPr>
+              <w:t>Master Light Dw.</w:t>
+            </w:r>
+          </w:p>
+        </w:tc>
+        <w:tc>
+          <w:tcPr>
+            <w:tcW w:w="1020" w:type="dxa"/>
+            <w:tcBorders>
+              <w:top w:val="single" w:sz="4" w:space="0" w:color="000000"/>
+              <w:left w:val="single" w:sz="4" w:space="0" w:color="000000"/>
+              <w:bottom w:val="single" w:sz="4" w:space="0" w:color="000000"/>
+            </w:tcBorders>
+            <w:vAlign w:val="bottom"/>
+          </w:tcPr>
+          <w:p>
+            <w:pPr>
+              <w:pStyle w:val="Normal"/>
+              <w:widowControl w:val="false"/>
+              <w:jc w:val="center"/>
+              <w:rPr>
+                <w:rFonts w:ascii="arial" w:hAnsi="arial" w:eastAsia="arial"/>
+                <w:color w:val="000000"/>
+                <w:sz w:val="16"/>
+                <w:szCs w:val="16"/>
+              </w:rPr>
+            </w:pPr>
+            <w:r>
+              <w:rPr>
+                <w:rFonts w:eastAsia="arial" w:ascii="arial" w:hAnsi="arial"/>
+                <w:color w:val="000000"/>
+                <w:sz w:val="16"/>
+                <w:szCs w:val="16"/>
+              </w:rPr>
+              <w:t>Signal Light TL</w:t>
+            </w:r>
+          </w:p>
+        </w:tc>
+        <w:tc>
+          <w:tcPr>
+            <w:tcW w:w="1016" w:type="dxa"/>
+            <w:tcBorders>
+              <w:top w:val="single" w:sz="4" w:space="0" w:color="000000"/>
+              <w:left w:val="single" w:sz="4" w:space="0" w:color="000000"/>
+              <w:bottom w:val="single" w:sz="4" w:space="0" w:color="000000"/>
+            </w:tcBorders>
+            <w:vAlign w:val="bottom"/>
+          </w:tcPr>
+          <w:p>
+            <w:pPr>
+              <w:pStyle w:val="Normal"/>
+              <w:widowControl w:val="false"/>
+              <w:jc w:val="center"/>
+              <w:rPr>
+                <w:color w:val="000000"/>
+                <w:sz w:val="16"/>
+                <w:szCs w:val="16"/>
+              </w:rPr>
+            </w:pPr>
+            <w:r>
+              <w:rPr>
+                <w:rFonts w:eastAsia="arial" w:ascii="arial" w:hAnsi="arial"/>
+                <w:color w:val="000000"/>
+                <w:sz w:val="16"/>
+                <w:szCs w:val="16"/>
+              </w:rPr>
+              <w:t>Cab Light</w:t>
+            </w:r>
+          </w:p>
+          <w:p>
+            <w:pPr>
+              <w:pStyle w:val="Normal"/>
+              <w:widowControl w:val="false"/>
+              <w:spacing w:lineRule="auto" w:line="180"/>
+              <w:jc w:val="center"/>
+              <w:rPr>
+                <w:color w:val="000000"/>
+                <w:sz w:val="16"/>
+                <w:szCs w:val="16"/>
+              </w:rPr>
+            </w:pPr>
+            <w:r>
+              <w:rPr>
+                <w:rFonts w:eastAsia="arial" w:ascii="arial" w:hAnsi="arial"/>
+                <w:color w:val="000000"/>
+                <w:sz w:val="16"/>
+                <w:szCs w:val="16"/>
+              </w:rPr>
+              <w:t>Cab</w:t>
+            </w:r>
+          </w:p>
+        </w:tc>
+        <w:tc>
+          <w:tcPr>
+            <w:tcW w:w="1016" w:type="dxa"/>
+            <w:tcBorders>
+              <w:top w:val="single" w:sz="4" w:space="0" w:color="000000"/>
+              <w:left w:val="single" w:sz="4" w:space="0" w:color="000000"/>
+              <w:bottom w:val="single" w:sz="4" w:space="0" w:color="000000"/>
+            </w:tcBorders>
+            <w:vAlign w:val="bottom"/>
+          </w:tcPr>
+          <w:p>
+            <w:pPr>
+              <w:pStyle w:val="Normal"/>
+              <w:widowControl w:val="false"/>
+              <w:spacing w:lineRule="auto" w:line="180"/>
+              <w:jc w:val="center"/>
+              <w:rPr>
+                <w:color w:val="000000"/>
+                <w:sz w:val="16"/>
+                <w:szCs w:val="16"/>
+              </w:rPr>
+            </w:pPr>
+            <w:r>
+              <w:rPr>
+                <w:rFonts w:eastAsia="arial" w:ascii="arial" w:hAnsi="arial"/>
+                <w:color w:val="000000"/>
+                <w:sz w:val="16"/>
+                <w:szCs w:val="16"/>
+              </w:rPr>
+              <w:t>Compressor Off</w:t>
+            </w:r>
+          </w:p>
+        </w:tc>
+        <w:tc>
+          <w:tcPr>
+            <w:tcW w:w="1016" w:type="dxa"/>
+            <w:tcBorders>
+              <w:top w:val="single" w:sz="4" w:space="0" w:color="000000"/>
+              <w:left w:val="single" w:sz="4" w:space="0" w:color="000000"/>
+              <w:bottom w:val="single" w:sz="4" w:space="0" w:color="000000"/>
+            </w:tcBorders>
+            <w:vAlign w:val="bottom"/>
+          </w:tcPr>
+          <w:p>
+            <w:pPr>
+              <w:pStyle w:val="Normal"/>
+              <w:widowControl w:val="false"/>
+              <w:spacing w:lineRule="auto" w:line="180"/>
+              <w:jc w:val="center"/>
+              <w:rPr>
+                <w:color w:val="000000"/>
+                <w:sz w:val="16"/>
+                <w:szCs w:val="16"/>
+              </w:rPr>
+            </w:pPr>
+            <w:r>
+              <w:rPr>
+                <w:rFonts w:eastAsia="arial" w:ascii="arial" w:hAnsi="arial"/>
+                <w:color w:val="000000"/>
+                <w:sz w:val="16"/>
+                <w:szCs w:val="16"/>
+              </w:rPr>
+              <w:t>Exterior</w:t>
+            </w:r>
+          </w:p>
+          <w:p>
+            <w:pPr>
+              <w:pStyle w:val="Normal"/>
+              <w:widowControl w:val="false"/>
+              <w:spacing w:lineRule="auto" w:line="180"/>
+              <w:jc w:val="center"/>
+              <w:rPr>
+                <w:color w:val="000000"/>
+                <w:sz w:val="16"/>
+                <w:szCs w:val="16"/>
+              </w:rPr>
+            </w:pPr>
+            <w:r>
+              <w:rPr>
+                <w:rFonts w:eastAsia="arial" w:ascii="arial" w:hAnsi="arial"/>
+                <w:color w:val="000000"/>
+                <w:sz w:val="16"/>
+                <w:szCs w:val="16"/>
+              </w:rPr>
+              <w:t>Camera</w:t>
+            </w:r>
+          </w:p>
+        </w:tc>
+        <w:tc>
+          <w:tcPr>
+            <w:tcW w:w="1029" w:type="dxa"/>
+            <w:tcBorders>
+              <w:top w:val="single" w:sz="4" w:space="0" w:color="000000"/>
+              <w:left w:val="single" w:sz="4" w:space="0" w:color="000000"/>
+              <w:bottom w:val="single" w:sz="4" w:space="0" w:color="000000"/>
+              <w:right w:val="single" w:sz="4" w:space="0" w:color="000000"/>
+            </w:tcBorders>
+            <w:vAlign w:val="bottom"/>
+          </w:tcPr>
+          <w:p>
+            <w:pPr>
+              <w:pStyle w:val="Normal"/>
+              <w:widowControl w:val="false"/>
+              <w:spacing w:lineRule="auto" w:line="180"/>
+              <w:jc w:val="center"/>
+              <w:rPr>
+                <w:color w:val="000000"/>
+                <w:sz w:val="16"/>
+                <w:szCs w:val="16"/>
+              </w:rPr>
+            </w:pPr>
+            <w:r>
+              <w:rPr>
+                <w:rFonts w:eastAsia="arial" w:ascii="arial" w:hAnsi="arial"/>
+                <w:color w:val="000000"/>
+                <w:sz w:val="16"/>
+                <w:szCs w:val="16"/>
+              </w:rPr>
+              <w:t>Prev</w:t>
+            </w:r>
+          </w:p>
+          <w:p>
+            <w:pPr>
+              <w:pStyle w:val="Normal"/>
+              <w:widowControl w:val="false"/>
+              <w:spacing w:lineRule="auto" w:line="180"/>
+              <w:jc w:val="center"/>
+              <w:rPr>
+                <w:color w:val="000000"/>
+                <w:sz w:val="16"/>
+                <w:szCs w:val="16"/>
+              </w:rPr>
+            </w:pPr>
+            <w:r>
+              <w:rPr>
+                <w:rFonts w:eastAsia="arial" w:ascii="arial" w:hAnsi="arial"/>
+                <w:color w:val="000000"/>
+                <w:sz w:val="16"/>
+                <w:szCs w:val="16"/>
+              </w:rPr>
+              <w:t>Cab Cam</w:t>
+            </w:r>
+          </w:p>
+        </w:tc>
+      </w:tr>
+    </w:tbl>
+    <w:p>
+      <w:pPr>
+        <w:pStyle w:val="Normal"/>
+        <w:bidi w:val="0"/>
+        <w:rPr>
+          <w:color w:val="000000"/>
+          <w:sz w:val="16"/>
+          <w:szCs w:val="16"/>
+        </w:rPr>
+      </w:pPr>
+      <w:r>
+        <w:rPr>
+          <w:color w:val="000000"/>
+          <w:sz w:val="16"/>
+          <w:szCs w:val="16"/>
+        </w:rPr>
+      </w:r>
+    </w:p>
+    <w:p>
+      <w:pPr>
+        <w:pStyle w:val="Normal"/>
+        <w:rPr>
+          <w:color w:val="000000"/>
+          <w:sz w:val="16"/>
+          <w:szCs w:val="16"/>
+        </w:rPr>
+      </w:pPr>
+      <w:r>
+        <w:rPr>
+          <w:color w:val="000000"/>
+          <w:sz w:val="16"/>
+          <w:szCs w:val="16"/>
+        </w:rPr>
+        <w:tab/>
+        <w:t xml:space="preserve">       </w:t>
       </w:r>
       <w:r>
         <w:rPr>
@@ -23552,7 +24138,3083 @@
           <w:sz w:val="16"/>
           <w:szCs w:val="16"/>
         </w:rPr>
-        <w:t>DoppelStock</w:t>
+        <w:t xml:space="preserve">    DB BR 463 Electric-1</w:t>
+      </w:r>
+    </w:p>
+    <w:tbl>
+      <w:tblPr>
+        <w:tblW w:w="14248" w:type="dxa"/>
+        <w:jc w:val="left"/>
+        <w:tblInd w:w="-5" w:type="dxa"/>
+        <w:tblLayout w:type="fixed"/>
+        <w:tblCellMar>
+          <w:top w:w="0" w:type="dxa"/>
+          <w:left w:w="108" w:type="dxa"/>
+          <w:bottom w:w="0" w:type="dxa"/>
+          <w:right w:w="108" w:type="dxa"/>
+        </w:tblCellMar>
+        <w:tblLook w:firstRow="1" w:noVBand="1" w:lastRow="0" w:firstColumn="1" w:lastColumn="0" w:noHBand="0" w:val="04a0"/>
+      </w:tblPr>
+      <w:tblGrid>
+        <w:gridCol w:w="1017"/>
+        <w:gridCol w:w="1019"/>
+        <w:gridCol w:w="1014"/>
+        <w:gridCol w:w="1016"/>
+        <w:gridCol w:w="1020"/>
+        <w:gridCol w:w="1016"/>
+        <w:gridCol w:w="1016"/>
+        <w:gridCol w:w="1017"/>
+        <w:gridCol w:w="1016"/>
+        <w:gridCol w:w="1020"/>
+        <w:gridCol w:w="1016"/>
+        <w:gridCol w:w="1016"/>
+        <w:gridCol w:w="1016"/>
+        <w:gridCol w:w="1029"/>
+      </w:tblGrid>
+      <w:tr>
+        <w:trPr>
+          <w:trHeight w:val="440" w:hRule="exact"/>
+          <w:cantSplit w:val="true"/>
+        </w:trPr>
+        <w:tc>
+          <w:tcPr>
+            <w:tcW w:w="1017" w:type="dxa"/>
+            <w:tcBorders>
+              <w:top w:val="single" w:sz="4" w:space="0" w:color="000000"/>
+              <w:left w:val="single" w:sz="4" w:space="0" w:color="000000"/>
+              <w:bottom w:val="single" w:sz="4" w:space="0" w:color="000000"/>
+            </w:tcBorders>
+            <w:vAlign w:val="bottom"/>
+          </w:tcPr>
+          <w:p>
+            <w:pPr>
+              <w:pStyle w:val="Normal"/>
+              <w:widowControl w:val="false"/>
+              <w:spacing w:lineRule="auto" w:line="180" w:before="0" w:after="60"/>
+              <w:jc w:val="center"/>
+              <w:rPr>
+                <w:color w:val="000000"/>
+                <w:sz w:val="16"/>
+                <w:szCs w:val="16"/>
+              </w:rPr>
+            </w:pPr>
+            <w:r>
+              <w:rPr>
+                <w:rFonts w:eastAsia="arial" w:ascii="arial" w:hAnsi="arial"/>
+                <w:b/>
+                <w:color w:val="000000"/>
+                <w:sz w:val="16"/>
+                <w:szCs w:val="16"/>
+              </w:rPr>
+              <w:t>Pause</w:t>
+            </w:r>
+          </w:p>
+        </w:tc>
+        <w:tc>
+          <w:tcPr>
+            <w:tcW w:w="1019" w:type="dxa"/>
+            <w:tcBorders>
+              <w:top w:val="single" w:sz="4" w:space="0" w:color="000000"/>
+              <w:left w:val="single" w:sz="4" w:space="0" w:color="000000"/>
+              <w:bottom w:val="single" w:sz="4" w:space="0" w:color="000000"/>
+            </w:tcBorders>
+            <w:vAlign w:val="bottom"/>
+          </w:tcPr>
+          <w:p>
+            <w:pPr>
+              <w:pStyle w:val="Normal"/>
+              <w:widowControl w:val="false"/>
+              <w:spacing w:lineRule="auto" w:line="180"/>
+              <w:jc w:val="center"/>
+              <w:rPr>
+                <w:color w:val="000000"/>
+                <w:sz w:val="16"/>
+                <w:szCs w:val="16"/>
+              </w:rPr>
+            </w:pPr>
+            <w:r>
+              <w:rPr>
+                <w:rFonts w:eastAsia="arial" w:ascii="arial" w:hAnsi="arial"/>
+                <w:color w:val="000000"/>
+                <w:sz w:val="16"/>
+                <w:szCs w:val="16"/>
+              </w:rPr>
+              <w:t>Reverser</w:t>
+            </w:r>
+          </w:p>
+          <w:p>
+            <w:pPr>
+              <w:pStyle w:val="Normal"/>
+              <w:widowControl w:val="false"/>
+              <w:spacing w:lineRule="auto" w:line="180"/>
+              <w:jc w:val="center"/>
+              <w:rPr>
+                <w:color w:val="000000"/>
+                <w:sz w:val="16"/>
+                <w:szCs w:val="16"/>
+              </w:rPr>
+            </w:pPr>
+            <w:r>
+              <w:rPr>
+                <w:rFonts w:eastAsia="arial" w:ascii="arial" w:hAnsi="arial"/>
+                <w:color w:val="000000"/>
+                <w:sz w:val="16"/>
+                <w:szCs w:val="16"/>
+              </w:rPr>
+              <w:t>Handle</w:t>
+            </w:r>
+          </w:p>
+        </w:tc>
+        <w:tc>
+          <w:tcPr>
+            <w:tcW w:w="1014" w:type="dxa"/>
+            <w:tcBorders>
+              <w:top w:val="single" w:sz="4" w:space="0" w:color="000000"/>
+              <w:left w:val="single" w:sz="4" w:space="0" w:color="000000"/>
+              <w:bottom w:val="single" w:sz="4" w:space="0" w:color="000000"/>
+            </w:tcBorders>
+            <w:vAlign w:val="bottom"/>
+          </w:tcPr>
+          <w:p>
+            <w:pPr>
+              <w:pStyle w:val="Normal"/>
+              <w:widowControl w:val="false"/>
+              <w:spacing w:lineRule="auto" w:line="180"/>
+              <w:jc w:val="center"/>
+              <w:rPr>
+                <w:color w:val="000000"/>
+                <w:sz w:val="16"/>
+                <w:szCs w:val="16"/>
+              </w:rPr>
+            </w:pPr>
+            <w:r>
+              <w:rPr>
+                <w:color w:val="000000"/>
+                <w:sz w:val="16"/>
+                <w:szCs w:val="16"/>
+              </w:rPr>
+              <w:t>MCB Close</w:t>
+            </w:r>
+          </w:p>
+        </w:tc>
+        <w:tc>
+          <w:tcPr>
+            <w:tcW w:w="1016" w:type="dxa"/>
+            <w:tcBorders>
+              <w:top w:val="single" w:sz="4" w:space="0" w:color="000000"/>
+              <w:left w:val="single" w:sz="4" w:space="0" w:color="000000"/>
+              <w:bottom w:val="single" w:sz="4" w:space="0" w:color="000000"/>
+            </w:tcBorders>
+            <w:vAlign w:val="bottom"/>
+          </w:tcPr>
+          <w:p>
+            <w:pPr>
+              <w:pStyle w:val="Normal"/>
+              <w:widowControl w:val="false"/>
+              <w:spacing w:lineRule="auto" w:line="180"/>
+              <w:jc w:val="center"/>
+              <w:rPr>
+                <w:sz w:val="16"/>
+                <w:szCs w:val="16"/>
+              </w:rPr>
+            </w:pPr>
+            <w:r>
+              <w:rPr>
+                <w:rFonts w:eastAsia="arial" w:ascii="arial" w:hAnsi="arial"/>
+                <w:color w:val="000000"/>
+                <w:sz w:val="16"/>
+                <w:szCs w:val="16"/>
+              </w:rPr>
+              <w:t>PZB/LZB</w:t>
+            </w:r>
+          </w:p>
+        </w:tc>
+        <w:tc>
+          <w:tcPr>
+            <w:tcW w:w="1020" w:type="dxa"/>
+            <w:tcBorders>
+              <w:top w:val="single" w:sz="4" w:space="0" w:color="000000"/>
+              <w:left w:val="single" w:sz="4" w:space="0" w:color="000000"/>
+              <w:bottom w:val="single" w:sz="4" w:space="0" w:color="000000"/>
+            </w:tcBorders>
+            <w:vAlign w:val="bottom"/>
+          </w:tcPr>
+          <w:p>
+            <w:pPr>
+              <w:pStyle w:val="Normal"/>
+              <w:widowControl w:val="false"/>
+              <w:spacing w:lineRule="auto" w:line="180"/>
+              <w:jc w:val="center"/>
+              <w:rPr>
+                <w:color w:val="000000"/>
+                <w:sz w:val="16"/>
+                <w:szCs w:val="16"/>
+              </w:rPr>
+            </w:pPr>
+            <w:r>
+              <w:rPr>
+                <w:rFonts w:eastAsia="arial" w:ascii="arial" w:hAnsi="arial"/>
+                <w:color w:val="000000"/>
+                <w:sz w:val="16"/>
+                <w:szCs w:val="16"/>
+              </w:rPr>
+              <w:t>Panto. Raise</w:t>
+            </w:r>
+          </w:p>
+        </w:tc>
+        <w:tc>
+          <w:tcPr>
+            <w:tcW w:w="1016" w:type="dxa"/>
+            <w:tcBorders>
+              <w:top w:val="single" w:sz="4" w:space="0" w:color="000000"/>
+              <w:left w:val="single" w:sz="4" w:space="0" w:color="000000"/>
+              <w:bottom w:val="single" w:sz="4" w:space="0" w:color="000000"/>
+            </w:tcBorders>
+            <w:vAlign w:val="bottom"/>
+          </w:tcPr>
+          <w:p>
+            <w:pPr>
+              <w:pStyle w:val="Normal"/>
+              <w:widowControl w:val="false"/>
+              <w:jc w:val="center"/>
+              <w:rPr>
+                <w:color w:val="000000"/>
+                <w:sz w:val="16"/>
+                <w:szCs w:val="16"/>
+              </w:rPr>
+            </w:pPr>
+            <w:r>
+              <w:rPr>
+                <w:color w:val="000000"/>
+                <w:sz w:val="16"/>
+                <w:szCs w:val="16"/>
+              </w:rPr>
+              <w:t>Train Supply On</w:t>
+            </w:r>
+          </w:p>
+        </w:tc>
+        <w:tc>
+          <w:tcPr>
+            <w:tcW w:w="1016" w:type="dxa"/>
+            <w:tcBorders>
+              <w:top w:val="single" w:sz="4" w:space="0" w:color="000000"/>
+              <w:left w:val="single" w:sz="4" w:space="0" w:color="000000"/>
+              <w:bottom w:val="single" w:sz="4" w:space="0" w:color="000000"/>
+            </w:tcBorders>
+            <w:vAlign w:val="bottom"/>
+          </w:tcPr>
+          <w:p>
+            <w:pPr>
+              <w:pStyle w:val="Normal"/>
+              <w:widowControl w:val="false"/>
+              <w:jc w:val="center"/>
+              <w:rPr>
+                <w:sz w:val="16"/>
+                <w:szCs w:val="16"/>
+              </w:rPr>
+            </w:pPr>
+            <w:r>
+              <w:rPr>
+                <w:rFonts w:eastAsia="arial" w:ascii="arial" w:hAnsi="arial"/>
+                <w:color w:val="000000"/>
+                <w:sz w:val="16"/>
+                <w:szCs w:val="16"/>
+              </w:rPr>
+              <w:t>Train Light On</w:t>
+            </w:r>
+          </w:p>
+        </w:tc>
+        <w:tc>
+          <w:tcPr>
+            <w:tcW w:w="1017" w:type="dxa"/>
+            <w:tcBorders>
+              <w:top w:val="single" w:sz="4" w:space="0" w:color="000000"/>
+              <w:left w:val="single" w:sz="4" w:space="0" w:color="000000"/>
+              <w:bottom w:val="single" w:sz="4" w:space="0" w:color="000000"/>
+            </w:tcBorders>
+            <w:vAlign w:val="bottom"/>
+          </w:tcPr>
+          <w:p>
+            <w:pPr>
+              <w:pStyle w:val="Normal"/>
+              <w:widowControl w:val="false"/>
+              <w:jc w:val="center"/>
+              <w:rPr>
+                <w:rFonts w:ascii="arial" w:hAnsi="arial" w:eastAsia="arial"/>
+                <w:color w:val="000000"/>
+                <w:sz w:val="16"/>
+                <w:szCs w:val="16"/>
+              </w:rPr>
+            </w:pPr>
+            <w:r>
+              <w:rPr>
+                <w:rFonts w:eastAsia="arial" w:ascii="arial" w:hAnsi="arial"/>
+                <w:color w:val="000000"/>
+                <w:sz w:val="16"/>
+                <w:szCs w:val="16"/>
+              </w:rPr>
+              <w:t>Brake Key On</w:t>
+            </w:r>
+          </w:p>
+        </w:tc>
+        <w:tc>
+          <w:tcPr>
+            <w:tcW w:w="1016" w:type="dxa"/>
+            <w:tcBorders>
+              <w:top w:val="single" w:sz="4" w:space="0" w:color="000000"/>
+              <w:left w:val="single" w:sz="4" w:space="0" w:color="000000"/>
+              <w:bottom w:val="single" w:sz="4" w:space="0" w:color="000000"/>
+            </w:tcBorders>
+            <w:vAlign w:val="bottom"/>
+          </w:tcPr>
+          <w:p>
+            <w:pPr>
+              <w:pStyle w:val="Normal"/>
+              <w:widowControl w:val="false"/>
+              <w:jc w:val="center"/>
+              <w:rPr>
+                <w:rFonts w:ascii="arial" w:hAnsi="arial" w:eastAsia="arial"/>
+                <w:color w:val="000000"/>
+                <w:sz w:val="16"/>
+                <w:szCs w:val="16"/>
+              </w:rPr>
+            </w:pPr>
+            <w:r>
+              <w:rPr>
+                <w:rFonts w:eastAsia="arial" w:ascii="arial" w:hAnsi="arial"/>
+                <w:color w:val="000000"/>
+                <w:sz w:val="16"/>
+                <w:szCs w:val="16"/>
+              </w:rPr>
+              <w:t>Gauge Light</w:t>
+            </w:r>
+          </w:p>
+        </w:tc>
+        <w:tc>
+          <w:tcPr>
+            <w:tcW w:w="1020" w:type="dxa"/>
+            <w:tcBorders>
+              <w:top w:val="single" w:sz="4" w:space="0" w:color="000000"/>
+              <w:left w:val="single" w:sz="4" w:space="0" w:color="000000"/>
+              <w:bottom w:val="single" w:sz="4" w:space="0" w:color="000000"/>
+            </w:tcBorders>
+            <w:vAlign w:val="bottom"/>
+          </w:tcPr>
+          <w:p>
+            <w:pPr>
+              <w:pStyle w:val="Normal"/>
+              <w:widowControl w:val="false"/>
+              <w:jc w:val="center"/>
+              <w:rPr>
+                <w:rFonts w:ascii="arial" w:hAnsi="arial" w:eastAsia="arial"/>
+                <w:color w:val="000000"/>
+                <w:sz w:val="16"/>
+                <w:szCs w:val="16"/>
+              </w:rPr>
+            </w:pPr>
+            <w:r>
+              <w:rPr>
+                <w:rFonts w:eastAsia="arial" w:ascii="arial" w:hAnsi="arial"/>
+                <w:color w:val="000000"/>
+                <w:sz w:val="16"/>
+                <w:szCs w:val="16"/>
+              </w:rPr>
+              <w:t>Signal Light HL</w:t>
+            </w:r>
+          </w:p>
+        </w:tc>
+        <w:tc>
+          <w:tcPr>
+            <w:tcW w:w="1016" w:type="dxa"/>
+            <w:tcBorders>
+              <w:top w:val="single" w:sz="4" w:space="0" w:color="000000"/>
+              <w:left w:val="single" w:sz="4" w:space="0" w:color="000000"/>
+              <w:bottom w:val="single" w:sz="4" w:space="0" w:color="000000"/>
+            </w:tcBorders>
+            <w:vAlign w:val="bottom"/>
+          </w:tcPr>
+          <w:p>
+            <w:pPr>
+              <w:pStyle w:val="Normal"/>
+              <w:widowControl w:val="false"/>
+              <w:spacing w:lineRule="auto" w:line="180"/>
+              <w:jc w:val="center"/>
+              <w:rPr>
+                <w:color w:val="000000"/>
+                <w:sz w:val="16"/>
+                <w:szCs w:val="16"/>
+              </w:rPr>
+            </w:pPr>
+            <w:r>
+              <w:rPr>
+                <w:rFonts w:eastAsia="arial" w:ascii="arial" w:hAnsi="arial"/>
+                <w:color w:val="000000"/>
+                <w:sz w:val="16"/>
+                <w:szCs w:val="16"/>
+              </w:rPr>
+              <w:t>Cab Light</w:t>
+            </w:r>
+          </w:p>
+        </w:tc>
+        <w:tc>
+          <w:tcPr>
+            <w:tcW w:w="1016" w:type="dxa"/>
+            <w:tcBorders>
+              <w:top w:val="single" w:sz="4" w:space="0" w:color="000000"/>
+              <w:left w:val="single" w:sz="4" w:space="0" w:color="000000"/>
+              <w:bottom w:val="single" w:sz="4" w:space="0" w:color="000000"/>
+            </w:tcBorders>
+            <w:vAlign w:val="bottom"/>
+          </w:tcPr>
+          <w:p>
+            <w:pPr>
+              <w:pStyle w:val="Normal"/>
+              <w:widowControl w:val="false"/>
+              <w:spacing w:lineRule="auto" w:line="180"/>
+              <w:jc w:val="center"/>
+              <w:rPr>
+                <w:color w:val="000000"/>
+                <w:sz w:val="16"/>
+                <w:szCs w:val="16"/>
+              </w:rPr>
+            </w:pPr>
+            <w:r>
+              <w:rPr>
+                <w:rFonts w:eastAsia="arial" w:ascii="arial" w:hAnsi="arial"/>
+                <w:color w:val="000000"/>
+                <w:sz w:val="16"/>
+                <w:szCs w:val="16"/>
+              </w:rPr>
+              <w:t>Emer.</w:t>
+            </w:r>
+          </w:p>
+          <w:p>
+            <w:pPr>
+              <w:pStyle w:val="Normal"/>
+              <w:widowControl w:val="false"/>
+              <w:spacing w:lineRule="auto" w:line="180"/>
+              <w:jc w:val="center"/>
+              <w:rPr>
+                <w:color w:val="000000"/>
+                <w:sz w:val="16"/>
+                <w:szCs w:val="16"/>
+              </w:rPr>
+            </w:pPr>
+            <w:r>
+              <w:rPr>
+                <w:rFonts w:eastAsia="arial" w:ascii="arial" w:hAnsi="arial"/>
+                <w:color w:val="000000"/>
+                <w:sz w:val="16"/>
+                <w:szCs w:val="16"/>
+              </w:rPr>
+              <w:t>Brake</w:t>
+            </w:r>
+          </w:p>
+        </w:tc>
+        <w:tc>
+          <w:tcPr>
+            <w:tcW w:w="1016" w:type="dxa"/>
+            <w:tcBorders>
+              <w:top w:val="single" w:sz="4" w:space="0" w:color="000000"/>
+              <w:left w:val="single" w:sz="4" w:space="0" w:color="000000"/>
+              <w:bottom w:val="single" w:sz="4" w:space="0" w:color="000000"/>
+            </w:tcBorders>
+            <w:vAlign w:val="bottom"/>
+          </w:tcPr>
+          <w:p>
+            <w:pPr>
+              <w:pStyle w:val="Normal"/>
+              <w:widowControl w:val="false"/>
+              <w:spacing w:lineRule="auto" w:line="180"/>
+              <w:jc w:val="center"/>
+              <w:rPr>
+                <w:color w:val="000000"/>
+                <w:sz w:val="16"/>
+                <w:szCs w:val="16"/>
+              </w:rPr>
+            </w:pPr>
+            <w:r>
+              <w:rPr>
+                <w:rFonts w:eastAsia="arial" w:ascii="arial" w:hAnsi="arial"/>
+                <w:color w:val="000000"/>
+                <w:sz w:val="16"/>
+                <w:szCs w:val="16"/>
+              </w:rPr>
+              <w:t>1P Cam</w:t>
+            </w:r>
+          </w:p>
+        </w:tc>
+        <w:tc>
+          <w:tcPr>
+            <w:tcW w:w="1029" w:type="dxa"/>
+            <w:tcBorders>
+              <w:top w:val="single" w:sz="4" w:space="0" w:color="000000"/>
+              <w:left w:val="single" w:sz="4" w:space="0" w:color="000000"/>
+              <w:bottom w:val="single" w:sz="4" w:space="0" w:color="000000"/>
+              <w:right w:val="single" w:sz="4" w:space="0" w:color="000000"/>
+            </w:tcBorders>
+            <w:vAlign w:val="bottom"/>
+          </w:tcPr>
+          <w:p>
+            <w:pPr>
+              <w:pStyle w:val="Normal"/>
+              <w:widowControl w:val="false"/>
+              <w:spacing w:lineRule="auto" w:line="180"/>
+              <w:jc w:val="center"/>
+              <w:rPr>
+                <w:color w:val="000000"/>
+                <w:sz w:val="16"/>
+                <w:szCs w:val="16"/>
+              </w:rPr>
+            </w:pPr>
+            <w:r>
+              <w:rPr>
+                <w:rFonts w:eastAsia="arial" w:ascii="arial" w:hAnsi="arial"/>
+                <w:color w:val="000000"/>
+                <w:sz w:val="16"/>
+                <w:szCs w:val="16"/>
+              </w:rPr>
+              <w:t>Next</w:t>
+            </w:r>
+          </w:p>
+          <w:p>
+            <w:pPr>
+              <w:pStyle w:val="Normal"/>
+              <w:widowControl w:val="false"/>
+              <w:spacing w:lineRule="auto" w:line="180"/>
+              <w:jc w:val="center"/>
+              <w:rPr>
+                <w:color w:val="000000"/>
+                <w:sz w:val="16"/>
+                <w:szCs w:val="16"/>
+              </w:rPr>
+            </w:pPr>
+            <w:r>
+              <w:rPr>
+                <w:rFonts w:eastAsia="arial" w:ascii="arial" w:hAnsi="arial"/>
+                <w:color w:val="000000"/>
+                <w:sz w:val="16"/>
+                <w:szCs w:val="16"/>
+              </w:rPr>
+              <w:t>Cab Cam</w:t>
+            </w:r>
+          </w:p>
+        </w:tc>
+      </w:tr>
+    </w:tbl>
+    <w:p>
+      <w:pPr>
+        <w:pStyle w:val="Normal"/>
+        <w:rPr>
+          <w:rFonts w:ascii="arial" w:hAnsi="arial" w:eastAsia="arial"/>
+          <w:color w:val="000000"/>
+          <w:sz w:val="16"/>
+          <w:szCs w:val="16"/>
+        </w:rPr>
+      </w:pPr>
+      <w:r>
+        <w:rPr>
+          <w:rFonts w:eastAsia="arial" w:ascii="arial" w:hAnsi="arial"/>
+          <w:color w:val="000000"/>
+          <w:sz w:val="16"/>
+          <w:szCs w:val="16"/>
+        </w:rPr>
+      </w:r>
+    </w:p>
+    <w:p>
+      <w:pPr>
+        <w:pStyle w:val="Normal"/>
+        <w:rPr>
+          <w:color w:val="000000"/>
+          <w:sz w:val="16"/>
+          <w:szCs w:val="16"/>
+        </w:rPr>
+      </w:pPr>
+      <w:r>
+        <w:rPr>
+          <w:rFonts w:eastAsia="arial" w:ascii="arial" w:hAnsi="arial"/>
+          <w:color w:val="000000"/>
+          <w:sz w:val="16"/>
+          <w:szCs w:val="16"/>
+        </w:rPr>
+        <w:tab/>
+        <w:t xml:space="preserve">           DB BR 463 Electric-2</w:t>
+      </w:r>
+    </w:p>
+    <w:tbl>
+      <w:tblPr>
+        <w:tblW w:w="14248" w:type="dxa"/>
+        <w:jc w:val="left"/>
+        <w:tblInd w:w="-5" w:type="dxa"/>
+        <w:tblLayout w:type="fixed"/>
+        <w:tblCellMar>
+          <w:top w:w="0" w:type="dxa"/>
+          <w:left w:w="108" w:type="dxa"/>
+          <w:bottom w:w="0" w:type="dxa"/>
+          <w:right w:w="108" w:type="dxa"/>
+        </w:tblCellMar>
+        <w:tblLook w:firstRow="1" w:noVBand="1" w:lastRow="0" w:firstColumn="1" w:lastColumn="0" w:noHBand="0" w:val="04a0"/>
+      </w:tblPr>
+      <w:tblGrid>
+        <w:gridCol w:w="1017"/>
+        <w:gridCol w:w="1019"/>
+        <w:gridCol w:w="1014"/>
+        <w:gridCol w:w="1016"/>
+        <w:gridCol w:w="1020"/>
+        <w:gridCol w:w="1016"/>
+        <w:gridCol w:w="1016"/>
+        <w:gridCol w:w="1017"/>
+        <w:gridCol w:w="1016"/>
+        <w:gridCol w:w="1020"/>
+        <w:gridCol w:w="1016"/>
+        <w:gridCol w:w="1016"/>
+        <w:gridCol w:w="1016"/>
+        <w:gridCol w:w="1029"/>
+      </w:tblGrid>
+      <w:tr>
+        <w:trPr>
+          <w:trHeight w:val="440" w:hRule="exact"/>
+          <w:cantSplit w:val="true"/>
+        </w:trPr>
+        <w:tc>
+          <w:tcPr>
+            <w:tcW w:w="1017" w:type="dxa"/>
+            <w:tcBorders>
+              <w:top w:val="single" w:sz="4" w:space="0" w:color="000000"/>
+              <w:left w:val="single" w:sz="4" w:space="0" w:color="000000"/>
+              <w:bottom w:val="single" w:sz="4" w:space="0" w:color="000000"/>
+            </w:tcBorders>
+            <w:vAlign w:val="bottom"/>
+          </w:tcPr>
+          <w:p>
+            <w:pPr>
+              <w:pStyle w:val="Normal"/>
+              <w:widowControl w:val="false"/>
+              <w:spacing w:lineRule="auto" w:line="180" w:before="0" w:after="60"/>
+              <w:jc w:val="center"/>
+              <w:rPr>
+                <w:color w:val="000000"/>
+                <w:sz w:val="16"/>
+                <w:szCs w:val="16"/>
+              </w:rPr>
+            </w:pPr>
+            <w:r>
+              <w:rPr>
+                <w:rFonts w:eastAsia="arial" w:ascii="arial" w:hAnsi="arial"/>
+                <w:b/>
+                <w:color w:val="000000"/>
+                <w:sz w:val="16"/>
+                <w:szCs w:val="16"/>
+              </w:rPr>
+              <w:t>HUD</w:t>
+            </w:r>
+          </w:p>
+        </w:tc>
+        <w:tc>
+          <w:tcPr>
+            <w:tcW w:w="1019" w:type="dxa"/>
+            <w:tcBorders>
+              <w:top w:val="single" w:sz="4" w:space="0" w:color="000000"/>
+              <w:left w:val="single" w:sz="4" w:space="0" w:color="000000"/>
+              <w:bottom w:val="single" w:sz="4" w:space="0" w:color="000000"/>
+            </w:tcBorders>
+            <w:vAlign w:val="bottom"/>
+          </w:tcPr>
+          <w:p>
+            <w:pPr>
+              <w:pStyle w:val="Normal"/>
+              <w:widowControl w:val="false"/>
+              <w:spacing w:lineRule="auto" w:line="180"/>
+              <w:jc w:val="center"/>
+              <w:rPr>
+                <w:rFonts w:ascii="arial" w:hAnsi="arial" w:eastAsia="arial"/>
+                <w:color w:val="000000"/>
+                <w:sz w:val="16"/>
+                <w:szCs w:val="16"/>
+              </w:rPr>
+            </w:pPr>
+            <w:r>
+              <w:rPr>
+                <w:rFonts w:eastAsia="arial" w:ascii="arial" w:hAnsi="arial"/>
+                <w:color w:val="000000"/>
+                <w:sz w:val="16"/>
+                <w:szCs w:val="16"/>
+              </w:rPr>
+              <w:t>Schedule</w:t>
+            </w:r>
+          </w:p>
+        </w:tc>
+        <w:tc>
+          <w:tcPr>
+            <w:tcW w:w="1014" w:type="dxa"/>
+            <w:tcBorders>
+              <w:top w:val="single" w:sz="4" w:space="0" w:color="000000"/>
+              <w:left w:val="single" w:sz="4" w:space="0" w:color="000000"/>
+              <w:bottom w:val="single" w:sz="4" w:space="0" w:color="000000"/>
+            </w:tcBorders>
+            <w:vAlign w:val="bottom"/>
+          </w:tcPr>
+          <w:p>
+            <w:pPr>
+              <w:pStyle w:val="Normal"/>
+              <w:widowControl w:val="false"/>
+              <w:spacing w:lineRule="auto" w:line="180"/>
+              <w:jc w:val="center"/>
+              <w:rPr>
+                <w:color w:val="000000"/>
+                <w:sz w:val="16"/>
+                <w:szCs w:val="16"/>
+              </w:rPr>
+            </w:pPr>
+            <w:r>
+              <w:rPr>
+                <w:rFonts w:eastAsia="arial" w:ascii="arial" w:hAnsi="arial"/>
+                <w:color w:val="000000"/>
+                <w:sz w:val="16"/>
+                <w:szCs w:val="16"/>
+              </w:rPr>
+              <w:t>MCB Open</w:t>
+            </w:r>
+          </w:p>
+        </w:tc>
+        <w:tc>
+          <w:tcPr>
+            <w:tcW w:w="1016" w:type="dxa"/>
+            <w:tcBorders>
+              <w:top w:val="single" w:sz="4" w:space="0" w:color="000000"/>
+              <w:left w:val="single" w:sz="4" w:space="0" w:color="000000"/>
+              <w:bottom w:val="single" w:sz="4" w:space="0" w:color="000000"/>
+            </w:tcBorders>
+            <w:vAlign w:val="bottom"/>
+          </w:tcPr>
+          <w:p>
+            <w:pPr>
+              <w:pStyle w:val="Normal"/>
+              <w:widowControl w:val="false"/>
+              <w:spacing w:lineRule="auto" w:line="180"/>
+              <w:jc w:val="center"/>
+              <w:rPr>
+                <w:sz w:val="16"/>
+                <w:szCs w:val="16"/>
+              </w:rPr>
+            </w:pPr>
+            <w:r>
+              <w:rPr>
+                <w:sz w:val="16"/>
+                <w:szCs w:val="16"/>
+              </w:rPr>
+              <w:t>Sifa</w:t>
+            </w:r>
+          </w:p>
+        </w:tc>
+        <w:tc>
+          <w:tcPr>
+            <w:tcW w:w="1020" w:type="dxa"/>
+            <w:tcBorders>
+              <w:top w:val="single" w:sz="4" w:space="0" w:color="000000"/>
+              <w:left w:val="single" w:sz="4" w:space="0" w:color="000000"/>
+              <w:bottom w:val="single" w:sz="4" w:space="0" w:color="000000"/>
+            </w:tcBorders>
+            <w:vAlign w:val="bottom"/>
+          </w:tcPr>
+          <w:p>
+            <w:pPr>
+              <w:pStyle w:val="Normal"/>
+              <w:widowControl w:val="false"/>
+              <w:jc w:val="center"/>
+              <w:rPr>
+                <w:rFonts w:ascii="arial" w:hAnsi="arial" w:eastAsia="arial"/>
+                <w:color w:val="000000"/>
+                <w:sz w:val="16"/>
+                <w:szCs w:val="16"/>
+              </w:rPr>
+            </w:pPr>
+            <w:r>
+              <w:rPr>
+                <w:rFonts w:eastAsia="arial" w:ascii="arial" w:hAnsi="arial"/>
+                <w:color w:val="000000"/>
+                <w:sz w:val="16"/>
+                <w:szCs w:val="16"/>
+              </w:rPr>
+              <w:t>Panto.</w:t>
+            </w:r>
+          </w:p>
+          <w:p>
+            <w:pPr>
+              <w:pStyle w:val="Normal"/>
+              <w:widowControl w:val="false"/>
+              <w:jc w:val="center"/>
+              <w:rPr>
+                <w:rFonts w:ascii="arial" w:hAnsi="arial" w:eastAsia="arial"/>
+                <w:color w:val="000000"/>
+                <w:sz w:val="16"/>
+                <w:szCs w:val="16"/>
+              </w:rPr>
+            </w:pPr>
+            <w:r>
+              <w:rPr>
+                <w:rFonts w:eastAsia="arial" w:ascii="arial" w:hAnsi="arial"/>
+                <w:color w:val="000000"/>
+                <w:sz w:val="16"/>
+                <w:szCs w:val="16"/>
+              </w:rPr>
+              <w:t>Low</w:t>
+            </w:r>
+          </w:p>
+        </w:tc>
+        <w:tc>
+          <w:tcPr>
+            <w:tcW w:w="1016" w:type="dxa"/>
+            <w:tcBorders>
+              <w:top w:val="single" w:sz="4" w:space="0" w:color="000000"/>
+              <w:left w:val="single" w:sz="4" w:space="0" w:color="000000"/>
+              <w:bottom w:val="single" w:sz="4" w:space="0" w:color="000000"/>
+            </w:tcBorders>
+            <w:vAlign w:val="bottom"/>
+          </w:tcPr>
+          <w:p>
+            <w:pPr>
+              <w:pStyle w:val="Normal"/>
+              <w:widowControl w:val="false"/>
+              <w:spacing w:lineRule="auto" w:line="180"/>
+              <w:jc w:val="center"/>
+              <w:rPr>
+                <w:sz w:val="16"/>
+                <w:szCs w:val="16"/>
+              </w:rPr>
+            </w:pPr>
+            <w:r>
+              <w:rPr>
+                <w:rFonts w:eastAsia="arial" w:ascii="arial" w:hAnsi="arial"/>
+                <w:color w:val="000000"/>
+                <w:sz w:val="16"/>
+                <w:szCs w:val="16"/>
+              </w:rPr>
+              <w:t>Train Supply Off</w:t>
+            </w:r>
+          </w:p>
+        </w:tc>
+        <w:tc>
+          <w:tcPr>
+            <w:tcW w:w="1016" w:type="dxa"/>
+            <w:tcBorders>
+              <w:top w:val="single" w:sz="4" w:space="0" w:color="000000"/>
+              <w:left w:val="single" w:sz="4" w:space="0" w:color="000000"/>
+              <w:bottom w:val="single" w:sz="4" w:space="0" w:color="000000"/>
+            </w:tcBorders>
+            <w:vAlign w:val="bottom"/>
+          </w:tcPr>
+          <w:p>
+            <w:pPr>
+              <w:pStyle w:val="Normal"/>
+              <w:widowControl w:val="false"/>
+              <w:jc w:val="center"/>
+              <w:rPr>
+                <w:sz w:val="16"/>
+                <w:szCs w:val="16"/>
+              </w:rPr>
+            </w:pPr>
+            <w:r>
+              <w:rPr>
+                <w:rFonts w:eastAsia="arial" w:ascii="arial" w:hAnsi="arial"/>
+                <w:color w:val="000000"/>
+                <w:sz w:val="16"/>
+                <w:szCs w:val="16"/>
+              </w:rPr>
+              <w:t>Train Light Off</w:t>
+            </w:r>
+          </w:p>
+        </w:tc>
+        <w:tc>
+          <w:tcPr>
+            <w:tcW w:w="1017" w:type="dxa"/>
+            <w:tcBorders>
+              <w:top w:val="single" w:sz="4" w:space="0" w:color="000000"/>
+              <w:left w:val="single" w:sz="4" w:space="0" w:color="000000"/>
+              <w:bottom w:val="single" w:sz="4" w:space="0" w:color="000000"/>
+            </w:tcBorders>
+            <w:vAlign w:val="bottom"/>
+          </w:tcPr>
+          <w:p>
+            <w:pPr>
+              <w:pStyle w:val="Normal"/>
+              <w:widowControl w:val="false"/>
+              <w:jc w:val="center"/>
+              <w:rPr>
+                <w:rFonts w:ascii="arial" w:hAnsi="arial" w:eastAsia="arial"/>
+                <w:color w:val="000000"/>
+                <w:sz w:val="16"/>
+                <w:szCs w:val="16"/>
+              </w:rPr>
+            </w:pPr>
+            <w:r>
+              <w:rPr>
+                <w:rFonts w:eastAsia="arial" w:ascii="arial" w:hAnsi="arial"/>
+                <w:color w:val="000000"/>
+                <w:sz w:val="16"/>
+                <w:szCs w:val="16"/>
+              </w:rPr>
+              <w:t>Brake Key Off</w:t>
+            </w:r>
+          </w:p>
+        </w:tc>
+        <w:tc>
+          <w:tcPr>
+            <w:tcW w:w="1016" w:type="dxa"/>
+            <w:tcBorders>
+              <w:top w:val="single" w:sz="4" w:space="0" w:color="000000"/>
+              <w:left w:val="single" w:sz="4" w:space="0" w:color="000000"/>
+              <w:bottom w:val="single" w:sz="4" w:space="0" w:color="000000"/>
+            </w:tcBorders>
+            <w:vAlign w:val="bottom"/>
+          </w:tcPr>
+          <w:p>
+            <w:pPr>
+              <w:pStyle w:val="Normal"/>
+              <w:widowControl w:val="false"/>
+              <w:jc w:val="center"/>
+              <w:rPr>
+                <w:rFonts w:ascii="arial" w:hAnsi="arial" w:eastAsia="arial"/>
+                <w:color w:val="000000"/>
+                <w:sz w:val="16"/>
+                <w:szCs w:val="16"/>
+              </w:rPr>
+            </w:pPr>
+            <w:r>
+              <w:rPr>
+                <w:rFonts w:eastAsia="arial" w:ascii="arial" w:hAnsi="arial"/>
+                <w:color w:val="000000"/>
+                <w:sz w:val="16"/>
+                <w:szCs w:val="16"/>
+              </w:rPr>
+            </w:r>
+          </w:p>
+        </w:tc>
+        <w:tc>
+          <w:tcPr>
+            <w:tcW w:w="1020" w:type="dxa"/>
+            <w:tcBorders>
+              <w:top w:val="single" w:sz="4" w:space="0" w:color="000000"/>
+              <w:left w:val="single" w:sz="4" w:space="0" w:color="000000"/>
+              <w:bottom w:val="single" w:sz="4" w:space="0" w:color="000000"/>
+            </w:tcBorders>
+            <w:vAlign w:val="bottom"/>
+          </w:tcPr>
+          <w:p>
+            <w:pPr>
+              <w:pStyle w:val="Normal"/>
+              <w:widowControl w:val="false"/>
+              <w:jc w:val="center"/>
+              <w:rPr>
+                <w:rFonts w:ascii="arial" w:hAnsi="arial" w:eastAsia="arial"/>
+                <w:color w:val="000000"/>
+                <w:sz w:val="16"/>
+                <w:szCs w:val="16"/>
+              </w:rPr>
+            </w:pPr>
+            <w:r>
+              <w:rPr>
+                <w:rFonts w:eastAsia="arial" w:ascii="arial" w:hAnsi="arial"/>
+                <w:color w:val="000000"/>
+                <w:sz w:val="16"/>
+                <w:szCs w:val="16"/>
+              </w:rPr>
+              <w:t>Signal Light TL</w:t>
+            </w:r>
+          </w:p>
+        </w:tc>
+        <w:tc>
+          <w:tcPr>
+            <w:tcW w:w="1016" w:type="dxa"/>
+            <w:tcBorders>
+              <w:top w:val="single" w:sz="4" w:space="0" w:color="000000"/>
+              <w:left w:val="single" w:sz="4" w:space="0" w:color="000000"/>
+              <w:bottom w:val="single" w:sz="4" w:space="0" w:color="000000"/>
+            </w:tcBorders>
+            <w:vAlign w:val="bottom"/>
+          </w:tcPr>
+          <w:p>
+            <w:pPr>
+              <w:pStyle w:val="Normal"/>
+              <w:widowControl w:val="false"/>
+              <w:spacing w:lineRule="auto" w:line="180"/>
+              <w:jc w:val="center"/>
+              <w:rPr>
+                <w:color w:val="000000"/>
+                <w:sz w:val="16"/>
+                <w:szCs w:val="16"/>
+              </w:rPr>
+            </w:pPr>
+            <w:r>
+              <w:rPr>
+                <w:rFonts w:eastAsia="arial" w:ascii="arial" w:hAnsi="arial"/>
+                <w:color w:val="000000"/>
+                <w:sz w:val="16"/>
+                <w:szCs w:val="16"/>
+              </w:rPr>
+              <w:t>Desk Light</w:t>
+            </w:r>
+          </w:p>
+        </w:tc>
+        <w:tc>
+          <w:tcPr>
+            <w:tcW w:w="1016" w:type="dxa"/>
+            <w:tcBorders>
+              <w:top w:val="single" w:sz="4" w:space="0" w:color="000000"/>
+              <w:left w:val="single" w:sz="4" w:space="0" w:color="000000"/>
+              <w:bottom w:val="single" w:sz="4" w:space="0" w:color="000000"/>
+            </w:tcBorders>
+            <w:vAlign w:val="bottom"/>
+          </w:tcPr>
+          <w:p>
+            <w:pPr>
+              <w:pStyle w:val="Normal"/>
+              <w:widowControl w:val="false"/>
+              <w:spacing w:lineRule="auto" w:line="180"/>
+              <w:jc w:val="center"/>
+              <w:rPr>
+                <w:color w:val="000000"/>
+                <w:sz w:val="16"/>
+                <w:szCs w:val="16"/>
+              </w:rPr>
+            </w:pPr>
+            <w:r>
+              <w:rPr>
+                <w:color w:val="000000"/>
+                <w:sz w:val="16"/>
+                <w:szCs w:val="16"/>
+              </w:rPr>
+            </w:r>
+          </w:p>
+        </w:tc>
+        <w:tc>
+          <w:tcPr>
+            <w:tcW w:w="1016" w:type="dxa"/>
+            <w:tcBorders>
+              <w:top w:val="single" w:sz="4" w:space="0" w:color="000000"/>
+              <w:left w:val="single" w:sz="4" w:space="0" w:color="000000"/>
+              <w:bottom w:val="single" w:sz="4" w:space="0" w:color="000000"/>
+            </w:tcBorders>
+            <w:vAlign w:val="bottom"/>
+          </w:tcPr>
+          <w:p>
+            <w:pPr>
+              <w:pStyle w:val="Normal"/>
+              <w:widowControl w:val="false"/>
+              <w:spacing w:lineRule="auto" w:line="180"/>
+              <w:jc w:val="center"/>
+              <w:rPr>
+                <w:color w:val="000000"/>
+                <w:sz w:val="16"/>
+                <w:szCs w:val="16"/>
+              </w:rPr>
+            </w:pPr>
+            <w:r>
+              <w:rPr>
+                <w:rFonts w:eastAsia="arial" w:ascii="arial" w:hAnsi="arial"/>
+                <w:color w:val="000000"/>
+                <w:sz w:val="16"/>
+                <w:szCs w:val="16"/>
+              </w:rPr>
+              <w:t>Exterior</w:t>
+            </w:r>
+          </w:p>
+          <w:p>
+            <w:pPr>
+              <w:pStyle w:val="Normal"/>
+              <w:widowControl w:val="false"/>
+              <w:spacing w:lineRule="auto" w:line="180"/>
+              <w:jc w:val="center"/>
+              <w:rPr>
+                <w:color w:val="000000"/>
+                <w:sz w:val="16"/>
+                <w:szCs w:val="16"/>
+              </w:rPr>
+            </w:pPr>
+            <w:r>
+              <w:rPr>
+                <w:rFonts w:eastAsia="arial" w:ascii="arial" w:hAnsi="arial"/>
+                <w:color w:val="000000"/>
+                <w:sz w:val="16"/>
+                <w:szCs w:val="16"/>
+              </w:rPr>
+              <w:t>Camera</w:t>
+            </w:r>
+          </w:p>
+        </w:tc>
+        <w:tc>
+          <w:tcPr>
+            <w:tcW w:w="1029" w:type="dxa"/>
+            <w:tcBorders>
+              <w:top w:val="single" w:sz="4" w:space="0" w:color="000000"/>
+              <w:left w:val="single" w:sz="4" w:space="0" w:color="000000"/>
+              <w:bottom w:val="single" w:sz="4" w:space="0" w:color="000000"/>
+              <w:right w:val="single" w:sz="4" w:space="0" w:color="000000"/>
+            </w:tcBorders>
+            <w:vAlign w:val="bottom"/>
+          </w:tcPr>
+          <w:p>
+            <w:pPr>
+              <w:pStyle w:val="Normal"/>
+              <w:widowControl w:val="false"/>
+              <w:spacing w:lineRule="auto" w:line="180"/>
+              <w:jc w:val="center"/>
+              <w:rPr>
+                <w:color w:val="000000"/>
+                <w:sz w:val="16"/>
+                <w:szCs w:val="16"/>
+              </w:rPr>
+            </w:pPr>
+            <w:r>
+              <w:rPr>
+                <w:rFonts w:eastAsia="arial" w:ascii="arial" w:hAnsi="arial"/>
+                <w:color w:val="000000"/>
+                <w:sz w:val="16"/>
+                <w:szCs w:val="16"/>
+              </w:rPr>
+              <w:t>Prev</w:t>
+            </w:r>
+          </w:p>
+          <w:p>
+            <w:pPr>
+              <w:pStyle w:val="Normal"/>
+              <w:widowControl w:val="false"/>
+              <w:spacing w:lineRule="auto" w:line="180"/>
+              <w:jc w:val="center"/>
+              <w:rPr>
+                <w:color w:val="000000"/>
+                <w:sz w:val="16"/>
+                <w:szCs w:val="16"/>
+              </w:rPr>
+            </w:pPr>
+            <w:r>
+              <w:rPr>
+                <w:rFonts w:eastAsia="arial" w:ascii="arial" w:hAnsi="arial"/>
+                <w:color w:val="000000"/>
+                <w:sz w:val="16"/>
+                <w:szCs w:val="16"/>
+              </w:rPr>
+              <w:t>Cab Cam</w:t>
+            </w:r>
+          </w:p>
+        </w:tc>
+      </w:tr>
+    </w:tbl>
+    <w:p>
+      <w:pPr>
+        <w:pStyle w:val="Normal"/>
+        <w:bidi w:val="0"/>
+        <w:rPr>
+          <w:color w:val="000000"/>
+          <w:sz w:val="16"/>
+          <w:szCs w:val="16"/>
+        </w:rPr>
+      </w:pPr>
+      <w:r>
+        <w:rPr>
+          <w:color w:val="000000"/>
+          <w:sz w:val="16"/>
+          <w:szCs w:val="16"/>
+        </w:rPr>
+      </w:r>
+    </w:p>
+    <w:p>
+      <w:pPr>
+        <w:pStyle w:val="Normal"/>
+        <w:rPr>
+          <w:color w:val="000000"/>
+          <w:sz w:val="16"/>
+          <w:szCs w:val="16"/>
+        </w:rPr>
+      </w:pPr>
+      <w:r>
+        <w:rPr>
+          <w:color w:val="000000"/>
+          <w:sz w:val="16"/>
+          <w:szCs w:val="16"/>
+        </w:rPr>
+        <w:tab/>
+        <w:t xml:space="preserve">       </w:t>
+      </w:r>
+      <w:r>
+        <w:rPr>
+          <w:rFonts w:eastAsia="arial" w:ascii="arial" w:hAnsi="arial"/>
+          <w:color w:val="000000"/>
+          <w:sz w:val="16"/>
+          <w:szCs w:val="16"/>
+        </w:rPr>
+        <w:t xml:space="preserve">    DB BR 4</w:t>
+      </w:r>
+      <w:r>
+        <w:rPr>
+          <w:rFonts w:eastAsia="arial" w:ascii="arial" w:hAnsi="arial"/>
+          <w:color w:val="000000"/>
+          <w:sz w:val="16"/>
+          <w:szCs w:val="16"/>
+        </w:rPr>
+        <w:t>8</w:t>
+      </w:r>
+      <w:r>
+        <w:rPr>
+          <w:rFonts w:eastAsia="arial" w:ascii="arial" w:hAnsi="arial"/>
+          <w:color w:val="000000"/>
+          <w:sz w:val="16"/>
+          <w:szCs w:val="16"/>
+        </w:rPr>
+        <w:t>3-1</w:t>
+      </w:r>
+    </w:p>
+    <w:tbl>
+      <w:tblPr>
+        <w:tblW w:w="14248" w:type="dxa"/>
+        <w:jc w:val="left"/>
+        <w:tblInd w:w="-5" w:type="dxa"/>
+        <w:tblLayout w:type="fixed"/>
+        <w:tblCellMar>
+          <w:top w:w="0" w:type="dxa"/>
+          <w:left w:w="108" w:type="dxa"/>
+          <w:bottom w:w="0" w:type="dxa"/>
+          <w:right w:w="108" w:type="dxa"/>
+        </w:tblCellMar>
+        <w:tblLook w:firstRow="1" w:noVBand="1" w:lastRow="0" w:firstColumn="1" w:lastColumn="0" w:noHBand="0" w:val="04a0"/>
+      </w:tblPr>
+      <w:tblGrid>
+        <w:gridCol w:w="1017"/>
+        <w:gridCol w:w="1019"/>
+        <w:gridCol w:w="1014"/>
+        <w:gridCol w:w="1016"/>
+        <w:gridCol w:w="1020"/>
+        <w:gridCol w:w="1016"/>
+        <w:gridCol w:w="1016"/>
+        <w:gridCol w:w="1017"/>
+        <w:gridCol w:w="1016"/>
+        <w:gridCol w:w="1020"/>
+        <w:gridCol w:w="1016"/>
+        <w:gridCol w:w="1016"/>
+        <w:gridCol w:w="1016"/>
+        <w:gridCol w:w="1029"/>
+      </w:tblGrid>
+      <w:tr>
+        <w:trPr>
+          <w:trHeight w:val="440" w:hRule="exact"/>
+          <w:cantSplit w:val="true"/>
+        </w:trPr>
+        <w:tc>
+          <w:tcPr>
+            <w:tcW w:w="1017" w:type="dxa"/>
+            <w:tcBorders>
+              <w:top w:val="single" w:sz="4" w:space="0" w:color="000000"/>
+              <w:left w:val="single" w:sz="4" w:space="0" w:color="000000"/>
+              <w:bottom w:val="single" w:sz="4" w:space="0" w:color="000000"/>
+            </w:tcBorders>
+            <w:vAlign w:val="bottom"/>
+          </w:tcPr>
+          <w:p>
+            <w:pPr>
+              <w:pStyle w:val="Normal"/>
+              <w:widowControl w:val="false"/>
+              <w:spacing w:lineRule="auto" w:line="180" w:before="0" w:after="60"/>
+              <w:jc w:val="center"/>
+              <w:rPr>
+                <w:color w:val="000000"/>
+                <w:sz w:val="16"/>
+                <w:szCs w:val="16"/>
+              </w:rPr>
+            </w:pPr>
+            <w:r>
+              <w:rPr>
+                <w:rFonts w:eastAsia="arial" w:ascii="arial" w:hAnsi="arial"/>
+                <w:b/>
+                <w:color w:val="000000"/>
+                <w:sz w:val="16"/>
+                <w:szCs w:val="16"/>
+              </w:rPr>
+              <w:t>Pause</w:t>
+            </w:r>
+          </w:p>
+        </w:tc>
+        <w:tc>
+          <w:tcPr>
+            <w:tcW w:w="1019" w:type="dxa"/>
+            <w:tcBorders>
+              <w:top w:val="single" w:sz="4" w:space="0" w:color="000000"/>
+              <w:left w:val="single" w:sz="4" w:space="0" w:color="000000"/>
+              <w:bottom w:val="single" w:sz="4" w:space="0" w:color="000000"/>
+            </w:tcBorders>
+            <w:vAlign w:val="bottom"/>
+          </w:tcPr>
+          <w:p>
+            <w:pPr>
+              <w:pStyle w:val="Normal"/>
+              <w:widowControl w:val="false"/>
+              <w:spacing w:lineRule="auto" w:line="180"/>
+              <w:jc w:val="center"/>
+              <w:rPr>
+                <w:color w:val="000000"/>
+                <w:sz w:val="16"/>
+                <w:szCs w:val="16"/>
+              </w:rPr>
+            </w:pPr>
+            <w:r>
+              <w:rPr>
+                <w:rFonts w:eastAsia="arial" w:ascii="arial" w:hAnsi="arial"/>
+                <w:color w:val="000000"/>
+                <w:sz w:val="16"/>
+                <w:szCs w:val="16"/>
+              </w:rPr>
+              <w:t>Reverser</w:t>
+            </w:r>
+          </w:p>
+          <w:p>
+            <w:pPr>
+              <w:pStyle w:val="Normal"/>
+              <w:widowControl w:val="false"/>
+              <w:spacing w:lineRule="auto" w:line="180"/>
+              <w:jc w:val="center"/>
+              <w:rPr>
+                <w:color w:val="000000"/>
+                <w:sz w:val="16"/>
+                <w:szCs w:val="16"/>
+              </w:rPr>
+            </w:pPr>
+            <w:r>
+              <w:rPr>
+                <w:rFonts w:eastAsia="arial" w:ascii="arial" w:hAnsi="arial"/>
+                <w:color w:val="000000"/>
+                <w:sz w:val="16"/>
+                <w:szCs w:val="16"/>
+              </w:rPr>
+              <w:t>Handle</w:t>
+            </w:r>
+          </w:p>
+        </w:tc>
+        <w:tc>
+          <w:tcPr>
+            <w:tcW w:w="1014" w:type="dxa"/>
+            <w:tcBorders>
+              <w:top w:val="single" w:sz="4" w:space="0" w:color="000000"/>
+              <w:left w:val="single" w:sz="4" w:space="0" w:color="000000"/>
+              <w:bottom w:val="single" w:sz="4" w:space="0" w:color="000000"/>
+            </w:tcBorders>
+            <w:vAlign w:val="bottom"/>
+          </w:tcPr>
+          <w:p>
+            <w:pPr>
+              <w:pStyle w:val="Normal"/>
+              <w:widowControl w:val="false"/>
+              <w:spacing w:lineRule="auto" w:line="180"/>
+              <w:jc w:val="center"/>
+              <w:rPr>
+                <w:color w:val="000000"/>
+                <w:sz w:val="16"/>
+                <w:szCs w:val="16"/>
+              </w:rPr>
+            </w:pPr>
+            <w:r>
+              <w:rPr>
+                <w:color w:val="000000"/>
+                <w:sz w:val="16"/>
+                <w:szCs w:val="16"/>
+              </w:rPr>
+              <w:t>MCB Close</w:t>
+            </w:r>
+          </w:p>
+        </w:tc>
+        <w:tc>
+          <w:tcPr>
+            <w:tcW w:w="1016" w:type="dxa"/>
+            <w:tcBorders>
+              <w:top w:val="single" w:sz="4" w:space="0" w:color="000000"/>
+              <w:left w:val="single" w:sz="4" w:space="0" w:color="000000"/>
+              <w:bottom w:val="single" w:sz="4" w:space="0" w:color="000000"/>
+            </w:tcBorders>
+            <w:vAlign w:val="bottom"/>
+          </w:tcPr>
+          <w:p>
+            <w:pPr>
+              <w:pStyle w:val="Normal"/>
+              <w:widowControl w:val="false"/>
+              <w:spacing w:lineRule="auto" w:line="180"/>
+              <w:jc w:val="center"/>
+              <w:rPr>
+                <w:sz w:val="16"/>
+                <w:szCs w:val="16"/>
+              </w:rPr>
+            </w:pPr>
+            <w:r>
+              <w:rPr>
+                <w:rFonts w:eastAsia="arial" w:ascii="arial" w:hAnsi="arial"/>
+                <w:color w:val="000000"/>
+                <w:sz w:val="16"/>
+                <w:szCs w:val="16"/>
+              </w:rPr>
+              <w:t>PZB/LZB</w:t>
+            </w:r>
+          </w:p>
+        </w:tc>
+        <w:tc>
+          <w:tcPr>
+            <w:tcW w:w="1020" w:type="dxa"/>
+            <w:tcBorders>
+              <w:top w:val="single" w:sz="4" w:space="0" w:color="000000"/>
+              <w:left w:val="single" w:sz="4" w:space="0" w:color="000000"/>
+              <w:bottom w:val="single" w:sz="4" w:space="0" w:color="000000"/>
+            </w:tcBorders>
+            <w:vAlign w:val="bottom"/>
+          </w:tcPr>
+          <w:p>
+            <w:pPr>
+              <w:pStyle w:val="Normal"/>
+              <w:widowControl w:val="false"/>
+              <w:spacing w:lineRule="auto" w:line="180"/>
+              <w:jc w:val="center"/>
+              <w:rPr>
+                <w:color w:val="000000"/>
+                <w:sz w:val="16"/>
+                <w:szCs w:val="16"/>
+              </w:rPr>
+            </w:pPr>
+            <w:r>
+              <w:rPr>
+                <w:rFonts w:eastAsia="arial" w:ascii="arial" w:hAnsi="arial"/>
+                <w:color w:val="000000"/>
+                <w:sz w:val="16"/>
+                <w:szCs w:val="16"/>
+              </w:rPr>
+              <w:t>Panto. Raise</w:t>
+            </w:r>
+          </w:p>
+        </w:tc>
+        <w:tc>
+          <w:tcPr>
+            <w:tcW w:w="1016" w:type="dxa"/>
+            <w:tcBorders>
+              <w:top w:val="single" w:sz="4" w:space="0" w:color="000000"/>
+              <w:left w:val="single" w:sz="4" w:space="0" w:color="000000"/>
+              <w:bottom w:val="single" w:sz="4" w:space="0" w:color="000000"/>
+            </w:tcBorders>
+            <w:vAlign w:val="bottom"/>
+          </w:tcPr>
+          <w:p>
+            <w:pPr>
+              <w:pStyle w:val="Normal"/>
+              <w:widowControl w:val="false"/>
+              <w:jc w:val="center"/>
+              <w:rPr>
+                <w:color w:val="000000"/>
+                <w:sz w:val="16"/>
+                <w:szCs w:val="16"/>
+              </w:rPr>
+            </w:pPr>
+            <w:r>
+              <w:rPr>
+                <w:color w:val="000000"/>
+                <w:sz w:val="16"/>
+                <w:szCs w:val="16"/>
+              </w:rPr>
+              <w:t>Train Supply On</w:t>
+            </w:r>
+          </w:p>
+        </w:tc>
+        <w:tc>
+          <w:tcPr>
+            <w:tcW w:w="1016" w:type="dxa"/>
+            <w:tcBorders>
+              <w:top w:val="single" w:sz="4" w:space="0" w:color="000000"/>
+              <w:left w:val="single" w:sz="4" w:space="0" w:color="000000"/>
+              <w:bottom w:val="single" w:sz="4" w:space="0" w:color="000000"/>
+            </w:tcBorders>
+            <w:vAlign w:val="bottom"/>
+          </w:tcPr>
+          <w:p>
+            <w:pPr>
+              <w:pStyle w:val="Normal"/>
+              <w:widowControl w:val="false"/>
+              <w:jc w:val="center"/>
+              <w:rPr>
+                <w:sz w:val="16"/>
+                <w:szCs w:val="16"/>
+              </w:rPr>
+            </w:pPr>
+            <w:r>
+              <w:rPr>
+                <w:rFonts w:eastAsia="arial" w:ascii="arial" w:hAnsi="arial"/>
+                <w:color w:val="000000"/>
+                <w:sz w:val="16"/>
+                <w:szCs w:val="16"/>
+              </w:rPr>
+              <w:t>Train Light On</w:t>
+            </w:r>
+          </w:p>
+        </w:tc>
+        <w:tc>
+          <w:tcPr>
+            <w:tcW w:w="1017" w:type="dxa"/>
+            <w:tcBorders>
+              <w:top w:val="single" w:sz="4" w:space="0" w:color="000000"/>
+              <w:left w:val="single" w:sz="4" w:space="0" w:color="000000"/>
+              <w:bottom w:val="single" w:sz="4" w:space="0" w:color="000000"/>
+            </w:tcBorders>
+            <w:vAlign w:val="bottom"/>
+          </w:tcPr>
+          <w:p>
+            <w:pPr>
+              <w:pStyle w:val="Normal"/>
+              <w:widowControl w:val="false"/>
+              <w:jc w:val="center"/>
+              <w:rPr>
+                <w:rFonts w:ascii="arial" w:hAnsi="arial" w:eastAsia="arial"/>
+                <w:color w:val="000000"/>
+                <w:sz w:val="16"/>
+                <w:szCs w:val="16"/>
+              </w:rPr>
+            </w:pPr>
+            <w:r>
+              <w:rPr>
+                <w:rFonts w:eastAsia="arial" w:ascii="arial" w:hAnsi="arial"/>
+                <w:color w:val="000000"/>
+                <w:sz w:val="16"/>
+                <w:szCs w:val="16"/>
+              </w:rPr>
+              <w:t>Brake Key On</w:t>
+            </w:r>
+          </w:p>
+        </w:tc>
+        <w:tc>
+          <w:tcPr>
+            <w:tcW w:w="1016" w:type="dxa"/>
+            <w:tcBorders>
+              <w:top w:val="single" w:sz="4" w:space="0" w:color="000000"/>
+              <w:left w:val="single" w:sz="4" w:space="0" w:color="000000"/>
+              <w:bottom w:val="single" w:sz="4" w:space="0" w:color="000000"/>
+            </w:tcBorders>
+            <w:vAlign w:val="bottom"/>
+          </w:tcPr>
+          <w:p>
+            <w:pPr>
+              <w:pStyle w:val="Normal"/>
+              <w:widowControl w:val="false"/>
+              <w:jc w:val="center"/>
+              <w:rPr>
+                <w:rFonts w:ascii="arial" w:hAnsi="arial" w:eastAsia="arial"/>
+                <w:color w:val="000000"/>
+                <w:sz w:val="16"/>
+                <w:szCs w:val="16"/>
+              </w:rPr>
+            </w:pPr>
+            <w:r>
+              <w:rPr>
+                <w:rFonts w:eastAsia="arial" w:ascii="arial" w:hAnsi="arial"/>
+                <w:color w:val="000000"/>
+                <w:sz w:val="16"/>
+                <w:szCs w:val="16"/>
+              </w:rPr>
+              <w:t>Gauge Light</w:t>
+            </w:r>
+          </w:p>
+        </w:tc>
+        <w:tc>
+          <w:tcPr>
+            <w:tcW w:w="1020" w:type="dxa"/>
+            <w:tcBorders>
+              <w:top w:val="single" w:sz="4" w:space="0" w:color="000000"/>
+              <w:left w:val="single" w:sz="4" w:space="0" w:color="000000"/>
+              <w:bottom w:val="single" w:sz="4" w:space="0" w:color="000000"/>
+            </w:tcBorders>
+            <w:vAlign w:val="bottom"/>
+          </w:tcPr>
+          <w:p>
+            <w:pPr>
+              <w:pStyle w:val="Normal"/>
+              <w:widowControl w:val="false"/>
+              <w:jc w:val="center"/>
+              <w:rPr>
+                <w:rFonts w:ascii="arial" w:hAnsi="arial" w:eastAsia="arial"/>
+                <w:color w:val="000000"/>
+                <w:sz w:val="16"/>
+                <w:szCs w:val="16"/>
+              </w:rPr>
+            </w:pPr>
+            <w:r>
+              <w:rPr>
+                <w:rFonts w:eastAsia="arial" w:ascii="arial" w:hAnsi="arial"/>
+                <w:color w:val="000000"/>
+                <w:sz w:val="16"/>
+                <w:szCs w:val="16"/>
+              </w:rPr>
+              <w:t>Signal Light HL</w:t>
+            </w:r>
+          </w:p>
+        </w:tc>
+        <w:tc>
+          <w:tcPr>
+            <w:tcW w:w="1016" w:type="dxa"/>
+            <w:tcBorders>
+              <w:top w:val="single" w:sz="4" w:space="0" w:color="000000"/>
+              <w:left w:val="single" w:sz="4" w:space="0" w:color="000000"/>
+              <w:bottom w:val="single" w:sz="4" w:space="0" w:color="000000"/>
+            </w:tcBorders>
+            <w:vAlign w:val="bottom"/>
+          </w:tcPr>
+          <w:p>
+            <w:pPr>
+              <w:pStyle w:val="Normal"/>
+              <w:widowControl w:val="false"/>
+              <w:spacing w:lineRule="auto" w:line="180"/>
+              <w:jc w:val="center"/>
+              <w:rPr>
+                <w:color w:val="000000"/>
+                <w:sz w:val="16"/>
+                <w:szCs w:val="16"/>
+              </w:rPr>
+            </w:pPr>
+            <w:r>
+              <w:rPr>
+                <w:rFonts w:eastAsia="arial" w:ascii="arial" w:hAnsi="arial"/>
+                <w:color w:val="000000"/>
+                <w:sz w:val="16"/>
+                <w:szCs w:val="16"/>
+              </w:rPr>
+              <w:t>Cab Light</w:t>
+            </w:r>
+          </w:p>
+        </w:tc>
+        <w:tc>
+          <w:tcPr>
+            <w:tcW w:w="1016" w:type="dxa"/>
+            <w:tcBorders>
+              <w:top w:val="single" w:sz="4" w:space="0" w:color="000000"/>
+              <w:left w:val="single" w:sz="4" w:space="0" w:color="000000"/>
+              <w:bottom w:val="single" w:sz="4" w:space="0" w:color="000000"/>
+            </w:tcBorders>
+            <w:vAlign w:val="bottom"/>
+          </w:tcPr>
+          <w:p>
+            <w:pPr>
+              <w:pStyle w:val="Normal"/>
+              <w:widowControl w:val="false"/>
+              <w:spacing w:lineRule="auto" w:line="180"/>
+              <w:jc w:val="center"/>
+              <w:rPr>
+                <w:color w:val="000000"/>
+                <w:sz w:val="16"/>
+                <w:szCs w:val="16"/>
+              </w:rPr>
+            </w:pPr>
+            <w:r>
+              <w:rPr>
+                <w:rFonts w:eastAsia="arial" w:ascii="arial" w:hAnsi="arial"/>
+                <w:color w:val="000000"/>
+                <w:sz w:val="16"/>
+                <w:szCs w:val="16"/>
+              </w:rPr>
+              <w:t>Emer.</w:t>
+            </w:r>
+          </w:p>
+          <w:p>
+            <w:pPr>
+              <w:pStyle w:val="Normal"/>
+              <w:widowControl w:val="false"/>
+              <w:spacing w:lineRule="auto" w:line="180"/>
+              <w:jc w:val="center"/>
+              <w:rPr>
+                <w:color w:val="000000"/>
+                <w:sz w:val="16"/>
+                <w:szCs w:val="16"/>
+              </w:rPr>
+            </w:pPr>
+            <w:r>
+              <w:rPr>
+                <w:rFonts w:eastAsia="arial" w:ascii="arial" w:hAnsi="arial"/>
+                <w:color w:val="000000"/>
+                <w:sz w:val="16"/>
+                <w:szCs w:val="16"/>
+              </w:rPr>
+              <w:t>Brake</w:t>
+            </w:r>
+          </w:p>
+        </w:tc>
+        <w:tc>
+          <w:tcPr>
+            <w:tcW w:w="1016" w:type="dxa"/>
+            <w:tcBorders>
+              <w:top w:val="single" w:sz="4" w:space="0" w:color="000000"/>
+              <w:left w:val="single" w:sz="4" w:space="0" w:color="000000"/>
+              <w:bottom w:val="single" w:sz="4" w:space="0" w:color="000000"/>
+            </w:tcBorders>
+            <w:vAlign w:val="bottom"/>
+          </w:tcPr>
+          <w:p>
+            <w:pPr>
+              <w:pStyle w:val="Normal"/>
+              <w:widowControl w:val="false"/>
+              <w:spacing w:lineRule="auto" w:line="180"/>
+              <w:jc w:val="center"/>
+              <w:rPr>
+                <w:color w:val="000000"/>
+                <w:sz w:val="16"/>
+                <w:szCs w:val="16"/>
+              </w:rPr>
+            </w:pPr>
+            <w:r>
+              <w:rPr>
+                <w:rFonts w:eastAsia="arial" w:ascii="arial" w:hAnsi="arial"/>
+                <w:color w:val="000000"/>
+                <w:sz w:val="16"/>
+                <w:szCs w:val="16"/>
+              </w:rPr>
+              <w:t>1P Cam</w:t>
+            </w:r>
+          </w:p>
+        </w:tc>
+        <w:tc>
+          <w:tcPr>
+            <w:tcW w:w="1029" w:type="dxa"/>
+            <w:tcBorders>
+              <w:top w:val="single" w:sz="4" w:space="0" w:color="000000"/>
+              <w:left w:val="single" w:sz="4" w:space="0" w:color="000000"/>
+              <w:bottom w:val="single" w:sz="4" w:space="0" w:color="000000"/>
+              <w:right w:val="single" w:sz="4" w:space="0" w:color="000000"/>
+            </w:tcBorders>
+            <w:vAlign w:val="bottom"/>
+          </w:tcPr>
+          <w:p>
+            <w:pPr>
+              <w:pStyle w:val="Normal"/>
+              <w:widowControl w:val="false"/>
+              <w:spacing w:lineRule="auto" w:line="180"/>
+              <w:jc w:val="center"/>
+              <w:rPr>
+                <w:color w:val="000000"/>
+                <w:sz w:val="16"/>
+                <w:szCs w:val="16"/>
+              </w:rPr>
+            </w:pPr>
+            <w:r>
+              <w:rPr>
+                <w:rFonts w:eastAsia="arial" w:ascii="arial" w:hAnsi="arial"/>
+                <w:color w:val="000000"/>
+                <w:sz w:val="16"/>
+                <w:szCs w:val="16"/>
+              </w:rPr>
+              <w:t>Next</w:t>
+            </w:r>
+          </w:p>
+          <w:p>
+            <w:pPr>
+              <w:pStyle w:val="Normal"/>
+              <w:widowControl w:val="false"/>
+              <w:spacing w:lineRule="auto" w:line="180"/>
+              <w:jc w:val="center"/>
+              <w:rPr>
+                <w:color w:val="000000"/>
+                <w:sz w:val="16"/>
+                <w:szCs w:val="16"/>
+              </w:rPr>
+            </w:pPr>
+            <w:r>
+              <w:rPr>
+                <w:rFonts w:eastAsia="arial" w:ascii="arial" w:hAnsi="arial"/>
+                <w:color w:val="000000"/>
+                <w:sz w:val="16"/>
+                <w:szCs w:val="16"/>
+              </w:rPr>
+              <w:t>Cab Cam</w:t>
+            </w:r>
+          </w:p>
+        </w:tc>
+      </w:tr>
+    </w:tbl>
+    <w:p>
+      <w:pPr>
+        <w:pStyle w:val="Normal"/>
+        <w:rPr>
+          <w:rFonts w:ascii="arial" w:hAnsi="arial" w:eastAsia="arial"/>
+          <w:color w:val="000000"/>
+          <w:sz w:val="16"/>
+          <w:szCs w:val="16"/>
+        </w:rPr>
+      </w:pPr>
+      <w:r>
+        <w:rPr>
+          <w:rFonts w:eastAsia="arial" w:ascii="arial" w:hAnsi="arial"/>
+          <w:color w:val="000000"/>
+          <w:sz w:val="16"/>
+          <w:szCs w:val="16"/>
+        </w:rPr>
+      </w:r>
+    </w:p>
+    <w:p>
+      <w:pPr>
+        <w:pStyle w:val="Normal"/>
+        <w:rPr>
+          <w:color w:val="000000"/>
+          <w:sz w:val="16"/>
+          <w:szCs w:val="16"/>
+        </w:rPr>
+      </w:pPr>
+      <w:r>
+        <w:rPr>
+          <w:rFonts w:eastAsia="arial" w:ascii="arial" w:hAnsi="arial"/>
+          <w:color w:val="000000"/>
+          <w:sz w:val="16"/>
+          <w:szCs w:val="16"/>
+        </w:rPr>
+        <w:tab/>
+        <w:t xml:space="preserve">           DB BR 4</w:t>
+      </w:r>
+      <w:r>
+        <w:rPr>
+          <w:rFonts w:eastAsia="arial" w:ascii="arial" w:hAnsi="arial"/>
+          <w:color w:val="000000"/>
+          <w:sz w:val="16"/>
+          <w:szCs w:val="16"/>
+        </w:rPr>
+        <w:t>8</w:t>
+      </w:r>
+      <w:r>
+        <w:rPr>
+          <w:rFonts w:eastAsia="arial" w:ascii="arial" w:hAnsi="arial"/>
+          <w:color w:val="000000"/>
+          <w:sz w:val="16"/>
+          <w:szCs w:val="16"/>
+        </w:rPr>
+        <w:t>3-2</w:t>
+      </w:r>
+    </w:p>
+    <w:tbl>
+      <w:tblPr>
+        <w:tblW w:w="14248" w:type="dxa"/>
+        <w:jc w:val="left"/>
+        <w:tblInd w:w="-5" w:type="dxa"/>
+        <w:tblLayout w:type="fixed"/>
+        <w:tblCellMar>
+          <w:top w:w="0" w:type="dxa"/>
+          <w:left w:w="108" w:type="dxa"/>
+          <w:bottom w:w="0" w:type="dxa"/>
+          <w:right w:w="108" w:type="dxa"/>
+        </w:tblCellMar>
+        <w:tblLook w:firstRow="1" w:noVBand="1" w:lastRow="0" w:firstColumn="1" w:lastColumn="0" w:noHBand="0" w:val="04a0"/>
+      </w:tblPr>
+      <w:tblGrid>
+        <w:gridCol w:w="1017"/>
+        <w:gridCol w:w="1019"/>
+        <w:gridCol w:w="1014"/>
+        <w:gridCol w:w="1016"/>
+        <w:gridCol w:w="1020"/>
+        <w:gridCol w:w="1016"/>
+        <w:gridCol w:w="1016"/>
+        <w:gridCol w:w="1017"/>
+        <w:gridCol w:w="1016"/>
+        <w:gridCol w:w="1020"/>
+        <w:gridCol w:w="1016"/>
+        <w:gridCol w:w="1016"/>
+        <w:gridCol w:w="1016"/>
+        <w:gridCol w:w="1029"/>
+      </w:tblGrid>
+      <w:tr>
+        <w:trPr>
+          <w:trHeight w:val="440" w:hRule="exact"/>
+          <w:cantSplit w:val="true"/>
+        </w:trPr>
+        <w:tc>
+          <w:tcPr>
+            <w:tcW w:w="1017" w:type="dxa"/>
+            <w:tcBorders>
+              <w:top w:val="single" w:sz="4" w:space="0" w:color="000000"/>
+              <w:left w:val="single" w:sz="4" w:space="0" w:color="000000"/>
+              <w:bottom w:val="single" w:sz="4" w:space="0" w:color="000000"/>
+            </w:tcBorders>
+            <w:vAlign w:val="bottom"/>
+          </w:tcPr>
+          <w:p>
+            <w:pPr>
+              <w:pStyle w:val="Normal"/>
+              <w:widowControl w:val="false"/>
+              <w:spacing w:lineRule="auto" w:line="180" w:before="0" w:after="60"/>
+              <w:jc w:val="center"/>
+              <w:rPr>
+                <w:color w:val="000000"/>
+                <w:sz w:val="16"/>
+                <w:szCs w:val="16"/>
+              </w:rPr>
+            </w:pPr>
+            <w:r>
+              <w:rPr>
+                <w:rFonts w:eastAsia="arial" w:ascii="arial" w:hAnsi="arial"/>
+                <w:b/>
+                <w:color w:val="000000"/>
+                <w:sz w:val="16"/>
+                <w:szCs w:val="16"/>
+              </w:rPr>
+              <w:t>HUD</w:t>
+            </w:r>
+          </w:p>
+        </w:tc>
+        <w:tc>
+          <w:tcPr>
+            <w:tcW w:w="1019" w:type="dxa"/>
+            <w:tcBorders>
+              <w:top w:val="single" w:sz="4" w:space="0" w:color="000000"/>
+              <w:left w:val="single" w:sz="4" w:space="0" w:color="000000"/>
+              <w:bottom w:val="single" w:sz="4" w:space="0" w:color="000000"/>
+            </w:tcBorders>
+            <w:vAlign w:val="bottom"/>
+          </w:tcPr>
+          <w:p>
+            <w:pPr>
+              <w:pStyle w:val="Normal"/>
+              <w:widowControl w:val="false"/>
+              <w:spacing w:lineRule="auto" w:line="180"/>
+              <w:jc w:val="center"/>
+              <w:rPr>
+                <w:rFonts w:ascii="arial" w:hAnsi="arial" w:eastAsia="arial"/>
+                <w:color w:val="000000"/>
+                <w:sz w:val="16"/>
+                <w:szCs w:val="16"/>
+              </w:rPr>
+            </w:pPr>
+            <w:r>
+              <w:rPr>
+                <w:rFonts w:eastAsia="arial" w:ascii="arial" w:hAnsi="arial"/>
+                <w:color w:val="000000"/>
+                <w:sz w:val="16"/>
+                <w:szCs w:val="16"/>
+              </w:rPr>
+              <w:t>Schedule</w:t>
+            </w:r>
+          </w:p>
+        </w:tc>
+        <w:tc>
+          <w:tcPr>
+            <w:tcW w:w="1014" w:type="dxa"/>
+            <w:tcBorders>
+              <w:top w:val="single" w:sz="4" w:space="0" w:color="000000"/>
+              <w:left w:val="single" w:sz="4" w:space="0" w:color="000000"/>
+              <w:bottom w:val="single" w:sz="4" w:space="0" w:color="000000"/>
+            </w:tcBorders>
+            <w:vAlign w:val="bottom"/>
+          </w:tcPr>
+          <w:p>
+            <w:pPr>
+              <w:pStyle w:val="Normal"/>
+              <w:widowControl w:val="false"/>
+              <w:spacing w:lineRule="auto" w:line="180"/>
+              <w:jc w:val="center"/>
+              <w:rPr>
+                <w:color w:val="000000"/>
+                <w:sz w:val="16"/>
+                <w:szCs w:val="16"/>
+              </w:rPr>
+            </w:pPr>
+            <w:r>
+              <w:rPr>
+                <w:rFonts w:eastAsia="arial" w:ascii="arial" w:hAnsi="arial"/>
+                <w:color w:val="000000"/>
+                <w:sz w:val="16"/>
+                <w:szCs w:val="16"/>
+              </w:rPr>
+              <w:t>MCB Open</w:t>
+            </w:r>
+          </w:p>
+        </w:tc>
+        <w:tc>
+          <w:tcPr>
+            <w:tcW w:w="1016" w:type="dxa"/>
+            <w:tcBorders>
+              <w:top w:val="single" w:sz="4" w:space="0" w:color="000000"/>
+              <w:left w:val="single" w:sz="4" w:space="0" w:color="000000"/>
+              <w:bottom w:val="single" w:sz="4" w:space="0" w:color="000000"/>
+            </w:tcBorders>
+            <w:vAlign w:val="bottom"/>
+          </w:tcPr>
+          <w:p>
+            <w:pPr>
+              <w:pStyle w:val="Normal"/>
+              <w:widowControl w:val="false"/>
+              <w:spacing w:lineRule="auto" w:line="180"/>
+              <w:jc w:val="center"/>
+              <w:rPr>
+                <w:sz w:val="16"/>
+                <w:szCs w:val="16"/>
+              </w:rPr>
+            </w:pPr>
+            <w:r>
+              <w:rPr>
+                <w:sz w:val="16"/>
+                <w:szCs w:val="16"/>
+              </w:rPr>
+              <w:t>Sifa</w:t>
+            </w:r>
+          </w:p>
+        </w:tc>
+        <w:tc>
+          <w:tcPr>
+            <w:tcW w:w="1020" w:type="dxa"/>
+            <w:tcBorders>
+              <w:top w:val="single" w:sz="4" w:space="0" w:color="000000"/>
+              <w:left w:val="single" w:sz="4" w:space="0" w:color="000000"/>
+              <w:bottom w:val="single" w:sz="4" w:space="0" w:color="000000"/>
+            </w:tcBorders>
+            <w:vAlign w:val="bottom"/>
+          </w:tcPr>
+          <w:p>
+            <w:pPr>
+              <w:pStyle w:val="Normal"/>
+              <w:widowControl w:val="false"/>
+              <w:jc w:val="center"/>
+              <w:rPr>
+                <w:rFonts w:ascii="arial" w:hAnsi="arial" w:eastAsia="arial"/>
+                <w:color w:val="000000"/>
+                <w:sz w:val="16"/>
+                <w:szCs w:val="16"/>
+              </w:rPr>
+            </w:pPr>
+            <w:r>
+              <w:rPr>
+                <w:rFonts w:eastAsia="arial" w:ascii="arial" w:hAnsi="arial"/>
+                <w:color w:val="000000"/>
+                <w:sz w:val="16"/>
+                <w:szCs w:val="16"/>
+              </w:rPr>
+              <w:t>Panto.</w:t>
+            </w:r>
+          </w:p>
+          <w:p>
+            <w:pPr>
+              <w:pStyle w:val="Normal"/>
+              <w:widowControl w:val="false"/>
+              <w:jc w:val="center"/>
+              <w:rPr>
+                <w:rFonts w:ascii="arial" w:hAnsi="arial" w:eastAsia="arial"/>
+                <w:color w:val="000000"/>
+                <w:sz w:val="16"/>
+                <w:szCs w:val="16"/>
+              </w:rPr>
+            </w:pPr>
+            <w:r>
+              <w:rPr>
+                <w:rFonts w:eastAsia="arial" w:ascii="arial" w:hAnsi="arial"/>
+                <w:color w:val="000000"/>
+                <w:sz w:val="16"/>
+                <w:szCs w:val="16"/>
+              </w:rPr>
+              <w:t>Low</w:t>
+            </w:r>
+          </w:p>
+        </w:tc>
+        <w:tc>
+          <w:tcPr>
+            <w:tcW w:w="1016" w:type="dxa"/>
+            <w:tcBorders>
+              <w:top w:val="single" w:sz="4" w:space="0" w:color="000000"/>
+              <w:left w:val="single" w:sz="4" w:space="0" w:color="000000"/>
+              <w:bottom w:val="single" w:sz="4" w:space="0" w:color="000000"/>
+            </w:tcBorders>
+            <w:vAlign w:val="bottom"/>
+          </w:tcPr>
+          <w:p>
+            <w:pPr>
+              <w:pStyle w:val="Normal"/>
+              <w:widowControl w:val="false"/>
+              <w:spacing w:lineRule="auto" w:line="180"/>
+              <w:jc w:val="center"/>
+              <w:rPr>
+                <w:sz w:val="16"/>
+                <w:szCs w:val="16"/>
+              </w:rPr>
+            </w:pPr>
+            <w:r>
+              <w:rPr>
+                <w:rFonts w:eastAsia="arial" w:ascii="arial" w:hAnsi="arial"/>
+                <w:color w:val="000000"/>
+                <w:sz w:val="16"/>
+                <w:szCs w:val="16"/>
+              </w:rPr>
+              <w:t>Train Supply Off</w:t>
+            </w:r>
+          </w:p>
+        </w:tc>
+        <w:tc>
+          <w:tcPr>
+            <w:tcW w:w="1016" w:type="dxa"/>
+            <w:tcBorders>
+              <w:top w:val="single" w:sz="4" w:space="0" w:color="000000"/>
+              <w:left w:val="single" w:sz="4" w:space="0" w:color="000000"/>
+              <w:bottom w:val="single" w:sz="4" w:space="0" w:color="000000"/>
+            </w:tcBorders>
+            <w:vAlign w:val="bottom"/>
+          </w:tcPr>
+          <w:p>
+            <w:pPr>
+              <w:pStyle w:val="Normal"/>
+              <w:widowControl w:val="false"/>
+              <w:jc w:val="center"/>
+              <w:rPr>
+                <w:sz w:val="16"/>
+                <w:szCs w:val="16"/>
+              </w:rPr>
+            </w:pPr>
+            <w:r>
+              <w:rPr>
+                <w:rFonts w:eastAsia="arial" w:ascii="arial" w:hAnsi="arial"/>
+                <w:color w:val="000000"/>
+                <w:sz w:val="16"/>
+                <w:szCs w:val="16"/>
+              </w:rPr>
+              <w:t>Train Light Off</w:t>
+            </w:r>
+          </w:p>
+        </w:tc>
+        <w:tc>
+          <w:tcPr>
+            <w:tcW w:w="1017" w:type="dxa"/>
+            <w:tcBorders>
+              <w:top w:val="single" w:sz="4" w:space="0" w:color="000000"/>
+              <w:left w:val="single" w:sz="4" w:space="0" w:color="000000"/>
+              <w:bottom w:val="single" w:sz="4" w:space="0" w:color="000000"/>
+            </w:tcBorders>
+            <w:vAlign w:val="bottom"/>
+          </w:tcPr>
+          <w:p>
+            <w:pPr>
+              <w:pStyle w:val="Normal"/>
+              <w:widowControl w:val="false"/>
+              <w:jc w:val="center"/>
+              <w:rPr>
+                <w:rFonts w:ascii="arial" w:hAnsi="arial" w:eastAsia="arial"/>
+                <w:color w:val="000000"/>
+                <w:sz w:val="16"/>
+                <w:szCs w:val="16"/>
+              </w:rPr>
+            </w:pPr>
+            <w:r>
+              <w:rPr>
+                <w:rFonts w:eastAsia="arial" w:ascii="arial" w:hAnsi="arial"/>
+                <w:color w:val="000000"/>
+                <w:sz w:val="16"/>
+                <w:szCs w:val="16"/>
+              </w:rPr>
+              <w:t>Brake Key Off</w:t>
+            </w:r>
+          </w:p>
+        </w:tc>
+        <w:tc>
+          <w:tcPr>
+            <w:tcW w:w="1016" w:type="dxa"/>
+            <w:tcBorders>
+              <w:top w:val="single" w:sz="4" w:space="0" w:color="000000"/>
+              <w:left w:val="single" w:sz="4" w:space="0" w:color="000000"/>
+              <w:bottom w:val="single" w:sz="4" w:space="0" w:color="000000"/>
+            </w:tcBorders>
+            <w:vAlign w:val="bottom"/>
+          </w:tcPr>
+          <w:p>
+            <w:pPr>
+              <w:pStyle w:val="Normal"/>
+              <w:widowControl w:val="false"/>
+              <w:jc w:val="center"/>
+              <w:rPr>
+                <w:rFonts w:ascii="arial" w:hAnsi="arial" w:eastAsia="arial"/>
+                <w:color w:val="000000"/>
+                <w:sz w:val="16"/>
+                <w:szCs w:val="16"/>
+              </w:rPr>
+            </w:pPr>
+            <w:r>
+              <w:rPr>
+                <w:rFonts w:eastAsia="arial" w:ascii="arial" w:hAnsi="arial"/>
+                <w:color w:val="000000"/>
+                <w:sz w:val="16"/>
+                <w:szCs w:val="16"/>
+              </w:rPr>
+            </w:r>
+          </w:p>
+        </w:tc>
+        <w:tc>
+          <w:tcPr>
+            <w:tcW w:w="1020" w:type="dxa"/>
+            <w:tcBorders>
+              <w:top w:val="single" w:sz="4" w:space="0" w:color="000000"/>
+              <w:left w:val="single" w:sz="4" w:space="0" w:color="000000"/>
+              <w:bottom w:val="single" w:sz="4" w:space="0" w:color="000000"/>
+            </w:tcBorders>
+            <w:vAlign w:val="bottom"/>
+          </w:tcPr>
+          <w:p>
+            <w:pPr>
+              <w:pStyle w:val="Normal"/>
+              <w:widowControl w:val="false"/>
+              <w:jc w:val="center"/>
+              <w:rPr>
+                <w:rFonts w:ascii="arial" w:hAnsi="arial" w:eastAsia="arial"/>
+                <w:color w:val="000000"/>
+                <w:sz w:val="16"/>
+                <w:szCs w:val="16"/>
+              </w:rPr>
+            </w:pPr>
+            <w:r>
+              <w:rPr>
+                <w:rFonts w:eastAsia="arial" w:ascii="arial" w:hAnsi="arial"/>
+                <w:color w:val="000000"/>
+                <w:sz w:val="16"/>
+                <w:szCs w:val="16"/>
+              </w:rPr>
+              <w:t>Signal Light TL</w:t>
+            </w:r>
+          </w:p>
+        </w:tc>
+        <w:tc>
+          <w:tcPr>
+            <w:tcW w:w="1016" w:type="dxa"/>
+            <w:tcBorders>
+              <w:top w:val="single" w:sz="4" w:space="0" w:color="000000"/>
+              <w:left w:val="single" w:sz="4" w:space="0" w:color="000000"/>
+              <w:bottom w:val="single" w:sz="4" w:space="0" w:color="000000"/>
+            </w:tcBorders>
+            <w:vAlign w:val="bottom"/>
+          </w:tcPr>
+          <w:p>
+            <w:pPr>
+              <w:pStyle w:val="Normal"/>
+              <w:widowControl w:val="false"/>
+              <w:spacing w:lineRule="auto" w:line="180"/>
+              <w:jc w:val="center"/>
+              <w:rPr>
+                <w:color w:val="000000"/>
+                <w:sz w:val="16"/>
+                <w:szCs w:val="16"/>
+              </w:rPr>
+            </w:pPr>
+            <w:r>
+              <w:rPr>
+                <w:rFonts w:eastAsia="arial" w:ascii="arial" w:hAnsi="arial"/>
+                <w:color w:val="000000"/>
+                <w:sz w:val="16"/>
+                <w:szCs w:val="16"/>
+              </w:rPr>
+              <w:t>Desk Light</w:t>
+            </w:r>
+          </w:p>
+        </w:tc>
+        <w:tc>
+          <w:tcPr>
+            <w:tcW w:w="1016" w:type="dxa"/>
+            <w:tcBorders>
+              <w:top w:val="single" w:sz="4" w:space="0" w:color="000000"/>
+              <w:left w:val="single" w:sz="4" w:space="0" w:color="000000"/>
+              <w:bottom w:val="single" w:sz="4" w:space="0" w:color="000000"/>
+            </w:tcBorders>
+            <w:vAlign w:val="bottom"/>
+          </w:tcPr>
+          <w:p>
+            <w:pPr>
+              <w:pStyle w:val="Normal"/>
+              <w:widowControl w:val="false"/>
+              <w:spacing w:lineRule="auto" w:line="180"/>
+              <w:jc w:val="center"/>
+              <w:rPr>
+                <w:color w:val="000000"/>
+                <w:sz w:val="16"/>
+                <w:szCs w:val="16"/>
+              </w:rPr>
+            </w:pPr>
+            <w:r>
+              <w:rPr>
+                <w:color w:val="000000"/>
+                <w:sz w:val="16"/>
+                <w:szCs w:val="16"/>
+              </w:rPr>
+            </w:r>
+          </w:p>
+        </w:tc>
+        <w:tc>
+          <w:tcPr>
+            <w:tcW w:w="1016" w:type="dxa"/>
+            <w:tcBorders>
+              <w:top w:val="single" w:sz="4" w:space="0" w:color="000000"/>
+              <w:left w:val="single" w:sz="4" w:space="0" w:color="000000"/>
+              <w:bottom w:val="single" w:sz="4" w:space="0" w:color="000000"/>
+            </w:tcBorders>
+            <w:vAlign w:val="bottom"/>
+          </w:tcPr>
+          <w:p>
+            <w:pPr>
+              <w:pStyle w:val="Normal"/>
+              <w:widowControl w:val="false"/>
+              <w:spacing w:lineRule="auto" w:line="180"/>
+              <w:jc w:val="center"/>
+              <w:rPr>
+                <w:color w:val="000000"/>
+                <w:sz w:val="16"/>
+                <w:szCs w:val="16"/>
+              </w:rPr>
+            </w:pPr>
+            <w:r>
+              <w:rPr>
+                <w:rFonts w:eastAsia="arial" w:ascii="arial" w:hAnsi="arial"/>
+                <w:color w:val="000000"/>
+                <w:sz w:val="16"/>
+                <w:szCs w:val="16"/>
+              </w:rPr>
+              <w:t>Exterior</w:t>
+            </w:r>
+          </w:p>
+          <w:p>
+            <w:pPr>
+              <w:pStyle w:val="Normal"/>
+              <w:widowControl w:val="false"/>
+              <w:spacing w:lineRule="auto" w:line="180"/>
+              <w:jc w:val="center"/>
+              <w:rPr>
+                <w:color w:val="000000"/>
+                <w:sz w:val="16"/>
+                <w:szCs w:val="16"/>
+              </w:rPr>
+            </w:pPr>
+            <w:r>
+              <w:rPr>
+                <w:rFonts w:eastAsia="arial" w:ascii="arial" w:hAnsi="arial"/>
+                <w:color w:val="000000"/>
+                <w:sz w:val="16"/>
+                <w:szCs w:val="16"/>
+              </w:rPr>
+              <w:t>Camera</w:t>
+            </w:r>
+          </w:p>
+        </w:tc>
+        <w:tc>
+          <w:tcPr>
+            <w:tcW w:w="1029" w:type="dxa"/>
+            <w:tcBorders>
+              <w:top w:val="single" w:sz="4" w:space="0" w:color="000000"/>
+              <w:left w:val="single" w:sz="4" w:space="0" w:color="000000"/>
+              <w:bottom w:val="single" w:sz="4" w:space="0" w:color="000000"/>
+              <w:right w:val="single" w:sz="4" w:space="0" w:color="000000"/>
+            </w:tcBorders>
+            <w:vAlign w:val="bottom"/>
+          </w:tcPr>
+          <w:p>
+            <w:pPr>
+              <w:pStyle w:val="Normal"/>
+              <w:widowControl w:val="false"/>
+              <w:spacing w:lineRule="auto" w:line="180"/>
+              <w:jc w:val="center"/>
+              <w:rPr>
+                <w:color w:val="000000"/>
+                <w:sz w:val="16"/>
+                <w:szCs w:val="16"/>
+              </w:rPr>
+            </w:pPr>
+            <w:r>
+              <w:rPr>
+                <w:rFonts w:eastAsia="arial" w:ascii="arial" w:hAnsi="arial"/>
+                <w:color w:val="000000"/>
+                <w:sz w:val="16"/>
+                <w:szCs w:val="16"/>
+              </w:rPr>
+              <w:t>Prev</w:t>
+            </w:r>
+          </w:p>
+          <w:p>
+            <w:pPr>
+              <w:pStyle w:val="Normal"/>
+              <w:widowControl w:val="false"/>
+              <w:spacing w:lineRule="auto" w:line="180"/>
+              <w:jc w:val="center"/>
+              <w:rPr>
+                <w:color w:val="000000"/>
+                <w:sz w:val="16"/>
+                <w:szCs w:val="16"/>
+              </w:rPr>
+            </w:pPr>
+            <w:r>
+              <w:rPr>
+                <w:rFonts w:eastAsia="arial" w:ascii="arial" w:hAnsi="arial"/>
+                <w:color w:val="000000"/>
+                <w:sz w:val="16"/>
+                <w:szCs w:val="16"/>
+              </w:rPr>
+              <w:t>Cab Cam</w:t>
+            </w:r>
+          </w:p>
+        </w:tc>
+      </w:tr>
+    </w:tbl>
+    <w:p>
+      <w:pPr>
+        <w:pStyle w:val="Normal"/>
+        <w:bidi w:val="0"/>
+        <w:rPr>
+          <w:color w:val="000000"/>
+          <w:sz w:val="16"/>
+          <w:szCs w:val="16"/>
+        </w:rPr>
+      </w:pPr>
+      <w:r>
+        <w:rPr>
+          <w:color w:val="000000"/>
+          <w:sz w:val="16"/>
+          <w:szCs w:val="16"/>
+        </w:rPr>
+      </w:r>
+    </w:p>
+    <w:p>
+      <w:pPr>
+        <w:pStyle w:val="Normal"/>
+        <w:rPr>
+          <w:color w:val="000000"/>
+          <w:sz w:val="16"/>
+          <w:szCs w:val="16"/>
+        </w:rPr>
+      </w:pPr>
+      <w:r>
+        <w:rPr>
+          <w:color w:val="000000"/>
+          <w:sz w:val="16"/>
+          <w:szCs w:val="16"/>
+        </w:rPr>
+        <w:tab/>
+        <w:t xml:space="preserve">       </w:t>
+      </w:r>
+      <w:r>
+        <w:rPr>
+          <w:rFonts w:eastAsia="arial" w:ascii="arial" w:hAnsi="arial"/>
+          <w:color w:val="000000"/>
+          <w:sz w:val="16"/>
+          <w:szCs w:val="16"/>
+        </w:rPr>
+        <w:t xml:space="preserve">    DB BR 463 </w:t>
+      </w:r>
+      <w:r>
+        <w:rPr>
+          <w:rFonts w:eastAsia="arial" w:ascii="arial" w:hAnsi="arial"/>
+          <w:color w:val="000000"/>
+          <w:sz w:val="16"/>
+          <w:szCs w:val="16"/>
+        </w:rPr>
+        <w:t>Diesel</w:t>
+      </w:r>
+      <w:r>
+        <w:rPr>
+          <w:rFonts w:eastAsia="arial" w:ascii="arial" w:hAnsi="arial"/>
+          <w:color w:val="000000"/>
+          <w:sz w:val="16"/>
+          <w:szCs w:val="16"/>
+        </w:rPr>
+        <w:t>-1</w:t>
+      </w:r>
+    </w:p>
+    <w:tbl>
+      <w:tblPr>
+        <w:tblW w:w="14248" w:type="dxa"/>
+        <w:jc w:val="left"/>
+        <w:tblInd w:w="-5" w:type="dxa"/>
+        <w:tblLayout w:type="fixed"/>
+        <w:tblCellMar>
+          <w:top w:w="0" w:type="dxa"/>
+          <w:left w:w="108" w:type="dxa"/>
+          <w:bottom w:w="0" w:type="dxa"/>
+          <w:right w:w="108" w:type="dxa"/>
+        </w:tblCellMar>
+        <w:tblLook w:firstRow="1" w:noVBand="1" w:lastRow="0" w:firstColumn="1" w:lastColumn="0" w:noHBand="0" w:val="04a0"/>
+      </w:tblPr>
+      <w:tblGrid>
+        <w:gridCol w:w="1017"/>
+        <w:gridCol w:w="1019"/>
+        <w:gridCol w:w="1014"/>
+        <w:gridCol w:w="1016"/>
+        <w:gridCol w:w="1020"/>
+        <w:gridCol w:w="1016"/>
+        <w:gridCol w:w="1016"/>
+        <w:gridCol w:w="1017"/>
+        <w:gridCol w:w="1016"/>
+        <w:gridCol w:w="1020"/>
+        <w:gridCol w:w="1016"/>
+        <w:gridCol w:w="1016"/>
+        <w:gridCol w:w="1016"/>
+        <w:gridCol w:w="1029"/>
+      </w:tblGrid>
+      <w:tr>
+        <w:trPr>
+          <w:trHeight w:val="440" w:hRule="exact"/>
+          <w:cantSplit w:val="true"/>
+        </w:trPr>
+        <w:tc>
+          <w:tcPr>
+            <w:tcW w:w="1017" w:type="dxa"/>
+            <w:tcBorders>
+              <w:top w:val="single" w:sz="4" w:space="0" w:color="000000"/>
+              <w:left w:val="single" w:sz="4" w:space="0" w:color="000000"/>
+              <w:bottom w:val="single" w:sz="4" w:space="0" w:color="000000"/>
+            </w:tcBorders>
+            <w:vAlign w:val="bottom"/>
+          </w:tcPr>
+          <w:p>
+            <w:pPr>
+              <w:pStyle w:val="Normal"/>
+              <w:widowControl w:val="false"/>
+              <w:spacing w:lineRule="auto" w:line="180" w:before="0" w:after="60"/>
+              <w:jc w:val="center"/>
+              <w:rPr>
+                <w:color w:val="000000"/>
+                <w:sz w:val="16"/>
+                <w:szCs w:val="16"/>
+              </w:rPr>
+            </w:pPr>
+            <w:r>
+              <w:rPr>
+                <w:rFonts w:eastAsia="arial" w:ascii="arial" w:hAnsi="arial"/>
+                <w:b/>
+                <w:color w:val="000000"/>
+                <w:sz w:val="16"/>
+                <w:szCs w:val="16"/>
+              </w:rPr>
+              <w:t>Pause</w:t>
+            </w:r>
+          </w:p>
+        </w:tc>
+        <w:tc>
+          <w:tcPr>
+            <w:tcW w:w="1019" w:type="dxa"/>
+            <w:tcBorders>
+              <w:top w:val="single" w:sz="4" w:space="0" w:color="000000"/>
+              <w:left w:val="single" w:sz="4" w:space="0" w:color="000000"/>
+              <w:bottom w:val="single" w:sz="4" w:space="0" w:color="000000"/>
+            </w:tcBorders>
+            <w:vAlign w:val="bottom"/>
+          </w:tcPr>
+          <w:p>
+            <w:pPr>
+              <w:pStyle w:val="Normal"/>
+              <w:widowControl w:val="false"/>
+              <w:spacing w:lineRule="auto" w:line="180"/>
+              <w:jc w:val="center"/>
+              <w:rPr>
+                <w:color w:val="000000"/>
+                <w:sz w:val="16"/>
+                <w:szCs w:val="16"/>
+              </w:rPr>
+            </w:pPr>
+            <w:r>
+              <w:rPr>
+                <w:rFonts w:eastAsia="arial" w:ascii="arial" w:hAnsi="arial"/>
+                <w:color w:val="000000"/>
+                <w:sz w:val="16"/>
+                <w:szCs w:val="16"/>
+              </w:rPr>
+              <w:t>Reverser</w:t>
+            </w:r>
+          </w:p>
+          <w:p>
+            <w:pPr>
+              <w:pStyle w:val="Normal"/>
+              <w:widowControl w:val="false"/>
+              <w:spacing w:lineRule="auto" w:line="180"/>
+              <w:jc w:val="center"/>
+              <w:rPr>
+                <w:color w:val="000000"/>
+                <w:sz w:val="16"/>
+                <w:szCs w:val="16"/>
+              </w:rPr>
+            </w:pPr>
+            <w:r>
+              <w:rPr>
+                <w:rFonts w:eastAsia="arial" w:ascii="arial" w:hAnsi="arial"/>
+                <w:color w:val="000000"/>
+                <w:sz w:val="16"/>
+                <w:szCs w:val="16"/>
+              </w:rPr>
+              <w:t>Handle</w:t>
+            </w:r>
+          </w:p>
+        </w:tc>
+        <w:tc>
+          <w:tcPr>
+            <w:tcW w:w="1014" w:type="dxa"/>
+            <w:tcBorders>
+              <w:top w:val="single" w:sz="4" w:space="0" w:color="000000"/>
+              <w:left w:val="single" w:sz="4" w:space="0" w:color="000000"/>
+              <w:bottom w:val="single" w:sz="4" w:space="0" w:color="000000"/>
+            </w:tcBorders>
+            <w:vAlign w:val="bottom"/>
+          </w:tcPr>
+          <w:p>
+            <w:pPr>
+              <w:pStyle w:val="Normal"/>
+              <w:widowControl w:val="false"/>
+              <w:spacing w:lineRule="auto" w:line="180"/>
+              <w:jc w:val="center"/>
+              <w:rPr>
+                <w:color w:val="000000"/>
+                <w:sz w:val="16"/>
+                <w:szCs w:val="16"/>
+              </w:rPr>
+            </w:pPr>
+            <w:r>
+              <w:rPr>
+                <w:color w:val="000000"/>
+                <w:sz w:val="16"/>
+                <w:szCs w:val="16"/>
+              </w:rPr>
+              <w:t>MCB Close</w:t>
+            </w:r>
+          </w:p>
+        </w:tc>
+        <w:tc>
+          <w:tcPr>
+            <w:tcW w:w="1016" w:type="dxa"/>
+            <w:tcBorders>
+              <w:top w:val="single" w:sz="4" w:space="0" w:color="000000"/>
+              <w:left w:val="single" w:sz="4" w:space="0" w:color="000000"/>
+              <w:bottom w:val="single" w:sz="4" w:space="0" w:color="000000"/>
+            </w:tcBorders>
+            <w:vAlign w:val="bottom"/>
+          </w:tcPr>
+          <w:p>
+            <w:pPr>
+              <w:pStyle w:val="Normal"/>
+              <w:widowControl w:val="false"/>
+              <w:spacing w:lineRule="auto" w:line="180"/>
+              <w:jc w:val="center"/>
+              <w:rPr>
+                <w:sz w:val="16"/>
+                <w:szCs w:val="16"/>
+              </w:rPr>
+            </w:pPr>
+            <w:r>
+              <w:rPr>
+                <w:rFonts w:eastAsia="arial" w:ascii="arial" w:hAnsi="arial"/>
+                <w:color w:val="000000"/>
+                <w:sz w:val="16"/>
+                <w:szCs w:val="16"/>
+              </w:rPr>
+              <w:t>PZB/LZB</w:t>
+            </w:r>
+          </w:p>
+        </w:tc>
+        <w:tc>
+          <w:tcPr>
+            <w:tcW w:w="1020" w:type="dxa"/>
+            <w:tcBorders>
+              <w:top w:val="single" w:sz="4" w:space="0" w:color="000000"/>
+              <w:left w:val="single" w:sz="4" w:space="0" w:color="000000"/>
+              <w:bottom w:val="single" w:sz="4" w:space="0" w:color="000000"/>
+            </w:tcBorders>
+            <w:vAlign w:val="bottom"/>
+          </w:tcPr>
+          <w:p>
+            <w:pPr>
+              <w:pStyle w:val="Normal"/>
+              <w:widowControl w:val="false"/>
+              <w:spacing w:lineRule="auto" w:line="180"/>
+              <w:jc w:val="center"/>
+              <w:rPr>
+                <w:color w:val="000000"/>
+                <w:sz w:val="16"/>
+                <w:szCs w:val="16"/>
+              </w:rPr>
+            </w:pPr>
+            <w:r>
+              <w:rPr>
+                <w:rFonts w:eastAsia="arial" w:ascii="arial" w:hAnsi="arial"/>
+                <w:color w:val="000000"/>
+                <w:sz w:val="16"/>
+                <w:szCs w:val="16"/>
+              </w:rPr>
+              <w:t xml:space="preserve">Transmission </w:t>
+            </w:r>
+            <w:r>
+              <w:rPr>
+                <w:rFonts w:eastAsia="arial" w:ascii="arial" w:hAnsi="arial"/>
+                <w:color w:val="000000"/>
+                <w:sz w:val="16"/>
+                <w:szCs w:val="16"/>
+              </w:rPr>
+              <w:t>On</w:t>
+            </w:r>
+          </w:p>
+        </w:tc>
+        <w:tc>
+          <w:tcPr>
+            <w:tcW w:w="1016" w:type="dxa"/>
+            <w:tcBorders>
+              <w:top w:val="single" w:sz="4" w:space="0" w:color="000000"/>
+              <w:left w:val="single" w:sz="4" w:space="0" w:color="000000"/>
+              <w:bottom w:val="single" w:sz="4" w:space="0" w:color="000000"/>
+            </w:tcBorders>
+            <w:vAlign w:val="bottom"/>
+          </w:tcPr>
+          <w:p>
+            <w:pPr>
+              <w:pStyle w:val="Normal"/>
+              <w:widowControl w:val="false"/>
+              <w:jc w:val="center"/>
+              <w:rPr>
+                <w:color w:val="000000"/>
+                <w:sz w:val="16"/>
+                <w:szCs w:val="16"/>
+              </w:rPr>
+            </w:pPr>
+            <w:r>
+              <w:rPr>
+                <w:color w:val="000000"/>
+                <w:sz w:val="16"/>
+                <w:szCs w:val="16"/>
+              </w:rPr>
+              <w:t>Train Supply On</w:t>
+            </w:r>
+          </w:p>
+        </w:tc>
+        <w:tc>
+          <w:tcPr>
+            <w:tcW w:w="1016" w:type="dxa"/>
+            <w:tcBorders>
+              <w:top w:val="single" w:sz="4" w:space="0" w:color="000000"/>
+              <w:left w:val="single" w:sz="4" w:space="0" w:color="000000"/>
+              <w:bottom w:val="single" w:sz="4" w:space="0" w:color="000000"/>
+            </w:tcBorders>
+            <w:vAlign w:val="bottom"/>
+          </w:tcPr>
+          <w:p>
+            <w:pPr>
+              <w:pStyle w:val="Normal"/>
+              <w:widowControl w:val="false"/>
+              <w:jc w:val="center"/>
+              <w:rPr>
+                <w:sz w:val="16"/>
+                <w:szCs w:val="16"/>
+              </w:rPr>
+            </w:pPr>
+            <w:r>
+              <w:rPr>
+                <w:rFonts w:eastAsia="arial" w:ascii="arial" w:hAnsi="arial"/>
+                <w:color w:val="000000"/>
+                <w:sz w:val="16"/>
+                <w:szCs w:val="16"/>
+              </w:rPr>
+              <w:t>Train Light On</w:t>
+            </w:r>
+          </w:p>
+        </w:tc>
+        <w:tc>
+          <w:tcPr>
+            <w:tcW w:w="1017" w:type="dxa"/>
+            <w:tcBorders>
+              <w:top w:val="single" w:sz="4" w:space="0" w:color="000000"/>
+              <w:left w:val="single" w:sz="4" w:space="0" w:color="000000"/>
+              <w:bottom w:val="single" w:sz="4" w:space="0" w:color="000000"/>
+            </w:tcBorders>
+            <w:vAlign w:val="bottom"/>
+          </w:tcPr>
+          <w:p>
+            <w:pPr>
+              <w:pStyle w:val="Normal"/>
+              <w:widowControl w:val="false"/>
+              <w:jc w:val="center"/>
+              <w:rPr>
+                <w:rFonts w:ascii="arial" w:hAnsi="arial" w:eastAsia="arial"/>
+                <w:color w:val="000000"/>
+                <w:sz w:val="16"/>
+                <w:szCs w:val="16"/>
+              </w:rPr>
+            </w:pPr>
+            <w:r>
+              <w:rPr/>
+            </w:r>
+          </w:p>
+        </w:tc>
+        <w:tc>
+          <w:tcPr>
+            <w:tcW w:w="1016" w:type="dxa"/>
+            <w:tcBorders>
+              <w:top w:val="single" w:sz="4" w:space="0" w:color="000000"/>
+              <w:left w:val="single" w:sz="4" w:space="0" w:color="000000"/>
+              <w:bottom w:val="single" w:sz="4" w:space="0" w:color="000000"/>
+            </w:tcBorders>
+            <w:vAlign w:val="bottom"/>
+          </w:tcPr>
+          <w:p>
+            <w:pPr>
+              <w:pStyle w:val="Normal"/>
+              <w:widowControl w:val="false"/>
+              <w:jc w:val="center"/>
+              <w:rPr>
+                <w:rFonts w:ascii="arial" w:hAnsi="arial" w:eastAsia="arial"/>
+                <w:color w:val="000000"/>
+                <w:sz w:val="16"/>
+                <w:szCs w:val="16"/>
+              </w:rPr>
+            </w:pPr>
+            <w:r>
+              <w:rPr>
+                <w:rFonts w:eastAsia="arial" w:ascii="arial" w:hAnsi="arial"/>
+                <w:color w:val="000000"/>
+                <w:sz w:val="16"/>
+                <w:szCs w:val="16"/>
+              </w:rPr>
+              <w:t>Gauge Light</w:t>
+            </w:r>
+          </w:p>
+        </w:tc>
+        <w:tc>
+          <w:tcPr>
+            <w:tcW w:w="1020" w:type="dxa"/>
+            <w:tcBorders>
+              <w:top w:val="single" w:sz="4" w:space="0" w:color="000000"/>
+              <w:left w:val="single" w:sz="4" w:space="0" w:color="000000"/>
+              <w:bottom w:val="single" w:sz="4" w:space="0" w:color="000000"/>
+            </w:tcBorders>
+            <w:vAlign w:val="bottom"/>
+          </w:tcPr>
+          <w:p>
+            <w:pPr>
+              <w:pStyle w:val="Normal"/>
+              <w:widowControl w:val="false"/>
+              <w:jc w:val="center"/>
+              <w:rPr>
+                <w:rFonts w:ascii="arial" w:hAnsi="arial" w:eastAsia="arial"/>
+                <w:color w:val="000000"/>
+                <w:sz w:val="16"/>
+                <w:szCs w:val="16"/>
+              </w:rPr>
+            </w:pPr>
+            <w:r>
+              <w:rPr>
+                <w:rFonts w:eastAsia="arial" w:ascii="arial" w:hAnsi="arial"/>
+                <w:color w:val="000000"/>
+                <w:sz w:val="16"/>
+                <w:szCs w:val="16"/>
+              </w:rPr>
+              <w:t>Signal Light HL</w:t>
+            </w:r>
+          </w:p>
+        </w:tc>
+        <w:tc>
+          <w:tcPr>
+            <w:tcW w:w="1016" w:type="dxa"/>
+            <w:tcBorders>
+              <w:top w:val="single" w:sz="4" w:space="0" w:color="000000"/>
+              <w:left w:val="single" w:sz="4" w:space="0" w:color="000000"/>
+              <w:bottom w:val="single" w:sz="4" w:space="0" w:color="000000"/>
+            </w:tcBorders>
+            <w:vAlign w:val="bottom"/>
+          </w:tcPr>
+          <w:p>
+            <w:pPr>
+              <w:pStyle w:val="Normal"/>
+              <w:widowControl w:val="false"/>
+              <w:spacing w:lineRule="auto" w:line="180"/>
+              <w:jc w:val="center"/>
+              <w:rPr>
+                <w:color w:val="000000"/>
+                <w:sz w:val="16"/>
+                <w:szCs w:val="16"/>
+              </w:rPr>
+            </w:pPr>
+            <w:r>
+              <w:rPr>
+                <w:rFonts w:eastAsia="arial" w:ascii="arial" w:hAnsi="arial"/>
+                <w:color w:val="000000"/>
+                <w:sz w:val="16"/>
+                <w:szCs w:val="16"/>
+              </w:rPr>
+              <w:t>Cab Light</w:t>
+            </w:r>
+          </w:p>
+        </w:tc>
+        <w:tc>
+          <w:tcPr>
+            <w:tcW w:w="1016" w:type="dxa"/>
+            <w:tcBorders>
+              <w:top w:val="single" w:sz="4" w:space="0" w:color="000000"/>
+              <w:left w:val="single" w:sz="4" w:space="0" w:color="000000"/>
+              <w:bottom w:val="single" w:sz="4" w:space="0" w:color="000000"/>
+            </w:tcBorders>
+            <w:vAlign w:val="bottom"/>
+          </w:tcPr>
+          <w:p>
+            <w:pPr>
+              <w:pStyle w:val="Normal"/>
+              <w:widowControl w:val="false"/>
+              <w:spacing w:lineRule="auto" w:line="180"/>
+              <w:jc w:val="center"/>
+              <w:rPr>
+                <w:color w:val="000000"/>
+                <w:sz w:val="16"/>
+                <w:szCs w:val="16"/>
+              </w:rPr>
+            </w:pPr>
+            <w:r>
+              <w:rPr>
+                <w:rFonts w:eastAsia="arial" w:ascii="arial" w:hAnsi="arial"/>
+                <w:color w:val="000000"/>
+                <w:sz w:val="16"/>
+                <w:szCs w:val="16"/>
+              </w:rPr>
+              <w:t>Emer.</w:t>
+            </w:r>
+          </w:p>
+          <w:p>
+            <w:pPr>
+              <w:pStyle w:val="Normal"/>
+              <w:widowControl w:val="false"/>
+              <w:spacing w:lineRule="auto" w:line="180"/>
+              <w:jc w:val="center"/>
+              <w:rPr>
+                <w:color w:val="000000"/>
+                <w:sz w:val="16"/>
+                <w:szCs w:val="16"/>
+              </w:rPr>
+            </w:pPr>
+            <w:r>
+              <w:rPr>
+                <w:rFonts w:eastAsia="arial" w:ascii="arial" w:hAnsi="arial"/>
+                <w:color w:val="000000"/>
+                <w:sz w:val="16"/>
+                <w:szCs w:val="16"/>
+              </w:rPr>
+              <w:t>Brake</w:t>
+            </w:r>
+          </w:p>
+        </w:tc>
+        <w:tc>
+          <w:tcPr>
+            <w:tcW w:w="1016" w:type="dxa"/>
+            <w:tcBorders>
+              <w:top w:val="single" w:sz="4" w:space="0" w:color="000000"/>
+              <w:left w:val="single" w:sz="4" w:space="0" w:color="000000"/>
+              <w:bottom w:val="single" w:sz="4" w:space="0" w:color="000000"/>
+            </w:tcBorders>
+            <w:vAlign w:val="bottom"/>
+          </w:tcPr>
+          <w:p>
+            <w:pPr>
+              <w:pStyle w:val="Normal"/>
+              <w:widowControl w:val="false"/>
+              <w:spacing w:lineRule="auto" w:line="180"/>
+              <w:jc w:val="center"/>
+              <w:rPr>
+                <w:color w:val="000000"/>
+                <w:sz w:val="16"/>
+                <w:szCs w:val="16"/>
+              </w:rPr>
+            </w:pPr>
+            <w:r>
+              <w:rPr>
+                <w:rFonts w:eastAsia="arial" w:ascii="arial" w:hAnsi="arial"/>
+                <w:color w:val="000000"/>
+                <w:sz w:val="16"/>
+                <w:szCs w:val="16"/>
+              </w:rPr>
+              <w:t>1P Cam</w:t>
+            </w:r>
+          </w:p>
+        </w:tc>
+        <w:tc>
+          <w:tcPr>
+            <w:tcW w:w="1029" w:type="dxa"/>
+            <w:tcBorders>
+              <w:top w:val="single" w:sz="4" w:space="0" w:color="000000"/>
+              <w:left w:val="single" w:sz="4" w:space="0" w:color="000000"/>
+              <w:bottom w:val="single" w:sz="4" w:space="0" w:color="000000"/>
+              <w:right w:val="single" w:sz="4" w:space="0" w:color="000000"/>
+            </w:tcBorders>
+            <w:vAlign w:val="bottom"/>
+          </w:tcPr>
+          <w:p>
+            <w:pPr>
+              <w:pStyle w:val="Normal"/>
+              <w:widowControl w:val="false"/>
+              <w:spacing w:lineRule="auto" w:line="180"/>
+              <w:jc w:val="center"/>
+              <w:rPr>
+                <w:color w:val="000000"/>
+                <w:sz w:val="16"/>
+                <w:szCs w:val="16"/>
+              </w:rPr>
+            </w:pPr>
+            <w:r>
+              <w:rPr>
+                <w:rFonts w:eastAsia="arial" w:ascii="arial" w:hAnsi="arial"/>
+                <w:color w:val="000000"/>
+                <w:sz w:val="16"/>
+                <w:szCs w:val="16"/>
+              </w:rPr>
+              <w:t>Next</w:t>
+            </w:r>
+          </w:p>
+          <w:p>
+            <w:pPr>
+              <w:pStyle w:val="Normal"/>
+              <w:widowControl w:val="false"/>
+              <w:spacing w:lineRule="auto" w:line="180"/>
+              <w:jc w:val="center"/>
+              <w:rPr>
+                <w:color w:val="000000"/>
+                <w:sz w:val="16"/>
+                <w:szCs w:val="16"/>
+              </w:rPr>
+            </w:pPr>
+            <w:r>
+              <w:rPr>
+                <w:rFonts w:eastAsia="arial" w:ascii="arial" w:hAnsi="arial"/>
+                <w:color w:val="000000"/>
+                <w:sz w:val="16"/>
+                <w:szCs w:val="16"/>
+              </w:rPr>
+              <w:t>Cab Cam</w:t>
+            </w:r>
+          </w:p>
+        </w:tc>
+      </w:tr>
+    </w:tbl>
+    <w:p>
+      <w:pPr>
+        <w:pStyle w:val="Normal"/>
+        <w:rPr>
+          <w:rFonts w:ascii="arial" w:hAnsi="arial" w:eastAsia="arial"/>
+          <w:color w:val="000000"/>
+          <w:sz w:val="16"/>
+          <w:szCs w:val="16"/>
+        </w:rPr>
+      </w:pPr>
+      <w:r>
+        <w:rPr>
+          <w:rFonts w:eastAsia="arial" w:ascii="arial" w:hAnsi="arial"/>
+          <w:color w:val="000000"/>
+          <w:sz w:val="16"/>
+          <w:szCs w:val="16"/>
+        </w:rPr>
+      </w:r>
+    </w:p>
+    <w:p>
+      <w:pPr>
+        <w:pStyle w:val="Normal"/>
+        <w:rPr>
+          <w:color w:val="000000"/>
+          <w:sz w:val="16"/>
+          <w:szCs w:val="16"/>
+        </w:rPr>
+      </w:pPr>
+      <w:r>
+        <w:rPr>
+          <w:rFonts w:eastAsia="arial" w:ascii="arial" w:hAnsi="arial"/>
+          <w:color w:val="000000"/>
+          <w:sz w:val="16"/>
+          <w:szCs w:val="16"/>
+        </w:rPr>
+        <w:tab/>
+        <w:t xml:space="preserve">           DB BR 463 </w:t>
+      </w:r>
+      <w:r>
+        <w:rPr>
+          <w:rFonts w:eastAsia="arial" w:ascii="arial" w:hAnsi="arial"/>
+          <w:color w:val="000000"/>
+          <w:sz w:val="16"/>
+          <w:szCs w:val="16"/>
+        </w:rPr>
+        <w:t>Diesel</w:t>
       </w:r>
       <w:r>
         <w:rPr>
@@ -23744,6 +27406,102 @@
             <w:pPr>
               <w:pStyle w:val="Normal"/>
               <w:widowControl w:val="false"/>
+              <w:spacing w:lineRule="auto" w:line="180"/>
+              <w:jc w:val="center"/>
+              <w:rPr>
+                <w:color w:val="000000"/>
+                <w:sz w:val="16"/>
+                <w:szCs w:val="16"/>
+              </w:rPr>
+            </w:pPr>
+            <w:r>
+              <w:rPr>
+                <w:rFonts w:eastAsia="arial" w:ascii="arial" w:hAnsi="arial"/>
+                <w:color w:val="000000"/>
+                <w:sz w:val="16"/>
+                <w:szCs w:val="16"/>
+              </w:rPr>
+              <w:t>Transmission Off</w:t>
+            </w:r>
+          </w:p>
+        </w:tc>
+        <w:tc>
+          <w:tcPr>
+            <w:tcW w:w="1016" w:type="dxa"/>
+            <w:tcBorders>
+              <w:top w:val="single" w:sz="4" w:space="0" w:color="000000"/>
+              <w:left w:val="single" w:sz="4" w:space="0" w:color="000000"/>
+              <w:bottom w:val="single" w:sz="4" w:space="0" w:color="000000"/>
+            </w:tcBorders>
+            <w:vAlign w:val="bottom"/>
+          </w:tcPr>
+          <w:p>
+            <w:pPr>
+              <w:pStyle w:val="Normal"/>
+              <w:widowControl w:val="false"/>
+              <w:spacing w:lineRule="auto" w:line="180"/>
+              <w:jc w:val="center"/>
+              <w:rPr>
+                <w:sz w:val="16"/>
+                <w:szCs w:val="16"/>
+              </w:rPr>
+            </w:pPr>
+            <w:r>
+              <w:rPr>
+                <w:rFonts w:eastAsia="arial" w:ascii="arial" w:hAnsi="arial"/>
+                <w:color w:val="000000"/>
+                <w:sz w:val="16"/>
+                <w:szCs w:val="16"/>
+              </w:rPr>
+              <w:t>Train Supply Off</w:t>
+            </w:r>
+          </w:p>
+        </w:tc>
+        <w:tc>
+          <w:tcPr>
+            <w:tcW w:w="1016" w:type="dxa"/>
+            <w:tcBorders>
+              <w:top w:val="single" w:sz="4" w:space="0" w:color="000000"/>
+              <w:left w:val="single" w:sz="4" w:space="0" w:color="000000"/>
+              <w:bottom w:val="single" w:sz="4" w:space="0" w:color="000000"/>
+            </w:tcBorders>
+            <w:vAlign w:val="bottom"/>
+          </w:tcPr>
+          <w:p>
+            <w:pPr>
+              <w:pStyle w:val="Normal"/>
+              <w:widowControl w:val="false"/>
+              <w:jc w:val="center"/>
+              <w:rPr>
+                <w:sz w:val="16"/>
+                <w:szCs w:val="16"/>
+              </w:rPr>
+            </w:pPr>
+            <w:r>
+              <w:rPr>
+                <w:rFonts w:eastAsia="arial" w:ascii="arial" w:hAnsi="arial"/>
+                <w:color w:val="000000"/>
+                <w:sz w:val="16"/>
+                <w:szCs w:val="16"/>
+              </w:rPr>
+              <w:t>Train Light Off</w:t>
+            </w:r>
+          </w:p>
+        </w:tc>
+        <w:tc>
+          <w:tcPr>
+            <w:tcW w:w="1017" w:type="dxa"/>
+            <w:tcBorders>
+              <w:top w:val="single" w:sz="4" w:space="0" w:color="000000"/>
+              <w:left w:val="single" w:sz="4" w:space="0" w:color="000000"/>
+              <w:bottom w:val="single" w:sz="4" w:space="0" w:color="000000"/>
+            </w:tcBorders>
+            <w:vAlign w:val="bottom"/>
+          </w:tcPr>
+          <w:p>
+            <w:pPr>
+              <w:pStyle w:val="Normal"/>
+              <w:widowControl w:val="false"/>
               <w:jc w:val="center"/>
               <w:rPr>
                 <w:rFonts w:ascii="arial" w:hAnsi="arial" w:eastAsia="arial"/>
@@ -23753,15 +27511,20 @@
               </w:rPr>
             </w:pPr>
             <w:r>
-              <w:rPr>
-                <w:rFonts w:eastAsia="arial" w:ascii="arial" w:hAnsi="arial"/>
-                <w:color w:val="000000"/>
-                <w:sz w:val="16"/>
-                <w:szCs w:val="16"/>
-              </w:rPr>
-              <w:t>Panto.</w:t>
-            </w:r>
-          </w:p>
+              <w:rPr/>
+            </w:r>
+          </w:p>
+        </w:tc>
+        <w:tc>
+          <w:tcPr>
+            <w:tcW w:w="1016" w:type="dxa"/>
+            <w:tcBorders>
+              <w:top w:val="single" w:sz="4" w:space="0" w:color="000000"/>
+              <w:left w:val="single" w:sz="4" w:space="0" w:color="000000"/>
+              <w:bottom w:val="single" w:sz="4" w:space="0" w:color="000000"/>
+            </w:tcBorders>
+            <w:vAlign w:val="bottom"/>
+          </w:tcPr>
           <w:p>
             <w:pPr>
               <w:pStyle w:val="Normal"/>
@@ -23781,76 +27544,12 @@
                 <w:sz w:val="16"/>
                 <w:szCs w:val="16"/>
               </w:rPr>
-              <w:t>Low</w:t>
-            </w:r>
-          </w:p>
-        </w:tc>
-        <w:tc>
-          <w:tcPr>
-            <w:tcW w:w="1016" w:type="dxa"/>
-            <w:tcBorders>
-              <w:top w:val="single" w:sz="4" w:space="0" w:color="000000"/>
-              <w:left w:val="single" w:sz="4" w:space="0" w:color="000000"/>
-              <w:bottom w:val="single" w:sz="4" w:space="0" w:color="000000"/>
-            </w:tcBorders>
-            <w:vAlign w:val="bottom"/>
-          </w:tcPr>
-          <w:p>
-            <w:pPr>
-              <w:pStyle w:val="Normal"/>
-              <w:widowControl w:val="false"/>
-              <w:spacing w:lineRule="auto" w:line="180"/>
-              <w:jc w:val="center"/>
-              <w:rPr>
-                <w:sz w:val="16"/>
-                <w:szCs w:val="16"/>
-              </w:rPr>
-            </w:pPr>
-            <w:r>
-              <w:rPr>
-                <w:rFonts w:eastAsia="arial" w:ascii="arial" w:hAnsi="arial"/>
-                <w:color w:val="000000"/>
-                <w:sz w:val="16"/>
-                <w:szCs w:val="16"/>
-              </w:rPr>
-              <w:t>Train Supply Off</w:t>
-            </w:r>
-          </w:p>
-        </w:tc>
-        <w:tc>
-          <w:tcPr>
-            <w:tcW w:w="1016" w:type="dxa"/>
-            <w:tcBorders>
-              <w:top w:val="single" w:sz="4" w:space="0" w:color="000000"/>
-              <w:left w:val="single" w:sz="4" w:space="0" w:color="000000"/>
-              <w:bottom w:val="single" w:sz="4" w:space="0" w:color="000000"/>
-            </w:tcBorders>
-            <w:vAlign w:val="bottom"/>
-          </w:tcPr>
-          <w:p>
-            <w:pPr>
-              <w:pStyle w:val="Normal"/>
-              <w:widowControl w:val="false"/>
-              <w:jc w:val="center"/>
-              <w:rPr>
-                <w:sz w:val="16"/>
-                <w:szCs w:val="16"/>
-              </w:rPr>
-            </w:pPr>
-            <w:r>
-              <w:rPr>
-                <w:rFonts w:eastAsia="arial" w:ascii="arial" w:hAnsi="arial"/>
-                <w:color w:val="000000"/>
-                <w:sz w:val="16"/>
-                <w:szCs w:val="16"/>
-              </w:rPr>
-              <w:t>Train Light Off</w:t>
-            </w:r>
-          </w:p>
-        </w:tc>
-        <w:tc>
-          <w:tcPr>
-            <w:tcW w:w="1017" w:type="dxa"/>
+            </w:r>
+          </w:p>
+        </w:tc>
+        <w:tc>
+          <w:tcPr>
+            <w:tcW w:w="1020" w:type="dxa"/>
             <w:tcBorders>
               <w:top w:val="single" w:sz="4" w:space="0" w:color="000000"/>
               <w:left w:val="single" w:sz="4" w:space="0" w:color="000000"/>
@@ -23877,72 +27576,6 @@
                 <w:sz w:val="16"/>
                 <w:szCs w:val="16"/>
               </w:rPr>
-              <w:t>Brake Key Off</w:t>
-            </w:r>
-          </w:p>
-        </w:tc>
-        <w:tc>
-          <w:tcPr>
-            <w:tcW w:w="1016" w:type="dxa"/>
-            <w:tcBorders>
-              <w:top w:val="single" w:sz="4" w:space="0" w:color="000000"/>
-              <w:left w:val="single" w:sz="4" w:space="0" w:color="000000"/>
-              <w:bottom w:val="single" w:sz="4" w:space="0" w:color="000000"/>
-            </w:tcBorders>
-            <w:vAlign w:val="bottom"/>
-          </w:tcPr>
-          <w:p>
-            <w:pPr>
-              <w:pStyle w:val="Normal"/>
-              <w:widowControl w:val="false"/>
-              <w:jc w:val="center"/>
-              <w:rPr>
-                <w:rFonts w:ascii="arial" w:hAnsi="arial" w:eastAsia="arial"/>
-                <w:color w:val="000000"/>
-                <w:sz w:val="16"/>
-                <w:szCs w:val="16"/>
-              </w:rPr>
-            </w:pPr>
-            <w:r>
-              <w:rPr>
-                <w:rFonts w:eastAsia="arial" w:ascii="arial" w:hAnsi="arial"/>
-                <w:color w:val="000000"/>
-                <w:sz w:val="16"/>
-                <w:szCs w:val="16"/>
-              </w:rPr>
-              <w:t>Master Light Dw.</w:t>
-            </w:r>
-          </w:p>
-        </w:tc>
-        <w:tc>
-          <w:tcPr>
-            <w:tcW w:w="1020" w:type="dxa"/>
-            <w:tcBorders>
-              <w:top w:val="single" w:sz="4" w:space="0" w:color="000000"/>
-              <w:left w:val="single" w:sz="4" w:space="0" w:color="000000"/>
-              <w:bottom w:val="single" w:sz="4" w:space="0" w:color="000000"/>
-            </w:tcBorders>
-            <w:vAlign w:val="bottom"/>
-          </w:tcPr>
-          <w:p>
-            <w:pPr>
-              <w:pStyle w:val="Normal"/>
-              <w:widowControl w:val="false"/>
-              <w:jc w:val="center"/>
-              <w:rPr>
-                <w:rFonts w:ascii="arial" w:hAnsi="arial" w:eastAsia="arial"/>
-                <w:color w:val="000000"/>
-                <w:sz w:val="16"/>
-                <w:szCs w:val="16"/>
-              </w:rPr>
-            </w:pPr>
-            <w:r>
-              <w:rPr>
-                <w:rFonts w:eastAsia="arial" w:ascii="arial" w:hAnsi="arial"/>
-                <w:color w:val="000000"/>
-                <w:sz w:val="16"/>
-                <w:szCs w:val="16"/>
-              </w:rPr>
               <w:t>Signal Light TL</w:t>
             </w:r>
           </w:p>
@@ -23961,76 +27594,53 @@
             <w:pPr>
               <w:pStyle w:val="Normal"/>
               <w:widowControl w:val="false"/>
-              <w:jc w:val="center"/>
-              <w:rPr>
-                <w:color w:val="000000"/>
-                <w:sz w:val="16"/>
-                <w:szCs w:val="16"/>
-              </w:rPr>
-            </w:pPr>
-            <w:r>
-              <w:rPr>
-                <w:rFonts w:eastAsia="arial" w:ascii="arial" w:hAnsi="arial"/>
-                <w:color w:val="000000"/>
-                <w:sz w:val="16"/>
-                <w:szCs w:val="16"/>
-              </w:rPr>
-              <w:t>Cab Light</w:t>
-            </w:r>
-          </w:p>
-          <w:p>
-            <w:pPr>
-              <w:pStyle w:val="Normal"/>
-              <w:widowControl w:val="false"/>
-              <w:spacing w:lineRule="auto" w:line="180"/>
-              <w:jc w:val="center"/>
-              <w:rPr>
-                <w:color w:val="000000"/>
-                <w:sz w:val="16"/>
-                <w:szCs w:val="16"/>
-              </w:rPr>
-            </w:pPr>
-            <w:r>
-              <w:rPr>
-                <w:rFonts w:eastAsia="arial" w:ascii="arial" w:hAnsi="arial"/>
-                <w:color w:val="000000"/>
-                <w:sz w:val="16"/>
-                <w:szCs w:val="16"/>
-              </w:rPr>
-              <w:t>Cab</w:t>
-            </w:r>
-          </w:p>
-        </w:tc>
-        <w:tc>
-          <w:tcPr>
-            <w:tcW w:w="1016" w:type="dxa"/>
-            <w:tcBorders>
-              <w:top w:val="single" w:sz="4" w:space="0" w:color="000000"/>
-              <w:left w:val="single" w:sz="4" w:space="0" w:color="000000"/>
-              <w:bottom w:val="single" w:sz="4" w:space="0" w:color="000000"/>
-            </w:tcBorders>
-            <w:vAlign w:val="bottom"/>
-          </w:tcPr>
-          <w:p>
-            <w:pPr>
-              <w:pStyle w:val="Normal"/>
-              <w:widowControl w:val="false"/>
-              <w:spacing w:lineRule="auto" w:line="180"/>
-              <w:jc w:val="center"/>
-              <w:rPr>
-                <w:color w:val="000000"/>
-                <w:sz w:val="16"/>
-                <w:szCs w:val="16"/>
-              </w:rPr>
-            </w:pPr>
-            <w:r>
-              <w:rPr>
-                <w:rFonts w:eastAsia="arial" w:ascii="arial" w:hAnsi="arial"/>
-                <w:color w:val="000000"/>
-                <w:sz w:val="16"/>
-                <w:szCs w:val="16"/>
-              </w:rPr>
-              <w:t>Compressor Off</w:t>
+              <w:spacing w:lineRule="auto" w:line="180"/>
+              <w:jc w:val="center"/>
+              <w:rPr>
+                <w:color w:val="000000"/>
+                <w:sz w:val="16"/>
+                <w:szCs w:val="16"/>
+              </w:rPr>
+            </w:pPr>
+            <w:r>
+              <w:rPr>
+                <w:rFonts w:eastAsia="arial" w:ascii="arial" w:hAnsi="arial"/>
+                <w:color w:val="000000"/>
+                <w:sz w:val="16"/>
+                <w:szCs w:val="16"/>
+              </w:rPr>
+              <w:t>Desk Light</w:t>
+            </w:r>
+          </w:p>
+        </w:tc>
+        <w:tc>
+          <w:tcPr>
+            <w:tcW w:w="1016" w:type="dxa"/>
+            <w:tcBorders>
+              <w:top w:val="single" w:sz="4" w:space="0" w:color="000000"/>
+              <w:left w:val="single" w:sz="4" w:space="0" w:color="000000"/>
+              <w:bottom w:val="single" w:sz="4" w:space="0" w:color="000000"/>
+            </w:tcBorders>
+            <w:vAlign w:val="bottom"/>
+          </w:tcPr>
+          <w:p>
+            <w:pPr>
+              <w:pStyle w:val="Normal"/>
+              <w:widowControl w:val="false"/>
+              <w:spacing w:lineRule="auto" w:line="180"/>
+              <w:jc w:val="center"/>
+              <w:rPr>
+                <w:color w:val="000000"/>
+                <w:sz w:val="16"/>
+                <w:szCs w:val="16"/>
+              </w:rPr>
+            </w:pPr>
+            <w:r>
+              <w:rPr>
+                <w:color w:val="000000"/>
+                <w:sz w:val="16"/>
+                <w:szCs w:val="16"/>
+              </w:rPr>
             </w:r>
           </w:p>
         </w:tc>
@@ -24158,11 +27768,7 @@
         </w:rPr>
       </w:pPr>
       <w:r>
-        <w:rPr>
-          <w:color w:val="000000"/>
-          <w:sz w:val="16"/>
-          <w:szCs w:val="16"/>
-        </w:rPr>
+        <w:rPr/>
       </w:r>
     </w:p>
     <w:sectPr>
@@ -25186,13 +28792,13 @@
       <w:rFonts w:ascii="Symbol" w:hAnsi="Symbol" w:cs="Symbol"/>
     </w:rPr>
   </w:style>
-  <w:style w:type="character" w:styleId="user" w:customStyle="1">
-    <w:name w:val="번호 매기기 기호 (user)"/>
+  <w:style w:type="character" w:styleId="Style5" w:customStyle="1">
+    <w:name w:val="번호 매기기 기호"/>
     <w:qFormat/>
     <w:rPr/>
   </w:style>
-  <w:style w:type="character" w:styleId="Style5">
-    <w:name w:val="번호 매기기 기호"/>
+  <w:style w:type="character" w:styleId="user">
+    <w:name w:val="번호 매기기 기호 (user)"/>
     <w:qFormat/>
     <w:rPr/>
   </w:style>
@@ -25206,7 +28812,7 @@
       <w:spacing w:before="240" w:after="120"/>
     </w:pPr>
     <w:rPr>
-      <w:rFonts w:ascii="Liberation Sans" w:hAnsi="Liberation Sans" w:eastAsia="Noto Sans CJK KR" w:cs="Lohit Devanagari"/>
+      <w:rFonts w:ascii="Liberation Sans" w:hAnsi="Liberation Sans" w:eastAsia="Noto Sans KR" w:cs="Arial"/>
       <w:sz w:val="28"/>
       <w:szCs w:val="28"/>
     </w:rPr>
@@ -25243,7 +28849,7 @@
       <w:szCs w:val="24"/>
     </w:rPr>
   </w:style>
-  <w:style w:type="paragraph" w:styleId="Style7" w:customStyle="1">
+  <w:style w:type="paragraph" w:styleId="Style7">
     <w:name w:val="색인"/>
     <w:basedOn w:val="Normal"/>
     <w:qFormat/>
@@ -25251,7 +28857,8 @@
       <w:suppressLineNumbers/>
     </w:pPr>
     <w:rPr>
-      <w:rFonts w:cs="Lohit Devanagari"/>
+      <w:rFonts w:cs="Arial"/>
+      <w:sz w:val="24"/>
     </w:rPr>
   </w:style>
   <w:style w:type="paragraph" w:styleId="user1">
@@ -25264,12 +28871,12 @@
       <w:spacing w:before="240" w:after="120"/>
     </w:pPr>
     <w:rPr>
-      <w:rFonts w:ascii="Liberation Sans" w:hAnsi="Liberation Sans" w:eastAsia="Noto Sans KR" w:cs="Arial"/>
+      <w:rFonts w:ascii="Liberation Sans" w:hAnsi="Liberation Sans" w:eastAsia="Noto Sans CJK KR" w:cs="Lohit Devanagari"/>
       <w:sz w:val="28"/>
       <w:szCs w:val="28"/>
     </w:rPr>
   </w:style>
-  <w:style w:type="paragraph" w:styleId="user2">
+  <w:style w:type="paragraph" w:styleId="user2" w:customStyle="1">
     <w:name w:val="색인 (user)"/>
     <w:basedOn w:val="Normal"/>
     <w:qFormat/>
@@ -25277,8 +28884,7 @@
       <w:suppressLineNumbers/>
     </w:pPr>
     <w:rPr>
-      <w:rFonts w:cs="Arial"/>
-      <w:sz w:val="24"/>
+      <w:rFonts w:cs="Lohit Devanagari"/>
     </w:rPr>
   </w:style>
   <w:style w:type="paragraph" w:styleId="Title">
@@ -25960,8 +29566,8 @@
       <w:szCs w:val="24"/>
     </w:rPr>
   </w:style>
-  <w:style w:type="paragraph" w:styleId="Style8" w:customStyle="1">
-    <w:name w:val="표 내용"/>
+  <w:style w:type="paragraph" w:styleId="user3" w:customStyle="1">
+    <w:name w:val="표 내용 (user)"/>
     <w:basedOn w:val="Normal"/>
     <w:qFormat/>
     <w:pPr>
@@ -25969,9 +29575,9 @@
     </w:pPr>
     <w:rPr/>
   </w:style>
-  <w:style w:type="paragraph" w:styleId="Style9" w:customStyle="1">
-    <w:name w:val="표제목"/>
-    <w:basedOn w:val="Style8"/>
+  <w:style w:type="paragraph" w:styleId="user4" w:customStyle="1">
+    <w:name w:val="표제목 (user)"/>
+    <w:basedOn w:val="user3"/>
     <w:qFormat/>
     <w:pPr>
       <w:jc w:val="center"/>
@@ -25981,8 +29587,8 @@
       <w:bCs/>
     </w:rPr>
   </w:style>
-  <w:style w:type="paragraph" w:styleId="user3">
-    <w:name w:val="표 내용 (user)"/>
+  <w:style w:type="paragraph" w:styleId="Style8">
+    <w:name w:val="표 내용"/>
     <w:basedOn w:val="Normal"/>
     <w:qFormat/>
     <w:pPr>
@@ -25991,9 +29597,9 @@
     </w:pPr>
     <w:rPr/>
   </w:style>
-  <w:style w:type="paragraph" w:styleId="user4">
-    <w:name w:val="표제목 (user)"/>
-    <w:basedOn w:val="user3"/>
+  <w:style w:type="paragraph" w:styleId="Style9">
+    <w:name w:val="표제목"/>
+    <w:basedOn w:val="Style8"/>
     <w:qFormat/>
     <w:pPr>
       <w:suppressLineNumbers/>

</xml_diff>

<commit_message>
Removed temporary texts in Germany remapped docx
</commit_message>
<xml_diff>
--- a/raildriver-Germany-Remapped.docx
+++ b/raildriver-Germany-Remapped.docx
@@ -48569,393 +48569,7 @@
         </w:rPr>
       </w:pPr>
       <w:r>
-        <w:rPr>
-          <w:color w:val="000000"/>
-          <w:sz w:val="16"/>
-          <w:szCs w:val="16"/>
-        </w:rPr>
-      </w:r>
-    </w:p>
-    <w:p>
-      <w:pPr>
-        <w:pStyle w:val="Normal"/>
-        <w:bidi w:val="0"/>
-        <w:rPr>
-          <w:color w:val="000000"/>
-          <w:sz w:val="16"/>
-          <w:szCs w:val="16"/>
-        </w:rPr>
-      </w:pPr>
-      <w:r>
-        <w:rPr>
-          <w:color w:val="000000"/>
-          <w:sz w:val="16"/>
-          <w:szCs w:val="16"/>
-        </w:rPr>
-        <w:t>101</w:t>
-      </w:r>
-    </w:p>
-    <w:p>
-      <w:pPr>
-        <w:pStyle w:val="Normal"/>
-        <w:bidi w:val="0"/>
-        <w:rPr>
-          <w:color w:val="000000"/>
-          <w:sz w:val="16"/>
-          <w:szCs w:val="16"/>
-        </w:rPr>
-      </w:pPr>
-      <w:r>
-        <w:rPr>
-          <w:color w:val="000000"/>
-          <w:sz w:val="16"/>
-          <w:szCs w:val="16"/>
-        </w:rPr>
-        <w:t>286</w:t>
-      </w:r>
-    </w:p>
-    <w:p>
-      <w:pPr>
-        <w:pStyle w:val="Normal"/>
-        <w:bidi w:val="0"/>
-        <w:rPr>
-          <w:color w:val="000000"/>
-          <w:sz w:val="16"/>
-          <w:szCs w:val="16"/>
-        </w:rPr>
-      </w:pPr>
-      <w:r>
-        <w:rPr>
-          <w:color w:val="000000"/>
-          <w:sz w:val="16"/>
-          <w:szCs w:val="16"/>
-        </w:rPr>
-        <w:t>101expert</w:t>
-      </w:r>
-    </w:p>
-    <w:p>
-      <w:pPr>
-        <w:pStyle w:val="Normal"/>
-        <w:bidi w:val="0"/>
-        <w:rPr>
-          <w:color w:val="000000"/>
-          <w:sz w:val="16"/>
-          <w:szCs w:val="16"/>
-        </w:rPr>
-      </w:pPr>
-      <w:r>
-        <w:rPr>
-          <w:color w:val="000000"/>
-          <w:sz w:val="16"/>
-          <w:szCs w:val="16"/>
-        </w:rPr>
-        <w:t>103</w:t>
-      </w:r>
-    </w:p>
-    <w:p>
-      <w:pPr>
-        <w:pStyle w:val="Normal"/>
-        <w:bidi w:val="0"/>
-        <w:rPr>
-          <w:color w:val="000000"/>
-          <w:sz w:val="16"/>
-          <w:szCs w:val="16"/>
-        </w:rPr>
-      </w:pPr>
-      <w:r>
-        <w:rPr>
-          <w:color w:val="000000"/>
-          <w:sz w:val="16"/>
-          <w:szCs w:val="16"/>
-        </w:rPr>
-        <w:t>110</w:t>
-      </w:r>
-    </w:p>
-    <w:p>
-      <w:pPr>
-        <w:pStyle w:val="Normal"/>
-        <w:bidi w:val="0"/>
-        <w:rPr>
-          <w:color w:val="000000"/>
-          <w:sz w:val="16"/>
-          <w:szCs w:val="16"/>
-        </w:rPr>
-      </w:pPr>
-      <w:r>
-        <w:rPr>
-          <w:color w:val="000000"/>
-          <w:sz w:val="16"/>
-          <w:szCs w:val="16"/>
-        </w:rPr>
-        <w:t>111</w:t>
-      </w:r>
-    </w:p>
-    <w:p>
-      <w:pPr>
-        <w:pStyle w:val="Normal"/>
-        <w:bidi w:val="0"/>
-        <w:rPr>
-          <w:color w:val="000000"/>
-          <w:sz w:val="16"/>
-          <w:szCs w:val="16"/>
-        </w:rPr>
-      </w:pPr>
-      <w:r>
-        <w:rPr>
-          <w:color w:val="000000"/>
-          <w:sz w:val="16"/>
-          <w:szCs w:val="16"/>
-        </w:rPr>
-        <w:t>112</w:t>
-        <w:br/>
-        <w:t>140</w:t>
-      </w:r>
-    </w:p>
-    <w:p>
-      <w:pPr>
-        <w:pStyle w:val="Normal"/>
-        <w:bidi w:val="0"/>
-        <w:rPr>
-          <w:color w:val="000000"/>
-          <w:sz w:val="16"/>
-          <w:szCs w:val="16"/>
-        </w:rPr>
-      </w:pPr>
-      <w:r>
-        <w:rPr>
-          <w:color w:val="000000"/>
-          <w:sz w:val="16"/>
-          <w:szCs w:val="16"/>
-        </w:rPr>
-        <w:t>143</w:t>
-      </w:r>
-    </w:p>
-    <w:p>
-      <w:pPr>
-        <w:pStyle w:val="Normal"/>
-        <w:bidi w:val="0"/>
-        <w:rPr>
-          <w:color w:val="000000"/>
-          <w:sz w:val="16"/>
-          <w:szCs w:val="16"/>
-        </w:rPr>
-      </w:pPr>
-      <w:r>
-        <w:rPr>
-          <w:color w:val="000000"/>
-          <w:sz w:val="16"/>
-          <w:szCs w:val="16"/>
-        </w:rPr>
-        <w:t>182</w:t>
-      </w:r>
-    </w:p>
-    <w:p>
-      <w:pPr>
-        <w:pStyle w:val="Normal"/>
-        <w:bidi w:val="0"/>
-        <w:rPr>
-          <w:color w:val="000000"/>
-          <w:sz w:val="16"/>
-          <w:szCs w:val="16"/>
-        </w:rPr>
-      </w:pPr>
-      <w:r>
-        <w:rPr>
-          <w:color w:val="000000"/>
-          <w:sz w:val="16"/>
-          <w:szCs w:val="16"/>
-        </w:rPr>
-        <w:t>185</w:t>
-      </w:r>
-    </w:p>
-    <w:p>
-      <w:pPr>
-        <w:pStyle w:val="Normal"/>
-        <w:bidi w:val="0"/>
-        <w:rPr>
-          <w:color w:val="000000"/>
-          <w:sz w:val="16"/>
-          <w:szCs w:val="16"/>
-        </w:rPr>
-      </w:pPr>
-      <w:r>
-        <w:rPr>
-          <w:color w:val="000000"/>
-          <w:sz w:val="16"/>
-          <w:szCs w:val="16"/>
-        </w:rPr>
-        <w:t>187</w:t>
-      </w:r>
-    </w:p>
-    <w:p>
-      <w:pPr>
-        <w:pStyle w:val="Normal"/>
-        <w:bidi w:val="0"/>
-        <w:rPr>
-          <w:color w:val="000000"/>
-          <w:sz w:val="16"/>
-          <w:szCs w:val="16"/>
-        </w:rPr>
-      </w:pPr>
-      <w:r>
-        <w:rPr>
-          <w:color w:val="000000"/>
-          <w:sz w:val="16"/>
-          <w:szCs w:val="16"/>
-        </w:rPr>
-        <w:t>194</w:t>
-      </w:r>
-    </w:p>
-    <w:p>
-      <w:pPr>
-        <w:pStyle w:val="Normal"/>
-        <w:bidi w:val="0"/>
-        <w:rPr>
-          <w:color w:val="000000"/>
-          <w:sz w:val="16"/>
-          <w:szCs w:val="16"/>
-        </w:rPr>
-      </w:pPr>
-      <w:r>
-        <w:rPr>
-          <w:color w:val="000000"/>
-          <w:sz w:val="16"/>
-          <w:szCs w:val="16"/>
-        </w:rPr>
-        <w:t>463 diesel</w:t>
-      </w:r>
-    </w:p>
-    <w:p>
-      <w:pPr>
-        <w:pStyle w:val="Normal"/>
-        <w:bidi w:val="0"/>
-        <w:rPr>
-          <w:color w:val="000000"/>
-          <w:sz w:val="16"/>
-          <w:szCs w:val="16"/>
-        </w:rPr>
-      </w:pPr>
-      <w:r>
-        <w:rPr>
-          <w:color w:val="000000"/>
-          <w:sz w:val="16"/>
-          <w:szCs w:val="16"/>
-        </w:rPr>
-        <w:t>403</w:t>
-      </w:r>
-    </w:p>
-    <w:p>
-      <w:pPr>
-        <w:pStyle w:val="Normal"/>
-        <w:bidi w:val="0"/>
-        <w:rPr>
-          <w:color w:val="000000"/>
-          <w:sz w:val="16"/>
-          <w:szCs w:val="16"/>
-        </w:rPr>
-      </w:pPr>
-      <w:r>
-        <w:rPr>
-          <w:color w:val="000000"/>
-          <w:sz w:val="16"/>
-          <w:szCs w:val="16"/>
-        </w:rPr>
-        <w:t>406</w:t>
-      </w:r>
-    </w:p>
-    <w:p>
-      <w:pPr>
-        <w:pStyle w:val="Normal"/>
-        <w:bidi w:val="0"/>
-        <w:rPr>
-          <w:color w:val="000000"/>
-          <w:sz w:val="16"/>
-          <w:szCs w:val="16"/>
-        </w:rPr>
-      </w:pPr>
-      <w:r>
-        <w:rPr>
-          <w:color w:val="000000"/>
-          <w:sz w:val="16"/>
-          <w:szCs w:val="16"/>
-        </w:rPr>
-        <w:t>411</w:t>
-      </w:r>
-    </w:p>
-    <w:p>
-      <w:pPr>
-        <w:pStyle w:val="Normal"/>
-        <w:bidi w:val="0"/>
-        <w:rPr>
-          <w:color w:val="000000"/>
-          <w:sz w:val="16"/>
-          <w:szCs w:val="16"/>
-        </w:rPr>
-      </w:pPr>
-      <w:r>
-        <w:rPr>
-          <w:color w:val="000000"/>
-          <w:sz w:val="16"/>
-          <w:szCs w:val="16"/>
-        </w:rPr>
-        <w:t>612</w:t>
-      </w:r>
-    </w:p>
-    <w:p>
-      <w:pPr>
-        <w:pStyle w:val="Normal"/>
-        <w:bidi w:val="0"/>
-        <w:rPr>
-          <w:color w:val="000000"/>
-          <w:sz w:val="16"/>
-          <w:szCs w:val="16"/>
-        </w:rPr>
-      </w:pPr>
-      <w:r>
-        <w:rPr>
-          <w:color w:val="000000"/>
-          <w:sz w:val="16"/>
-          <w:szCs w:val="16"/>
-        </w:rPr>
-        <w:t>628</w:t>
-      </w:r>
-    </w:p>
-    <w:p>
-      <w:pPr>
-        <w:pStyle w:val="Normal"/>
-        <w:bidi w:val="0"/>
-        <w:rPr>
-          <w:color w:val="000000"/>
-          <w:sz w:val="16"/>
-          <w:szCs w:val="16"/>
-        </w:rPr>
-      </w:pPr>
-      <w:r>
-        <w:rPr>
-          <w:color w:val="000000"/>
-          <w:sz w:val="16"/>
-          <w:szCs w:val="16"/>
-        </w:rPr>
-        <w:t>642</w:t>
-      </w:r>
-    </w:p>
-    <w:p>
-      <w:pPr>
-        <w:pStyle w:val="Normal"/>
-        <w:bidi w:val="0"/>
-        <w:rPr>
-          <w:color w:val="000000"/>
-          <w:sz w:val="16"/>
-          <w:szCs w:val="16"/>
-        </w:rPr>
-      </w:pPr>
-      <w:r>
-        <w:rPr>
-          <w:color w:val="000000"/>
-          <w:sz w:val="16"/>
-          <w:szCs w:val="16"/>
-        </w:rPr>
-        <w:t>218</w:t>
+        <w:rPr/>
       </w:r>
     </w:p>
     <w:sectPr>
@@ -49979,13 +49593,13 @@
       <w:rFonts w:ascii="Symbol" w:hAnsi="Symbol" w:cs="Symbol"/>
     </w:rPr>
   </w:style>
-  <w:style w:type="character" w:styleId="user" w:customStyle="1">
-    <w:name w:val="번호 매기기 기호 (user)"/>
+  <w:style w:type="character" w:styleId="Style5" w:customStyle="1">
+    <w:name w:val="번호 매기기 기호"/>
     <w:qFormat/>
     <w:rPr/>
   </w:style>
-  <w:style w:type="character" w:styleId="Style5">
-    <w:name w:val="번호 매기기 기호"/>
+  <w:style w:type="character" w:styleId="user">
+    <w:name w:val="번호 매기기 기호 (user)"/>
     <w:qFormat/>
     <w:rPr/>
   </w:style>
@@ -49999,7 +49613,7 @@
       <w:spacing w:before="240" w:after="120"/>
     </w:pPr>
     <w:rPr>
-      <w:rFonts w:ascii="Liberation Sans" w:hAnsi="Liberation Sans" w:eastAsia="Noto Sans CJK KR" w:cs="Lohit Devanagari"/>
+      <w:rFonts w:ascii="Liberation Sans" w:hAnsi="Liberation Sans" w:eastAsia="Noto Sans KR" w:cs="Arial"/>
       <w:sz w:val="28"/>
       <w:szCs w:val="28"/>
     </w:rPr>
@@ -50036,7 +49650,7 @@
       <w:szCs w:val="24"/>
     </w:rPr>
   </w:style>
-  <w:style w:type="paragraph" w:styleId="Style7" w:customStyle="1">
+  <w:style w:type="paragraph" w:styleId="Style7">
     <w:name w:val="색인"/>
     <w:basedOn w:val="Normal"/>
     <w:qFormat/>
@@ -50044,7 +49658,8 @@
       <w:suppressLineNumbers/>
     </w:pPr>
     <w:rPr>
-      <w:rFonts w:cs="Lohit Devanagari"/>
+      <w:rFonts w:cs="Arial"/>
+      <w:sz w:val="24"/>
     </w:rPr>
   </w:style>
   <w:style w:type="paragraph" w:styleId="user1">
@@ -50057,12 +49672,12 @@
       <w:spacing w:before="240" w:after="120"/>
     </w:pPr>
     <w:rPr>
-      <w:rFonts w:ascii="Liberation Sans" w:hAnsi="Liberation Sans" w:eastAsia="Noto Sans KR" w:cs="Arial"/>
+      <w:rFonts w:ascii="Liberation Sans" w:hAnsi="Liberation Sans" w:eastAsia="Noto Sans CJK KR" w:cs="Lohit Devanagari"/>
       <w:sz w:val="28"/>
       <w:szCs w:val="28"/>
     </w:rPr>
   </w:style>
-  <w:style w:type="paragraph" w:styleId="user2">
+  <w:style w:type="paragraph" w:styleId="user2" w:customStyle="1">
     <w:name w:val="색인 (user)"/>
     <w:basedOn w:val="Normal"/>
     <w:qFormat/>
@@ -50070,8 +49685,7 @@
       <w:suppressLineNumbers/>
     </w:pPr>
     <w:rPr>
-      <w:rFonts w:cs="Arial"/>
-      <w:sz w:val="24"/>
+      <w:rFonts w:cs="Lohit Devanagari"/>
     </w:rPr>
   </w:style>
   <w:style w:type="paragraph" w:styleId="Title">
@@ -50753,8 +50367,8 @@
       <w:szCs w:val="24"/>
     </w:rPr>
   </w:style>
-  <w:style w:type="paragraph" w:styleId="Style8" w:customStyle="1">
-    <w:name w:val="표 내용"/>
+  <w:style w:type="paragraph" w:styleId="user3" w:customStyle="1">
+    <w:name w:val="표 내용 (user)"/>
     <w:basedOn w:val="Normal"/>
     <w:qFormat/>
     <w:pPr>
@@ -50762,9 +50376,9 @@
     </w:pPr>
     <w:rPr/>
   </w:style>
-  <w:style w:type="paragraph" w:styleId="Style9" w:customStyle="1">
-    <w:name w:val="표제목"/>
-    <w:basedOn w:val="Style8"/>
+  <w:style w:type="paragraph" w:styleId="user4" w:customStyle="1">
+    <w:name w:val="표제목 (user)"/>
+    <w:basedOn w:val="user3"/>
     <w:qFormat/>
     <w:pPr>
       <w:jc w:val="center"/>
@@ -50774,8 +50388,8 @@
       <w:bCs/>
     </w:rPr>
   </w:style>
-  <w:style w:type="paragraph" w:styleId="user3">
-    <w:name w:val="표 내용 (user)"/>
+  <w:style w:type="paragraph" w:styleId="Style8">
+    <w:name w:val="표 내용"/>
     <w:basedOn w:val="Normal"/>
     <w:qFormat/>
     <w:pPr>
@@ -50784,9 +50398,9 @@
     </w:pPr>
     <w:rPr/>
   </w:style>
-  <w:style w:type="paragraph" w:styleId="user4">
-    <w:name w:val="표제목 (user)"/>
-    <w:basedOn w:val="user3"/>
+  <w:style w:type="paragraph" w:styleId="Style9">
+    <w:name w:val="표제목"/>
+    <w:basedOn w:val="Style8"/>
     <w:qFormat/>
     <w:pPr>
       <w:suppressLineNumbers/>

</xml_diff>

<commit_message>
Add AFB Speed Confirm in BR193 Vectron
</commit_message>
<xml_diff>
--- a/raildriver-Germany-Remapped.docx
+++ b/raildriver-Germany-Remapped.docx
@@ -20874,6 +20874,7 @@
                 <w:sz w:val="16"/>
                 <w:szCs w:val="16"/>
               </w:rPr>
+              <w:t>AFB Confirm</w:t>
             </w:r>
           </w:p>
         </w:tc>
@@ -49336,13 +49337,13 @@
       <w:rFonts w:ascii="Symbol" w:hAnsi="Symbol" w:cs="Symbol"/>
     </w:rPr>
   </w:style>
-  <w:style w:type="character" w:styleId="user" w:customStyle="1">
-    <w:name w:val="번호 매기기 기호 (user)"/>
+  <w:style w:type="character" w:styleId="Style5" w:customStyle="1">
+    <w:name w:val="번호 매기기 기호"/>
     <w:qFormat/>
     <w:rPr/>
   </w:style>
-  <w:style w:type="character" w:styleId="Style5">
-    <w:name w:val="번호 매기기 기호"/>
+  <w:style w:type="character" w:styleId="user">
+    <w:name w:val="번호 매기기 기호 (user)"/>
     <w:qFormat/>
     <w:rPr/>
   </w:style>
@@ -49356,7 +49357,7 @@
       <w:spacing w:before="240" w:after="120"/>
     </w:pPr>
     <w:rPr>
-      <w:rFonts w:ascii="Liberation Sans" w:hAnsi="Liberation Sans" w:eastAsia="Noto Sans CJK KR" w:cs="Lohit Devanagari"/>
+      <w:rFonts w:ascii="Liberation Sans" w:hAnsi="Liberation Sans" w:eastAsia="Noto Sans KR" w:cs="Arial"/>
       <w:sz w:val="28"/>
       <w:szCs w:val="28"/>
     </w:rPr>
@@ -49393,7 +49394,7 @@
       <w:szCs w:val="24"/>
     </w:rPr>
   </w:style>
-  <w:style w:type="paragraph" w:styleId="Style7" w:customStyle="1">
+  <w:style w:type="paragraph" w:styleId="Style7">
     <w:name w:val="색인"/>
     <w:basedOn w:val="Normal"/>
     <w:qFormat/>
@@ -49401,7 +49402,8 @@
       <w:suppressLineNumbers/>
     </w:pPr>
     <w:rPr>
-      <w:rFonts w:cs="Lohit Devanagari"/>
+      <w:rFonts w:cs="Arial"/>
+      <w:sz w:val="24"/>
     </w:rPr>
   </w:style>
   <w:style w:type="paragraph" w:styleId="user1">
@@ -49414,12 +49416,12 @@
       <w:spacing w:before="240" w:after="120"/>
     </w:pPr>
     <w:rPr>
-      <w:rFonts w:ascii="Liberation Sans" w:hAnsi="Liberation Sans" w:eastAsia="Noto Sans KR" w:cs="Arial"/>
+      <w:rFonts w:ascii="Liberation Sans" w:hAnsi="Liberation Sans" w:eastAsia="Noto Sans CJK KR" w:cs="Lohit Devanagari"/>
       <w:sz w:val="28"/>
       <w:szCs w:val="28"/>
     </w:rPr>
   </w:style>
-  <w:style w:type="paragraph" w:styleId="user2">
+  <w:style w:type="paragraph" w:styleId="user2" w:customStyle="1">
     <w:name w:val="색인 (user)"/>
     <w:basedOn w:val="Normal"/>
     <w:qFormat/>
@@ -49427,8 +49429,7 @@
       <w:suppressLineNumbers/>
     </w:pPr>
     <w:rPr>
-      <w:rFonts w:cs="Arial"/>
-      <w:sz w:val="24"/>
+      <w:rFonts w:cs="Lohit Devanagari"/>
     </w:rPr>
   </w:style>
   <w:style w:type="paragraph" w:styleId="Title">
@@ -50110,8 +50111,8 @@
       <w:szCs w:val="24"/>
     </w:rPr>
   </w:style>
-  <w:style w:type="paragraph" w:styleId="Style8" w:customStyle="1">
-    <w:name w:val="표 내용"/>
+  <w:style w:type="paragraph" w:styleId="user3" w:customStyle="1">
+    <w:name w:val="표 내용 (user)"/>
     <w:basedOn w:val="Normal"/>
     <w:qFormat/>
     <w:pPr>
@@ -50119,9 +50120,9 @@
     </w:pPr>
     <w:rPr/>
   </w:style>
-  <w:style w:type="paragraph" w:styleId="Style9" w:customStyle="1">
-    <w:name w:val="표제목"/>
-    <w:basedOn w:val="Style8"/>
+  <w:style w:type="paragraph" w:styleId="user4" w:customStyle="1">
+    <w:name w:val="표제목 (user)"/>
+    <w:basedOn w:val="user3"/>
     <w:qFormat/>
     <w:pPr>
       <w:jc w:val="center"/>
@@ -50131,8 +50132,8 @@
       <w:bCs/>
     </w:rPr>
   </w:style>
-  <w:style w:type="paragraph" w:styleId="user3">
-    <w:name w:val="표 내용 (user)"/>
+  <w:style w:type="paragraph" w:styleId="Style8">
+    <w:name w:val="표 내용"/>
     <w:basedOn w:val="Normal"/>
     <w:qFormat/>
     <w:pPr>
@@ -50141,9 +50142,9 @@
     </w:pPr>
     <w:rPr/>
   </w:style>
-  <w:style w:type="paragraph" w:styleId="user4">
-    <w:name w:val="표제목 (user)"/>
-    <w:basedOn w:val="user3"/>
+  <w:style w:type="paragraph" w:styleId="Style9">
+    <w:name w:val="표제목"/>
+    <w:basedOn w:val="Style8"/>
     <w:qFormat/>
     <w:pPr>
       <w:suppressLineNumbers/>

</xml_diff>